<commit_message>
Manuscript revision: A1 primary, A2 as WP29 singling-out/linkability test; face-crop A1 for all families; FAMS sweep, pupil test and stream isolation; FAMS claims corrected
Co-Authored-By: Claude Opus 5.5 <noreply@anthropic.com>
Claude-Session: https://claude.ai/code/session_01J7Eoy7KDxWK2PLKxYcPUkj
</commit_message>
<xml_diff>
--- a/results/paper/MANUSCRIPT.docx
+++ b/results/paper/MANUSCRIPT.docx
@@ -39,7 +39,7 @@
         <w:spacing w:after="120"/>
       </w:pPr>
       <w:r>
-        <w:t>The axes do not trade as assumed. Retaining the genuine ocular region recovers 85–101% of the synthesis penalty in every architecture, and 91–106% when the models are retrained on the release — yet those same crops verify identity at 62–80% TAR at FAR 1e-3 against a measured 1.6% floor, under two unrelated recognisers. The eye pixels that make gaze estimation work are the pixels that identify. Full synthesis does break the link to the real face, but costs 2.2–6.2 cm even after retraining, and an attacker holding only the release still recovers exactly the right 18 people — from a 120 px ocular crop containing no hair, ears, clothing or face outline. Removal by inpainting fares worse: a model retrained on it is no better than predicting the screen centre. A diffusion anonymiser does better on both axes — models retrained on it lose 0.4–1.3 cm on real faces where SimSwap loses 2.5–6.2, and it breaks per-participant consistency by itself — yet its face crops still link at ARI 0.85; releasing eye landmarks instead of pixels links too and carries almost no gaze signal. Across replacement, removal and diffusion, the one configuration that breaks linkage — repainting the whole person with a fresh identity every frame — is one on which a retrained gaze model learns nothing. We state what a releasable gaze corpus would require, and report what our own tiered release leaks when measured rather than assumed.</w:t>
+        <w:t>The axes do not trade as assumed. Retaining the genuine ocular region recovers 85–101% of the synthesis penalty in every architecture, and 91–106% when the models are retrained on the release — yet those same crops verify identity at 62–80% TAR at FAR 1e-3 against a measured 1.6% floor, under two unrelated recognisers. The eye pixels that make gaze estimation work are the pixels that identify. Full synthesis breaks the link between the released eye crops and the real face, but the synthetic face crop still verifies against the participant's own photographs (18–24% TAR under ArcFace), retraining leaves a 2.2–6.2 cm cost, and the release still singles out every participant: an unsupervised partition recovers exactly the 18 individuals, even from a 120 px ocular crop containing no hair, ears, clothing or face outline. Removal by inpainting fares worse: a model retrained on it is no better than predicting the screen centre. A diffusion anonymiser yields models that transfer to real faces far better (0.4–1.3 cm against 2.5–6.2 cm), but not because it keeps more gaze: its pupils follow true gaze less closely than SimSwap's, and stronger settings trade pupil signal for identity protection without reducing linkability. Releasing eye landmarks instead of pixels links too and carries almost no gaze signal. A usable gaze corpus must keep each participant's frames together, so it is linkable by construction; within the content, the one configuration that breaks linkage — repainting the whole person with a fresh identity every frame — is one on which a retrained gaze model learns nothing. We state what a releasable gaze corpus would require, and report what our own tiered release leaks when measured rather than assumed.</w:t>
       </w:r>
     </w:p>
     <w:p>
@@ -222,7 +222,7 @@
         <w:spacing w:after="120"/>
       </w:pPr>
       <w:r>
-        <w:t>We find that it does not, for gaze data, and that the reason is structural rather than a shortcoming of any particular generator. Two observations drive the paper. First, the ocular region is not a de-identified crop of the face: a 120 px eye ROI handed to a pretrained recogniser verifies identity at 62–80% at a false-accept rate of 1e-3, against a measured floor of 1.6%. The pixels that carry the gaze signal are the pixels that carry the identity, so a protocol that recovers accuracy by retaining genuine ocular imagery retains the biometric with it. Second, replacing the whole face — ocular region included — does remove the correspondence to the participant's real face, but leaves the released corpus exactly partitionable by individual. Identity replacement is per-participant consistent, and the channels that remain are illumination, skin tone, periocular geometry and crop scale: attributes of the person that lie outside the inner-face region any swapping method edits.</w:t>
+        <w:t>We find that it does not, for gaze data, and that the reason is structural rather than a shortcoming of any particular generator. Two observations drive the paper. First, the ocular region is not a de-identified crop of the face: a 120 px eye ROI handed to a pretrained recogniser verifies identity at 62–80% at a false-accept rate of 1e-3, against a measured floor of 1.6%. The pixels that carry the gaze signal are the pixels that carry the identity, so a protocol that recovers accuracy by retaining genuine ocular imagery retains the biometric with it. Second, replacing the whole face — ocular region included — removes the correspondence between the released eye crops and the participant's real face, but not between the synthetic face crop and the real face, and it leaves the released corpus exactly partitionable by individual — which, under the European test for anonymisation, is enough for the data to remain personal data [wp29anon]. Identity replacement is per-participant consistent, and the channels that remain are illumination, skin tone, periocular geometry and crop scale: attributes of the person that lie outside the inner-face region any swapping method edits.</w:t>
       </w:r>
     </w:p>
     <w:p>
@@ -261,7 +261,7 @@
         <w:t>A privacy evaluation protocol for gaze corpora.</w:t>
       </w:r>
       <w:r>
-        <w:t xml:space="preserve"> We evaluate de-identification the way the security literature evaluates it — with a stated attacker, a pretrained recogniser that never sees our data, and a session-nuisance control — rather than asserting it from the generator's objective. We distinguish an attacker holding enrolment photographs from one holding only the released corpus, and show the two differ by up to 60 points on identical pixels, which makes an unqualified privacy number uninterpretable. We release the protocol as an audit tool and a fifteen-item release checklist for gaze corpora, distilled into seven design guidelines (§10) [privaudit-repo]; run on this study's saved embeddings it reproduces every eye-ROI verification and linkage figure exactly, and end to end, re-embedding the crops, to within GPU inference noise.</w:t>
+        <w:t xml:space="preserve"> We evaluate de-identification the way the security literature evaluates it — with a stated attacker, a pretrained recogniser that never sees our data, and a session-nuisance control — rather than asserting it from the generator's objective. We distinguish re-identification by an attacker holding the participants' photographs (A1) from a test of whether the released content singles out individuals with no external reference (A2, the linkability criterion of the European anonymisation standard), and show the two differ by up to 60 points on identical pixels, which makes an unqualified privacy number uninterpretable. We release the protocol as an audit tool and a fifteen-item release checklist for gaze corpora, distilled into seven design guidelines (§10) [privaudit-repo]; run on this study's saved embeddings it reproduces every eye-ROI verification and linkage figure exactly, and end to end, re-embedding the crops, to within GPU inference noise.</w:t>
       </w:r>
     </w:p>
     <w:p>
@@ -304,10 +304,10 @@
         <w:rPr>
           <w:b/>
         </w:rPr>
-        <w:t>A tested, two-part condition for breaking release-only linkage.</w:t>
-      </w:r>
-      <w:r>
-        <w:t xml:space="preserve"> Rather than stopping at a negative result, we state the requirement as a falsifiable claim and test it by construction. Release-only linkage falls only when </w:t>
+        <w:t>A tested, two-part condition for breaking content-based linkage.</w:t>
+      </w:r>
+      <w:r>
+        <w:t xml:space="preserve"> Rather than stopping at a negative result, we state the requirement as a falsifiable claim and test it by construction. It concerns releases that strip participant identifiers; one that keeps them, as a usable gaze corpus must, is linkable by construction. Linkage from the released content falls only when </w:t>
       </w:r>
       <w:r>
         <w:rPr>
@@ -352,7 +352,7 @@
         <w:t>verification</w:t>
       </w:r>
       <w:r>
-        <w:t>: an attacker holding a few labelled frames per person still verifies 35.7% [27, 45] of that cell's face crops, against 90–100% in the other three and a 1.6% floor. On the eye ROI, which contains only edited pixels, per-frame identity alone suffices: verification 63.2% → 2.04% and linkage 0.805 [0.63, 0.94] → 0.148 [0.10, 0.27], against floors of 1.57% and 0.074. The one configuration that breaks linkage repaints the eyes, and a gaze model retrained on repainted eyes does no better than predicting the screen centre. Each half of the condition is attainable on its own — a diffusion anonymiser meets the first while keeping most of the gaze signal, full-body inpainting meets both while destroying it — which locates what is missing precisely: a gaze-preserving generator whose edit domain covers the whole released crop. This tells a dataset author what to do, and what it costs, not merely what fails.</w:t>
+        <w:t>: an attacker holding a few labelled frames per person still verifies 35.7% [27, 45] of that cell's face crops, against 90–100% in the other three and a 1.6% floor. On the eye ROI, which contains only edited pixels, per-frame identity alone suffices: verification 63.2% → 2.04% and linkage 0.805 [0.63, 0.94] → 0.148 [0.10, 0.27], against floors of 1.57% and 0.074. The one configuration that breaks linkage repaints the eyes, and a gaze model retrained on repainted eyes does no better than predicting the screen centre. Each half of the condition is attainable on its own — a diffusion anonymiser meets the first, full-body inpainting meets both while destroying the gaze signal — which locates what is missing precisely: a gaze-preserving generator whose edit domain covers the whole released crop. This tells a dataset author what to do, and what it costs, not merely what fails.</w:t>
       </w:r>
     </w:p>
     <w:p>
@@ -449,10 +449,10 @@
         <w:rPr>
           <w:b/>
         </w:rPr>
-        <w:t>We reach the opposite conclusion, and the difference is the attacker.</w:t>
-      </w:r>
-      <w:r>
-        <w:t xml:space="preserve"> Anonymity strength as measured there asks whether a swapped face can be matched to the person's real face; on that question our results agree with theirs. It does not ask whether the released corpus can be partitioned by individual with no external reference, which is the question a public release actually poses, and which we show survives the swap almost intact.</w:t>
+        <w:t>We reach the opposite conclusion, and the difference is the test.</w:t>
+      </w:r>
+      <w:r>
+        <w:t xml:space="preserve"> Anonymity strength as measured there asks whether a swapped face can be matched to the person's real face. On that question our results agree for the synthesised eye crops, which fall to the floor, but not for the synthetic face crop, which still verifies against the participant's photographs at a strict operating point. Nor does it ask whether the released corpus singles out individuals with no external reference — the linkability criterion under which European regulators judge whether data are anonymous [wp29anon] — and that property survives the swap almost intact.</w:t>
       </w:r>
     </w:p>
     <w:p>
@@ -1097,7 +1097,7 @@
         <w:t>Diffusion: FAMS.</w:t>
       </w:r>
       <w:r>
-        <w:t xml:space="preserve"> Face Anonymization Made Simple [fams] conditions a diffusion model on the source face and pastes an aligned square covering face, forehead and some hair back into the frame. We use the authors' anonymisation setting (anonymisation degree 1.25, 25 denoising steps, guidance 4.0), with the noise seed either fixed per participant or drawn afresh per frame. Diffusion runs at about 6 s per frame; the utility experiments use all 210,924 task frames.</w:t>
+        <w:t xml:space="preserve"> Face Anonymization Made Simple [fams] conditions a diffusion model on the source face and pastes an aligned square covering face, forehead and some hair back into the frame. We use the authors' anonymisation setting (anonymisation degree 1.25, 25 denoising steps, guidance 4.0), with the noise seed either fixed per participant or drawn afresh per frame. Diffusion runs at about 6 s per frame; the utility experiments use all 210,924 task frames. To see what a stronger setting buys, we also sweep the degree from 1.35 to 3.0 on the privacy sample (§7).</w:t>
       </w:r>
     </w:p>
     <w:p>
@@ -1212,28 +1212,28 @@
         <w:rPr>
           <w:b/>
         </w:rPr>
-        <w:t>Attackers.</w:t>
-      </w:r>
-      <w:r>
-        <w:t xml:space="preserve"> Two, because they give different answers on identical data. </w:t>
+        <w:t>Attackers and tests.</w:t>
+      </w:r>
+      <w:r>
+        <w:t xml:space="preserve"> </w:t>
       </w:r>
       <w:r>
         <w:rPr>
           <w:i/>
         </w:rPr>
-        <w:t>A1, enrolment photographs:</w:t>
-      </w:r>
-      <w:r>
-        <w:t xml:space="preserve"> the attacker holds ordinary photographs of the candidate individuals and asks which enrolled person a released crop is — the classical re-identification threat. </w:t>
+        <w:t>A1, re-identification from photographs,</w:t>
+      </w:r>
+      <w:r>
+        <w:t xml:space="preserve"> is the primary threat: the attacker holds ordinary photographs of candidate individuals — for example, people known to belong to the recruitment pool — and asks which of them a released crop shows. </w:t>
       </w:r>
       <w:r>
         <w:rPr>
           <w:i/>
         </w:rPr>
-        <w:t>A2, release only:</w:t>
-      </w:r>
-      <w:r>
-        <w:t xml:space="preserve"> the attacker holds nothing but the shared dataset; they cannot name anyone unaided, but they can ask whether the release partitions into individuals, and a single labelled example then names an entire cluster. The two can disagree by up to 60 points on identical crops (Figure S2). For a corpus intended for public release A2 is the operative attacker, because the recipient of a public dataset is by definition A2.</w:t>
+        <w:t>A2, linkability,</w:t>
+      </w:r>
+      <w:r>
+        <w:t xml:space="preserve"> is a property test rather than a separate adversary: whether the released content alone lets frames be grouped by individual, with no external reference. It operationalises two of the three criteria by which the Article 29 Working Party judges anonymisation, singling out and linkability [wp29anon]; data whose records can be isolated per person remain personal data even when no name is attached [gdpr]. A usable gaze corpus keeps each participant's frames together, because participant-wise splits and per-user calibration require it, so a released corpus is linkable by construction; A2 asks whether the content would restore that grouping if the identifiers were stripped. The two tests can disagree by up to 60 points on identical crops (Figure S2).</w:t>
       </w:r>
     </w:p>
     <w:p>
@@ -1387,7 +1387,7 @@
         <w:spacing w:after="120"/>
       </w:pPr>
       <w:r>
-        <w:t>Table 2 summarises the leakage of each SimSwap release under both attackers; Figure 6 gives release-only linkage for every family.</w:t>
+        <w:t>Table 4 summarises the leakage of each SimSwap release under both attackers; Table 2 gives face-crop re-identification for every family, and Figure 6 linkability.</w:t>
       </w:r>
     </w:p>
     <w:p>
@@ -1494,10 +1494,10 @@
         <w:rPr>
           <w:b/>
         </w:rPr>
-        <w:t>Full synthesis does remove the correspondence to the real face.</w:t>
-      </w:r>
-      <w:r>
-        <w:t xml:space="preserve"> With the ocular region synthesised as well, the same attack falls to </w:t>
+        <w:t>Full synthesis removes the correspondence for the eye crops, not for the face crop.</w:t>
+      </w:r>
+      <w:r>
+        <w:t xml:space="preserve"> With the ocular region synthesised as well, the same attack on the eye ROIs falls to </w:t>
       </w:r>
       <w:r>
         <w:rPr>
@@ -1506,7 +1506,16 @@
         <w:t>0.2% / 1.8%</w:t>
       </w:r>
       <w:r>
-        <w:t xml:space="preserve"> TAR@FAR=1e-3, at or below the floor (FaceNet: 0.00% / 1.48%); the face ROI falls from 100% to </w:t>
+        <w:t xml:space="preserve"> TAR@FAR=1e-3, at or below the floor (FaceNet: 0.00% / 1.48%); the two templates agree, and so do the two recognisers. The synthetic face crop does not fall that far. Matched against the participant's own photographs it still verifies at </w:t>
+      </w:r>
+      <w:r>
+        <w:rPr>
+          <w:b/>
+        </w:rPr>
+        <w:t>18.4%</w:t>
+      </w:r>
+      <w:r>
+        <w:t xml:space="preserve"> [5.1, 35.4] for Identity A and </w:t>
       </w:r>
       <w:r>
         <w:rPr>
@@ -1515,16 +1524,7 @@
         <w:t>22.0%</w:t>
       </w:r>
       <w:r>
-        <w:t xml:space="preserve"> [6.1, 41.3] for Identity A and </w:t>
-      </w:r>
-      <w:r>
-        <w:rPr>
-          <w:b/>
-        </w:rPr>
-        <w:t>23.3%</w:t>
-      </w:r>
-      <w:r>
-        <w:t xml:space="preserve"> [7.2, 43.2] for Identity B. The two templates agree, and so do the two recognisers, so this is a property of the method rather than of a particular source face or a particular recogniser.</w:t>
+        <w:t xml:space="preserve"> [6.8, 40.7] for Identity B under ArcFace (Table 2), against 100% for unprocessed faces and a 1.6% floor.</w:t>
       </w:r>
     </w:p>
     <w:p>
@@ -1532,7 +1532,7 @@
         <w:spacing w:after="120"/>
       </w:pPr>
       <w:r>
-        <w:t>The face-ROI intervals are wide — [6.1, 41.3] for Identity A — because the sampling unit is 18 participants. The direction is secure: the lower bound is more than three times the 1.6% floor, and both templates and both recognisers agree. The magnitude is not: these data support "well above floor, an order of magnitude below unprotected imagery", and not a finer grading than that. The release decisions in the Data Availability statement rest on the direction, not on the point estimate.</w:t>
+        <w:t>The face-ROI intervals are wide because the sampling unit is 18 participants. For Identity A the direction is secure: the lower bound is three times the floor, and FaceNet agrees (14.4% against its own 3.52% floor). For Identity B FaceNet does not confirm it (0.2%), so the residual depends on the template and the recogniser. These data support "above floor, an order of magnitude below unprotected imagery" for the face crop, and not a finer grading than that. The release decisions in the Data Availability statement rest on the direction, not on the point estimate.</w:t>
       </w:r>
     </w:p>
     <w:p>
@@ -1700,7 +1700,7 @@
         <w:t>verification</w:t>
       </w:r>
       <w:r>
-        <w:t xml:space="preserve"> by someone who already holds a few labelled frames. Against A1 every DeepPrivacy2 arm is at or below floor (≤ 1.2%), consistent with DeepPrivacy2's own re-identification evaluation, which, like A1, matches enrolment images to the release and does not test release-only linkage.</w:t>
+        <w:t xml:space="preserve"> by someone who already holds a few labelled frames. Against A1 every DeepPrivacy2 arm is at or below floor, on the eye crops (≤ 1.2%) and on the face crop (≤ 1.6%; Table 2), consistent with DeepPrivacy2's own re-identification evaluation, which, like A1, matches enrolment images to the release and does not test release-only linkage.</w:t>
       </w:r>
     </w:p>
     <w:p>
@@ -1722,7 +1722,22 @@
         <w:spacing w:after="120"/>
       </w:pPr>
       <w:r>
-        <w:t>The residual channels the recogniser does exploit — skin tone, periocular geometry, crop scale — are signals gaze estimation reads, which is why the axis trades at all.</w:t>
+        <w:rPr>
+          <w:b/>
+        </w:rPr>
+        <w:t>The diffusion face still resembles the participant.</w:t>
+      </w:r>
+      <w:r>
+        <w:t xml:space="preserve"> Matched against the participant's own photographs, the FAMS face crop verifies at </w:t>
+      </w:r>
+      <w:r>
+        <w:rPr>
+          <w:b/>
+        </w:rPr>
+        <w:t>24.1%</w:t>
+      </w:r>
+      <w:r>
+        <w:t xml:space="preserve"> [15.3, 33.6] under ArcFace — no lower than SimSwap — although FaceNet places it near its own floor (5.9% [2.2, 10.5] against 3.52%; Table 2). FAMS conditions on the source face to keep pose and expression, and part of the identity comes with them. Closed-set Rank-1 is high for both families (57–61%) but is not evidence here: on single-session data its floor is 50.5%.</w:t>
       </w:r>
     </w:p>
     <w:p>
@@ -1730,16 +1745,412 @@
         <w:spacing w:after="120"/>
       </w:pPr>
       <w:r>
-        <w:t xml:space="preserve">These eye-ROI figures assume an attacker who knows the cohort size: on the eye ROI the cluster count is not recovered unaided, whereas on the face ROI it is (k = 18 selected by silhouette). For a public release the cohort size is stated in the documentation, so the assumption is mild, but it is an assumption and the face ROI does not need it. Breaking unsupervised </w:t>
-      </w:r>
-      <w:r>
         <w:rPr>
-          <w:i/>
+          <w:b/>
         </w:rPr>
-        <w:t>discoverability</w:t>
-      </w:r>
-      <w:r>
-        <w:t xml:space="preserve"> is in fact the one place replacement helps: on the right eye, k selected falls from 26 (ARI 0.674) to 2 (ARI 0.011). It breaks discovery of the partition, not its separability.</w:t>
+        <w:t>Table 2.</w:t>
+      </w:r>
+      <w:r>
+        <w:t xml:space="preserve"> Face-crop A1 for every family: released face crops (second half of each recording) matched against the participant's original face crops (first half). TAR at FAR = 1e-3 with 95% participant-level intervals, each recogniser against its own floor (ArcFace 1.6%, FaceNet 3.52%).</w:t>
+      </w:r>
+    </w:p>
+    <w:tbl>
+      <w:tblPr>
+        <w:tblStyle w:val="TableGrid"/>
+        <w:tblW w:type="auto" w:w="0"/>
+        <w:tblLook w:firstColumn="1" w:firstRow="1" w:lastColumn="0" w:lastRow="0" w:noHBand="0" w:noVBand="1" w:val="04A0"/>
+      </w:tblPr>
+      <w:tblGrid>
+        <w:gridCol w:w="3249"/>
+        <w:gridCol w:w="3249"/>
+        <w:gridCol w:w="3249"/>
+      </w:tblGrid>
+      <w:tr>
+        <w:tc>
+          <w:tcPr>
+            <w:tcW w:type="dxa" w:w="3249"/>
+          </w:tcPr>
+          <w:p>
+            <w:r>
+              <w:rPr>
+                <w:b/>
+                <w:sz w:val="17"/>
+              </w:rPr>
+              <w:t>Release</w:t>
+            </w:r>
+          </w:p>
+        </w:tc>
+        <w:tc>
+          <w:tcPr>
+            <w:tcW w:type="dxa" w:w="3249"/>
+          </w:tcPr>
+          <w:p>
+            <w:r>
+              <w:rPr>
+                <w:b/>
+                <w:sz w:val="17"/>
+              </w:rPr>
+              <w:t>ArcFace TAR</w:t>
+            </w:r>
+          </w:p>
+        </w:tc>
+        <w:tc>
+          <w:tcPr>
+            <w:tcW w:type="dxa" w:w="3249"/>
+          </w:tcPr>
+          <w:p>
+            <w:r>
+              <w:rPr>
+                <w:b/>
+                <w:sz w:val="17"/>
+              </w:rPr>
+              <w:t>FaceNet TAR</w:t>
+            </w:r>
+          </w:p>
+        </w:tc>
+      </w:tr>
+      <w:tr>
+        <w:tc>
+          <w:tcPr>
+            <w:tcW w:type="dxa" w:w="3249"/>
+          </w:tcPr>
+          <w:p>
+            <w:r>
+              <w:rPr>
+                <w:sz w:val="17"/>
+              </w:rPr>
+              <w:t>SimSwap, Identity A</w:t>
+            </w:r>
+          </w:p>
+        </w:tc>
+        <w:tc>
+          <w:tcPr>
+            <w:tcW w:type="dxa" w:w="3249"/>
+          </w:tcPr>
+          <w:p>
+            <w:r>
+              <w:rPr>
+                <w:sz w:val="17"/>
+              </w:rPr>
+              <w:t>18.4% [5.1, 35.4]</w:t>
+            </w:r>
+          </w:p>
+        </w:tc>
+        <w:tc>
+          <w:tcPr>
+            <w:tcW w:type="dxa" w:w="3249"/>
+          </w:tcPr>
+          <w:p>
+            <w:r>
+              <w:rPr>
+                <w:sz w:val="17"/>
+              </w:rPr>
+              <w:t>14.4% [0.7, 30.5]</w:t>
+            </w:r>
+          </w:p>
+        </w:tc>
+      </w:tr>
+      <w:tr>
+        <w:tc>
+          <w:tcPr>
+            <w:tcW w:type="dxa" w:w="3249"/>
+          </w:tcPr>
+          <w:p>
+            <w:r>
+              <w:rPr>
+                <w:sz w:val="17"/>
+              </w:rPr>
+              <w:t>SimSwap, Identity B</w:t>
+            </w:r>
+          </w:p>
+        </w:tc>
+        <w:tc>
+          <w:tcPr>
+            <w:tcW w:type="dxa" w:w="3249"/>
+          </w:tcPr>
+          <w:p>
+            <w:r>
+              <w:rPr>
+                <w:sz w:val="17"/>
+              </w:rPr>
+              <w:t>22.0% [6.8, 40.7]</w:t>
+            </w:r>
+          </w:p>
+        </w:tc>
+        <w:tc>
+          <w:tcPr>
+            <w:tcW w:type="dxa" w:w="3249"/>
+          </w:tcPr>
+          <w:p>
+            <w:r>
+              <w:rPr>
+                <w:sz w:val="17"/>
+              </w:rPr>
+              <w:t>0.2% [0.0, 0.6]</w:t>
+            </w:r>
+          </w:p>
+        </w:tc>
+      </w:tr>
+      <w:tr>
+        <w:tc>
+          <w:tcPr>
+            <w:tcW w:type="dxa" w:w="3249"/>
+          </w:tcPr>
+          <w:p>
+            <w:r>
+              <w:rPr>
+                <w:sz w:val="17"/>
+              </w:rPr>
+              <w:t>DeepPrivacy2 face, fixed</w:t>
+            </w:r>
+          </w:p>
+        </w:tc>
+        <w:tc>
+          <w:tcPr>
+            <w:tcW w:type="dxa" w:w="3249"/>
+          </w:tcPr>
+          <w:p>
+            <w:r>
+              <w:rPr>
+                <w:sz w:val="17"/>
+              </w:rPr>
+              <w:t>1.6% [0.0, 4.6]</w:t>
+            </w:r>
+          </w:p>
+        </w:tc>
+        <w:tc>
+          <w:tcPr>
+            <w:tcW w:type="dxa" w:w="3249"/>
+          </w:tcPr>
+          <w:p>
+            <w:r>
+              <w:rPr>
+                <w:sz w:val="17"/>
+              </w:rPr>
+              <w:t>0.7% [0.0, 1.6]</w:t>
+            </w:r>
+          </w:p>
+        </w:tc>
+      </w:tr>
+      <w:tr>
+        <w:tc>
+          <w:tcPr>
+            <w:tcW w:type="dxa" w:w="3249"/>
+          </w:tcPr>
+          <w:p>
+            <w:r>
+              <w:rPr>
+                <w:sz w:val="17"/>
+              </w:rPr>
+              <w:t>DeepPrivacy2 face, per frame</w:t>
+            </w:r>
+          </w:p>
+        </w:tc>
+        <w:tc>
+          <w:tcPr>
+            <w:tcW w:type="dxa" w:w="3249"/>
+          </w:tcPr>
+          <w:p>
+            <w:r>
+              <w:rPr>
+                <w:sz w:val="17"/>
+              </w:rPr>
+              <w:t>1.4% [0.5, 2.5]</w:t>
+            </w:r>
+          </w:p>
+        </w:tc>
+        <w:tc>
+          <w:tcPr>
+            <w:tcW w:type="dxa" w:w="3249"/>
+          </w:tcPr>
+          <w:p>
+            <w:r>
+              <w:rPr>
+                <w:sz w:val="17"/>
+              </w:rPr>
+              <w:t>2.8% [0.8, 5.5]</w:t>
+            </w:r>
+          </w:p>
+        </w:tc>
+      </w:tr>
+      <w:tr>
+        <w:tc>
+          <w:tcPr>
+            <w:tcW w:type="dxa" w:w="3249"/>
+          </w:tcPr>
+          <w:p>
+            <w:r>
+              <w:rPr>
+                <w:sz w:val="17"/>
+              </w:rPr>
+              <w:t>DeepPrivacy2 full body, fixed</w:t>
+            </w:r>
+          </w:p>
+        </w:tc>
+        <w:tc>
+          <w:tcPr>
+            <w:tcW w:type="dxa" w:w="3249"/>
+          </w:tcPr>
+          <w:p>
+            <w:r>
+              <w:rPr>
+                <w:sz w:val="17"/>
+              </w:rPr>
+              <w:t>0.0% [0.0, 0.0]</w:t>
+            </w:r>
+          </w:p>
+        </w:tc>
+        <w:tc>
+          <w:tcPr>
+            <w:tcW w:type="dxa" w:w="3249"/>
+          </w:tcPr>
+          <w:p>
+            <w:r>
+              <w:rPr>
+                <w:sz w:val="17"/>
+              </w:rPr>
+              <w:t>0.0% [0.0, 0.0]</w:t>
+            </w:r>
+          </w:p>
+        </w:tc>
+      </w:tr>
+      <w:tr>
+        <w:tc>
+          <w:tcPr>
+            <w:tcW w:type="dxa" w:w="3249"/>
+          </w:tcPr>
+          <w:p>
+            <w:r>
+              <w:rPr>
+                <w:sz w:val="17"/>
+              </w:rPr>
+              <w:t>DeepPrivacy2 full body, per frame</w:t>
+            </w:r>
+          </w:p>
+        </w:tc>
+        <w:tc>
+          <w:tcPr>
+            <w:tcW w:type="dxa" w:w="3249"/>
+          </w:tcPr>
+          <w:p>
+            <w:r>
+              <w:rPr>
+                <w:sz w:val="17"/>
+              </w:rPr>
+              <w:t>0.3% [0.0, 0.7]</w:t>
+            </w:r>
+          </w:p>
+        </w:tc>
+        <w:tc>
+          <w:tcPr>
+            <w:tcW w:type="dxa" w:w="3249"/>
+          </w:tcPr>
+          <w:p>
+            <w:r>
+              <w:rPr>
+                <w:sz w:val="17"/>
+              </w:rPr>
+              <w:t>0.6% [0.0, 1.4]</w:t>
+            </w:r>
+          </w:p>
+        </w:tc>
+      </w:tr>
+      <w:tr>
+        <w:tc>
+          <w:tcPr>
+            <w:tcW w:type="dxa" w:w="3249"/>
+          </w:tcPr>
+          <w:p>
+            <w:r>
+              <w:rPr>
+                <w:sz w:val="17"/>
+              </w:rPr>
+              <w:t>FAMS, fixed seed</w:t>
+            </w:r>
+          </w:p>
+        </w:tc>
+        <w:tc>
+          <w:tcPr>
+            <w:tcW w:type="dxa" w:w="3249"/>
+          </w:tcPr>
+          <w:p>
+            <w:r>
+              <w:rPr>
+                <w:sz w:val="17"/>
+              </w:rPr>
+              <w:t>22.4% [14.3, 31.9]</w:t>
+            </w:r>
+          </w:p>
+        </w:tc>
+        <w:tc>
+          <w:tcPr>
+            <w:tcW w:type="dxa" w:w="3249"/>
+          </w:tcPr>
+          <w:p>
+            <w:r>
+              <w:rPr>
+                <w:sz w:val="17"/>
+              </w:rPr>
+              <w:t>3.2% [1.6, 5.1]</w:t>
+            </w:r>
+          </w:p>
+        </w:tc>
+      </w:tr>
+      <w:tr>
+        <w:tc>
+          <w:tcPr>
+            <w:tcW w:type="dxa" w:w="3249"/>
+          </w:tcPr>
+          <w:p>
+            <w:r>
+              <w:rPr>
+                <w:sz w:val="17"/>
+              </w:rPr>
+              <w:t>FAMS, per frame</w:t>
+            </w:r>
+          </w:p>
+        </w:tc>
+        <w:tc>
+          <w:tcPr>
+            <w:tcW w:type="dxa" w:w="3249"/>
+          </w:tcPr>
+          <w:p>
+            <w:r>
+              <w:rPr>
+                <w:sz w:val="17"/>
+              </w:rPr>
+              <w:t>24.1% [15.3, 33.6]</w:t>
+            </w:r>
+          </w:p>
+        </w:tc>
+        <w:tc>
+          <w:tcPr>
+            <w:tcW w:type="dxa" w:w="3249"/>
+          </w:tcPr>
+          <w:p>
+            <w:r>
+              <w:rPr>
+                <w:sz w:val="17"/>
+              </w:rPr>
+              <w:t>5.9% [2.2, 10.5]</w:t>
+            </w:r>
+          </w:p>
+        </w:tc>
+      </w:tr>
+    </w:tbl>
+    <w:p/>
+    <w:p>
+      <w:pPr>
+        <w:spacing w:after="120"/>
+      </w:pPr>
+      <w:r>
+        <w:rPr>
+          <w:b/>
+        </w:rPr>
+        <w:t>Strength trades pupil signal for identity, not for linkability.</w:t>
+      </w:r>
+      <w:r>
+        <w:t xml:space="preserve"> The FAMS anonymisation degree extrapolates the generator away from the source identity. Raising it from the authors' 1.25 to 1.5 — the strongest setting that still yields a face in more than 90% of frames; beyond it the generator degrades rather than anonymises, with 19–94% of crops containing no detectable face — lowers ArcFace face verification from 24.1% to 10.1% [3.0, 19.3], still above the floor (FaceNet reaches its floor from 1.35). It leaves face-crop linkage where it was (ARI 0.81–0.90) and costs pupil signal: the within-participant correlation between the synthetic pupil and true horizontal gaze falls from 0.68 to 0.53 (Table 3; SimSwap 0.79, unprocessed 0.87). Each step that lowers re-identification removes gaze information; none removes linkability.</w:t>
       </w:r>
     </w:p>
     <w:p>
@@ -1750,28 +2161,693 @@
         <w:rPr>
           <w:b/>
         </w:rPr>
-        <w:t>The floor is eye-crop native.</w:t>
-      </w:r>
-      <w:r>
-        <w:t xml:space="preserve"> Running the periocular pipeline itself on a 120 px face-free patch of the same frames — identical frame selection, identical downstream steps, only the pixels differ — gives </w:t>
-      </w:r>
-      <w:r>
-        <w:rPr>
-          <w:b/>
-        </w:rPr>
-        <w:t>TAR@FAR=1e-3 = 1.57%</w:t>
-      </w:r>
-      <w:r>
-        <w:t xml:space="preserve">, Rank-1 50.6%, d′ 0.458, agreeing with the face-crop floor to three significant figures; its linkage floor is </w:t>
-      </w:r>
-      <w:r>
-        <w:rPr>
-          <w:b/>
-        </w:rPr>
-        <w:t>ARI 0.074</w:t>
-      </w:r>
-      <w:r>
-        <w:t>, against 0.089 for the face pipeline. Eye-ROI linkage is quoted against the former.</w:t>
+        <w:t>Table 3.</w:t>
+      </w:r>
+      <w:r>
+        <w:t xml:space="preserve"> FAMS anonymisation-strength sweep on the privacy sample (per-frame noise). Settings producing more than 10% non-face outputs are shown but not used for privacy conclusions. Pupil r: within-participant correlation of the synthetic pupil's horizontal position with EyeLink gaze (§8.1).</w:t>
+      </w:r>
+    </w:p>
+    <w:tbl>
+      <w:tblPr>
+        <w:tblStyle w:val="TableGrid"/>
+        <w:tblW w:type="auto" w:w="0"/>
+        <w:tblLook w:firstColumn="1" w:firstRow="1" w:lastColumn="0" w:lastRow="0" w:noHBand="0" w:noVBand="1" w:val="04A0"/>
+      </w:tblPr>
+      <w:tblGrid>
+        <w:gridCol w:w="1392"/>
+        <w:gridCol w:w="1392"/>
+        <w:gridCol w:w="1392"/>
+        <w:gridCol w:w="1392"/>
+        <w:gridCol w:w="1392"/>
+        <w:gridCol w:w="1392"/>
+        <w:gridCol w:w="1392"/>
+      </w:tblGrid>
+      <w:tr>
+        <w:tc>
+          <w:tcPr>
+            <w:tcW w:type="dxa" w:w="1392"/>
+          </w:tcPr>
+          <w:p>
+            <w:r>
+              <w:rPr>
+                <w:b/>
+                <w:sz w:val="17"/>
+              </w:rPr>
+              <w:t>Degree</w:t>
+            </w:r>
+          </w:p>
+        </w:tc>
+        <w:tc>
+          <w:tcPr>
+            <w:tcW w:type="dxa" w:w="1392"/>
+          </w:tcPr>
+          <w:p>
+            <w:r>
+              <w:rPr>
+                <w:b/>
+                <w:sz w:val="17"/>
+              </w:rPr>
+              <w:t>Non-face outputs</w:t>
+            </w:r>
+          </w:p>
+        </w:tc>
+        <w:tc>
+          <w:tcPr>
+            <w:tcW w:type="dxa" w:w="1392"/>
+          </w:tcPr>
+          <w:p>
+            <w:r>
+              <w:rPr>
+                <w:b/>
+                <w:sz w:val="17"/>
+              </w:rPr>
+              <w:t>Face TAR, ArcFace</w:t>
+            </w:r>
+          </w:p>
+        </w:tc>
+        <w:tc>
+          <w:tcPr>
+            <w:tcW w:type="dxa" w:w="1392"/>
+          </w:tcPr>
+          <w:p>
+            <w:r>
+              <w:rPr>
+                <w:b/>
+                <w:sz w:val="17"/>
+              </w:rPr>
+              <w:t>Face TAR, FaceNet</w:t>
+            </w:r>
+          </w:p>
+        </w:tc>
+        <w:tc>
+          <w:tcPr>
+            <w:tcW w:type="dxa" w:w="1392"/>
+          </w:tcPr>
+          <w:p>
+            <w:r>
+              <w:rPr>
+                <w:b/>
+                <w:sz w:val="17"/>
+              </w:rPr>
+              <w:t>Face linkage ARI</w:t>
+            </w:r>
+          </w:p>
+        </w:tc>
+        <w:tc>
+          <w:tcPr>
+            <w:tcW w:type="dxa" w:w="1392"/>
+          </w:tcPr>
+          <w:p>
+            <w:r>
+              <w:rPr>
+                <w:b/>
+                <w:sz w:val="17"/>
+              </w:rPr>
+              <w:t>Eye linkage ARI</w:t>
+            </w:r>
+          </w:p>
+        </w:tc>
+        <w:tc>
+          <w:tcPr>
+            <w:tcW w:type="dxa" w:w="1392"/>
+          </w:tcPr>
+          <w:p>
+            <w:r>
+              <w:rPr>
+                <w:b/>
+                <w:sz w:val="17"/>
+              </w:rPr>
+              <w:t>Pupil r</w:t>
+            </w:r>
+          </w:p>
+        </w:tc>
+      </w:tr>
+      <w:tr>
+        <w:tc>
+          <w:tcPr>
+            <w:tcW w:type="dxa" w:w="1392"/>
+          </w:tcPr>
+          <w:p>
+            <w:r>
+              <w:rPr>
+                <w:sz w:val="17"/>
+              </w:rPr>
+              <w:t>1.25 (authors)</w:t>
+            </w:r>
+          </w:p>
+        </w:tc>
+        <w:tc>
+          <w:tcPr>
+            <w:tcW w:type="dxa" w:w="1392"/>
+          </w:tcPr>
+          <w:p>
+            <w:r>
+              <w:rPr>
+                <w:sz w:val="17"/>
+              </w:rPr>
+              <w:t>0.0%</w:t>
+            </w:r>
+          </w:p>
+        </w:tc>
+        <w:tc>
+          <w:tcPr>
+            <w:tcW w:type="dxa" w:w="1392"/>
+          </w:tcPr>
+          <w:p>
+            <w:r>
+              <w:rPr>
+                <w:sz w:val="17"/>
+              </w:rPr>
+              <w:t>24.1% [15.3, 33.6]</w:t>
+            </w:r>
+          </w:p>
+        </w:tc>
+        <w:tc>
+          <w:tcPr>
+            <w:tcW w:type="dxa" w:w="1392"/>
+          </w:tcPr>
+          <w:p>
+            <w:r>
+              <w:rPr>
+                <w:sz w:val="17"/>
+              </w:rPr>
+              <w:t>5.9%</w:t>
+            </w:r>
+          </w:p>
+        </w:tc>
+        <w:tc>
+          <w:tcPr>
+            <w:tcW w:type="dxa" w:w="1392"/>
+          </w:tcPr>
+          <w:p>
+            <w:r>
+              <w:rPr>
+                <w:sz w:val="17"/>
+              </w:rPr>
+              <w:t>0.853</w:t>
+            </w:r>
+          </w:p>
+        </w:tc>
+        <w:tc>
+          <w:tcPr>
+            <w:tcW w:type="dxa" w:w="1392"/>
+          </w:tcPr>
+          <w:p>
+            <w:r>
+              <w:rPr>
+                <w:sz w:val="17"/>
+              </w:rPr>
+              <w:t>0.292</w:t>
+            </w:r>
+          </w:p>
+        </w:tc>
+        <w:tc>
+          <w:tcPr>
+            <w:tcW w:type="dxa" w:w="1392"/>
+          </w:tcPr>
+          <w:p>
+            <w:r>
+              <w:rPr>
+                <w:sz w:val="17"/>
+              </w:rPr>
+              <w:t>0.68</w:t>
+            </w:r>
+          </w:p>
+        </w:tc>
+      </w:tr>
+      <w:tr>
+        <w:tc>
+          <w:tcPr>
+            <w:tcW w:type="dxa" w:w="1392"/>
+          </w:tcPr>
+          <w:p>
+            <w:r>
+              <w:rPr>
+                <w:sz w:val="17"/>
+              </w:rPr>
+              <w:t>1.35</w:t>
+            </w:r>
+          </w:p>
+        </w:tc>
+        <w:tc>
+          <w:tcPr>
+            <w:tcW w:type="dxa" w:w="1392"/>
+          </w:tcPr>
+          <w:p>
+            <w:r>
+              <w:rPr>
+                <w:sz w:val="17"/>
+              </w:rPr>
+              <w:t>0.1%</w:t>
+            </w:r>
+          </w:p>
+        </w:tc>
+        <w:tc>
+          <w:tcPr>
+            <w:tcW w:type="dxa" w:w="1392"/>
+          </w:tcPr>
+          <w:p>
+            <w:r>
+              <w:rPr>
+                <w:sz w:val="17"/>
+              </w:rPr>
+              <w:t>14.1% [5.9, 23.5]</w:t>
+            </w:r>
+          </w:p>
+        </w:tc>
+        <w:tc>
+          <w:tcPr>
+            <w:tcW w:type="dxa" w:w="1392"/>
+          </w:tcPr>
+          <w:p>
+            <w:r>
+              <w:rPr>
+                <w:sz w:val="17"/>
+              </w:rPr>
+              <w:t>2.6%</w:t>
+            </w:r>
+          </w:p>
+        </w:tc>
+        <w:tc>
+          <w:tcPr>
+            <w:tcW w:type="dxa" w:w="1392"/>
+          </w:tcPr>
+          <w:p>
+            <w:r>
+              <w:rPr>
+                <w:sz w:val="17"/>
+              </w:rPr>
+              <w:t>0.810</w:t>
+            </w:r>
+          </w:p>
+        </w:tc>
+        <w:tc>
+          <w:tcPr>
+            <w:tcW w:type="dxa" w:w="1392"/>
+          </w:tcPr>
+          <w:p>
+            <w:r>
+              <w:rPr>
+                <w:sz w:val="17"/>
+              </w:rPr>
+              <w:t>0.305</w:t>
+            </w:r>
+          </w:p>
+        </w:tc>
+        <w:tc>
+          <w:tcPr>
+            <w:tcW w:type="dxa" w:w="1392"/>
+          </w:tcPr>
+          <w:p>
+            <w:r>
+              <w:rPr>
+                <w:sz w:val="17"/>
+              </w:rPr>
+              <w:t>0.62</w:t>
+            </w:r>
+          </w:p>
+        </w:tc>
+      </w:tr>
+      <w:tr>
+        <w:tc>
+          <w:tcPr>
+            <w:tcW w:type="dxa" w:w="1392"/>
+          </w:tcPr>
+          <w:p>
+            <w:r>
+              <w:rPr>
+                <w:sz w:val="17"/>
+              </w:rPr>
+              <w:t>1.5</w:t>
+            </w:r>
+          </w:p>
+        </w:tc>
+        <w:tc>
+          <w:tcPr>
+            <w:tcW w:type="dxa" w:w="1392"/>
+          </w:tcPr>
+          <w:p>
+            <w:r>
+              <w:rPr>
+                <w:sz w:val="17"/>
+              </w:rPr>
+              <w:t>6.5%</w:t>
+            </w:r>
+          </w:p>
+        </w:tc>
+        <w:tc>
+          <w:tcPr>
+            <w:tcW w:type="dxa" w:w="1392"/>
+          </w:tcPr>
+          <w:p>
+            <w:r>
+              <w:rPr>
+                <w:sz w:val="17"/>
+              </w:rPr>
+              <w:t>10.1% [3.0, 19.3]</w:t>
+            </w:r>
+          </w:p>
+        </w:tc>
+        <w:tc>
+          <w:tcPr>
+            <w:tcW w:type="dxa" w:w="1392"/>
+          </w:tcPr>
+          <w:p>
+            <w:r>
+              <w:rPr>
+                <w:sz w:val="17"/>
+              </w:rPr>
+              <w:t>2.2%</w:t>
+            </w:r>
+          </w:p>
+        </w:tc>
+        <w:tc>
+          <w:tcPr>
+            <w:tcW w:type="dxa" w:w="1392"/>
+          </w:tcPr>
+          <w:p>
+            <w:r>
+              <w:rPr>
+                <w:sz w:val="17"/>
+              </w:rPr>
+              <w:t>0.899</w:t>
+            </w:r>
+          </w:p>
+        </w:tc>
+        <w:tc>
+          <w:tcPr>
+            <w:tcW w:type="dxa" w:w="1392"/>
+          </w:tcPr>
+          <w:p>
+            <w:r>
+              <w:rPr>
+                <w:sz w:val="17"/>
+              </w:rPr>
+              <w:t>0.283</w:t>
+            </w:r>
+          </w:p>
+        </w:tc>
+        <w:tc>
+          <w:tcPr>
+            <w:tcW w:type="dxa" w:w="1392"/>
+          </w:tcPr>
+          <w:p>
+            <w:r>
+              <w:rPr>
+                <w:sz w:val="17"/>
+              </w:rPr>
+              <w:t>0.53</w:t>
+            </w:r>
+          </w:p>
+        </w:tc>
+      </w:tr>
+      <w:tr>
+        <w:tc>
+          <w:tcPr>
+            <w:tcW w:type="dxa" w:w="1392"/>
+          </w:tcPr>
+          <w:p>
+            <w:r>
+              <w:rPr>
+                <w:sz w:val="17"/>
+              </w:rPr>
+              <w:t>1.6</w:t>
+            </w:r>
+          </w:p>
+        </w:tc>
+        <w:tc>
+          <w:tcPr>
+            <w:tcW w:type="dxa" w:w="1392"/>
+          </w:tcPr>
+          <w:p>
+            <w:r>
+              <w:rPr>
+                <w:sz w:val="17"/>
+              </w:rPr>
+              <w:t>18.7%</w:t>
+            </w:r>
+          </w:p>
+        </w:tc>
+        <w:tc>
+          <w:tcPr>
+            <w:tcW w:type="dxa" w:w="1392"/>
+          </w:tcPr>
+          <w:p>
+            <w:r>
+              <w:rPr>
+                <w:sz w:val="17"/>
+              </w:rPr>
+              <w:t>5.9% [0.9, 12.0]</w:t>
+            </w:r>
+          </w:p>
+        </w:tc>
+        <w:tc>
+          <w:tcPr>
+            <w:tcW w:type="dxa" w:w="1392"/>
+          </w:tcPr>
+          <w:p>
+            <w:r>
+              <w:rPr>
+                <w:sz w:val="17"/>
+              </w:rPr>
+              <w:t>1.7%</w:t>
+            </w:r>
+          </w:p>
+        </w:tc>
+        <w:tc>
+          <w:tcPr>
+            <w:tcW w:type="dxa" w:w="1392"/>
+          </w:tcPr>
+          <w:p>
+            <w:r>
+              <w:rPr>
+                <w:sz w:val="17"/>
+              </w:rPr>
+              <w:t>0.792</w:t>
+            </w:r>
+          </w:p>
+        </w:tc>
+        <w:tc>
+          <w:tcPr>
+            <w:tcW w:type="dxa" w:w="1392"/>
+          </w:tcPr>
+          <w:p>
+            <w:r>
+              <w:rPr>
+                <w:sz w:val="17"/>
+              </w:rPr>
+              <w:t>0.302</w:t>
+            </w:r>
+          </w:p>
+        </w:tc>
+        <w:tc>
+          <w:tcPr>
+            <w:tcW w:type="dxa" w:w="1392"/>
+          </w:tcPr>
+          <w:p>
+            <w:r>
+              <w:rPr>
+                <w:sz w:val="17"/>
+              </w:rPr>
+              <w:t>0.41</w:t>
+            </w:r>
+          </w:p>
+        </w:tc>
+      </w:tr>
+      <w:tr>
+        <w:tc>
+          <w:tcPr>
+            <w:tcW w:type="dxa" w:w="1392"/>
+          </w:tcPr>
+          <w:p>
+            <w:r>
+              <w:rPr>
+                <w:sz w:val="17"/>
+              </w:rPr>
+              <w:t>1.75</w:t>
+            </w:r>
+          </w:p>
+        </w:tc>
+        <w:tc>
+          <w:tcPr>
+            <w:tcW w:type="dxa" w:w="1392"/>
+          </w:tcPr>
+          <w:p>
+            <w:r>
+              <w:rPr>
+                <w:sz w:val="17"/>
+              </w:rPr>
+              <w:t>36.0%</w:t>
+            </w:r>
+          </w:p>
+        </w:tc>
+        <w:tc>
+          <w:tcPr>
+            <w:tcW w:type="dxa" w:w="1392"/>
+          </w:tcPr>
+          <w:p>
+            <w:r>
+              <w:rPr>
+                <w:sz w:val="17"/>
+              </w:rPr>
+              <w:t>3.7% [0.3, 9.4]</w:t>
+            </w:r>
+          </w:p>
+        </w:tc>
+        <w:tc>
+          <w:tcPr>
+            <w:tcW w:type="dxa" w:w="1392"/>
+          </w:tcPr>
+          <w:p>
+            <w:r>
+              <w:rPr>
+                <w:sz w:val="17"/>
+              </w:rPr>
+              <w:t>1.9%</w:t>
+            </w:r>
+          </w:p>
+        </w:tc>
+        <w:tc>
+          <w:tcPr>
+            <w:tcW w:type="dxa" w:w="1392"/>
+          </w:tcPr>
+          <w:p>
+            <w:r>
+              <w:rPr>
+                <w:sz w:val="17"/>
+              </w:rPr>
+              <w:t>0.784</w:t>
+            </w:r>
+          </w:p>
+        </w:tc>
+        <w:tc>
+          <w:tcPr>
+            <w:tcW w:type="dxa" w:w="1392"/>
+          </w:tcPr>
+          <w:p>
+            <w:r>
+              <w:rPr>
+                <w:sz w:val="17"/>
+              </w:rPr>
+              <w:t>0.259</w:t>
+            </w:r>
+          </w:p>
+        </w:tc>
+        <w:tc>
+          <w:tcPr>
+            <w:tcW w:type="dxa" w:w="1392"/>
+          </w:tcPr>
+          <w:p>
+            <w:r>
+              <w:rPr>
+                <w:sz w:val="17"/>
+              </w:rPr>
+              <w:t>0.23</w:t>
+            </w:r>
+          </w:p>
+        </w:tc>
+      </w:tr>
+      <w:tr>
+        <w:tc>
+          <w:tcPr>
+            <w:tcW w:type="dxa" w:w="1392"/>
+          </w:tcPr>
+          <w:p>
+            <w:r>
+              <w:rPr>
+                <w:sz w:val="17"/>
+              </w:rPr>
+              <w:t>2.0</w:t>
+            </w:r>
+          </w:p>
+        </w:tc>
+        <w:tc>
+          <w:tcPr>
+            <w:tcW w:type="dxa" w:w="1392"/>
+          </w:tcPr>
+          <w:p>
+            <w:r>
+              <w:rPr>
+                <w:sz w:val="17"/>
+              </w:rPr>
+              <w:t>93.9%</w:t>
+            </w:r>
+          </w:p>
+        </w:tc>
+        <w:tc>
+          <w:tcPr>
+            <w:tcW w:type="dxa" w:w="1392"/>
+          </w:tcPr>
+          <w:p>
+            <w:r>
+              <w:rPr>
+                <w:sz w:val="17"/>
+              </w:rPr>
+              <w:t>—</w:t>
+            </w:r>
+          </w:p>
+        </w:tc>
+        <w:tc>
+          <w:tcPr>
+            <w:tcW w:type="dxa" w:w="1392"/>
+          </w:tcPr>
+          <w:p>
+            <w:r>
+              <w:rPr>
+                <w:sz w:val="17"/>
+              </w:rPr>
+              <w:t>—</w:t>
+            </w:r>
+          </w:p>
+        </w:tc>
+        <w:tc>
+          <w:tcPr>
+            <w:tcW w:type="dxa" w:w="1392"/>
+          </w:tcPr>
+          <w:p>
+            <w:r>
+              <w:rPr>
+                <w:sz w:val="17"/>
+              </w:rPr>
+              <w:t>—</w:t>
+            </w:r>
+          </w:p>
+        </w:tc>
+        <w:tc>
+          <w:tcPr>
+            <w:tcW w:type="dxa" w:w="1392"/>
+          </w:tcPr>
+          <w:p>
+            <w:r>
+              <w:rPr>
+                <w:sz w:val="17"/>
+              </w:rPr>
+              <w:t>—</w:t>
+            </w:r>
+          </w:p>
+        </w:tc>
+        <w:tc>
+          <w:tcPr>
+            <w:tcW w:type="dxa" w:w="1392"/>
+          </w:tcPr>
+          <w:p>
+            <w:r>
+              <w:rPr>
+                <w:sz w:val="17"/>
+              </w:rPr>
+              <w:t>—</w:t>
+            </w:r>
+          </w:p>
+        </w:tc>
+      </w:tr>
+    </w:tbl>
+    <w:p/>
+    <w:p>
+      <w:pPr>
+        <w:spacing w:after="120"/>
+      </w:pPr>
+      <w:r>
+        <w:t>The residual channels the recogniser does exploit — skin tone, periocular geometry, crop scale — are signals gaze estimation reads, which is why the axis trades at all.</w:t>
       </w:r>
     </w:p>
     <w:p>
@@ -1779,22 +2855,16 @@
         <w:spacing w:after="120"/>
       </w:pPr>
       <w:r>
+        <w:t xml:space="preserve">These eye-ROI figures assume an attacker who knows the cohort size: on the eye ROI the cluster count is not recovered unaided, whereas on the face ROI it is (k = 18 selected by silhouette). For a public release the cohort size is stated in the documentation, so the assumption is mild, but it is an assumption and the face ROI does not need it. Breaking unsupervised </w:t>
+      </w:r>
+      <w:r>
         <w:rPr>
-          <w:b/>
+          <w:i/>
         </w:rPr>
-        <w:t>The open tier leaks too, by two orders of magnitude less.</w:t>
-      </w:r>
-      <w:r>
-        <w:t xml:space="preserve"> Our release plan puts per-frame gaze estimates and oculomotor measures in an open tier because it contains no imagery and no face embeddings. Since eye movement is itself a biometric, we tested that rather than asserting it. Treating the released gaze series as the attacker's only input, we cut each recording into 5 s fragments (150 frames), described each with fifteen dispersion, velocity and saccade/fixation statistics, and clustered. The result is </w:t>
-      </w:r>
-      <w:r>
-        <w:rPr>
-          <w:b/>
-        </w:rPr>
-        <w:t>ARI 0.033 at the correct k, purity 0.157 against a chance purity of 0.059</w:t>
-      </w:r>
-      <w:r>
-        <w:t>, versus a label-permutation null of −0.0001 (max 0.0015 over 20 permutations). The signal is real but small — two orders of magnitude below the pixel tiers (0.68–1.000). We report the open tier as low, not zero, residual risk.</w:t>
+        <w:t>discoverability</w:t>
+      </w:r>
+      <w:r>
+        <w:t xml:space="preserve"> is in fact the one place replacement helps: on the right eye, k selected falls from 26 (ARI 0.674) to 2 (ARI 0.011). It breaks discovery of the partition, not its separability.</w:t>
       </w:r>
     </w:p>
     <w:p>
@@ -1805,19 +2875,28 @@
         <w:rPr>
           <w:b/>
         </w:rPr>
-        <w:t>Metadata leaks before a pixel is read.</w:t>
-      </w:r>
-      <w:r>
-        <w:t xml:space="preserve"> Released crop dimensions are constant per participant. Face ROI size alone yields an expected Rank-1 of 50.0%; face size, eye size and inter-ocular distance together yield </w:t>
+        <w:t>The floor is eye-crop native.</w:t>
+      </w:r>
+      <w:r>
+        <w:t xml:space="preserve"> Running the periocular pipeline itself on a 120 px face-free patch of the same frames — identical frame selection, identical downstream steps, only the pixels differ — gives </w:t>
       </w:r>
       <w:r>
         <w:rPr>
           <w:b/>
         </w:rPr>
-        <w:t>94.4%</w:t>
-      </w:r>
-      <w:r>
-        <w:t xml:space="preserve"> (4.06 of 4.17 bits) without reading any pixels. A release must normalise crop geometry; ours does, and all figures above are pixel-based.</w:t>
+        <w:t>TAR@FAR=1e-3 = 1.57%</w:t>
+      </w:r>
+      <w:r>
+        <w:t xml:space="preserve">, Rank-1 50.6%, d′ 0.458, agreeing with the face-crop floor to three significant figures; its linkage floor is </w:t>
+      </w:r>
+      <w:r>
+        <w:rPr>
+          <w:b/>
+        </w:rPr>
+        <w:t>ARI 0.074</w:t>
+      </w:r>
+      <w:r>
+        <w:t>, against 0.089 for the face pipeline. Eye-ROI linkage is quoted against the former.</w:t>
       </w:r>
     </w:p>
     <w:p>
@@ -1828,37 +2907,19 @@
         <w:rPr>
           <w:b/>
         </w:rPr>
-        <w:t>An adaptive attacker gains little.</w:t>
-      </w:r>
-      <w:r>
-        <w:t xml:space="preserve"> An attacker who knows the operator and holds paired (original, synthesised) imagery of </w:t>
-      </w:r>
-      <w:r>
-        <w:rPr>
-          <w:i/>
-        </w:rPr>
-        <w:t>other</w:t>
-      </w:r>
-      <w:r>
-        <w:t xml:space="preserve"> participants can fit a de-anonymisation map and apply it to a participant they could not train on. Across mean-shift, orthogonal Procrustes and ridge maps, fitted leave-one-participant-out, the best gain is </w:t>
+        <w:t>The open tier leaks too, by two orders of magnitude less.</w:t>
+      </w:r>
+      <w:r>
+        <w:t xml:space="preserve"> Our release plan puts per-frame gaze estimates and oculomotor measures in an open tier because it contains no imagery and no face embeddings. Since eye movement is itself a biometric, we tested that rather than asserting it. Treating the released gaze series as the attacker's only input, we cut each recording into 5 s fragments (150 frames), described each with fifteen dispersion, velocity and saccade/fixation statistics, and clustered. The result is </w:t>
       </w:r>
       <w:r>
         <w:rPr>
           <w:b/>
         </w:rPr>
-        <w:t>+3.3 points</w:t>
-      </w:r>
-      <w:r>
-        <w:t xml:space="preserve"> on the face ROI (19.9% → 23.2%) and nothing on the eye ROIs. The same maps reach Rank-1 100% when fitted </w:t>
-      </w:r>
-      <w:r>
-        <w:rPr>
-          <w:i/>
-        </w:rPr>
-        <w:t>including</w:t>
-      </w:r>
-      <w:r>
-        <w:t xml:space="preserve"> the target — they memorise identities rather than invert the operator. The protection is a generalisation barrier, not an information-theoretic one.</w:t>
+        <w:t>ARI 0.033 at the correct k, purity 0.157 against a chance purity of 0.059</w:t>
+      </w:r>
+      <w:r>
+        <w:t>, versus a label-permutation null of −0.0001 (max 0.0015 over 20 permutations). The signal is real but small — two orders of magnitude below the pixel tiers (0.68–1.000). We report the open tier as low, not zero, residual risk.</w:t>
       </w:r>
     </w:p>
     <w:p>
@@ -1869,7 +2930,71 @@
         <w:rPr>
           <w:b/>
         </w:rPr>
-        <w:t>Table 2.</w:t>
+        <w:t>Metadata leaks before a pixel is read.</w:t>
+      </w:r>
+      <w:r>
+        <w:t xml:space="preserve"> Released crop dimensions are constant per participant. Face ROI size alone yields an expected Rank-1 of 50.0%; face size, eye size and inter-ocular distance together yield </w:t>
+      </w:r>
+      <w:r>
+        <w:rPr>
+          <w:b/>
+        </w:rPr>
+        <w:t>94.4%</w:t>
+      </w:r>
+      <w:r>
+        <w:t xml:space="preserve"> (4.06 of 4.17 bits) without reading any pixels. A release must normalise crop geometry; ours does, and all figures above are pixel-based.</w:t>
+      </w:r>
+    </w:p>
+    <w:p>
+      <w:pPr>
+        <w:spacing w:after="120"/>
+      </w:pPr>
+      <w:r>
+        <w:rPr>
+          <w:b/>
+        </w:rPr>
+        <w:t>An adaptive attacker gains little.</w:t>
+      </w:r>
+      <w:r>
+        <w:t xml:space="preserve"> An attacker who knows the operator and holds paired (original, synthesised) imagery of </w:t>
+      </w:r>
+      <w:r>
+        <w:rPr>
+          <w:i/>
+        </w:rPr>
+        <w:t>other</w:t>
+      </w:r>
+      <w:r>
+        <w:t xml:space="preserve"> participants can fit a de-anonymisation map and apply it to a participant they could not train on. Across mean-shift, orthogonal Procrustes and ridge maps, fitted leave-one-participant-out, the best gain is </w:t>
+      </w:r>
+      <w:r>
+        <w:rPr>
+          <w:b/>
+        </w:rPr>
+        <w:t>+3.3 points</w:t>
+      </w:r>
+      <w:r>
+        <w:t xml:space="preserve"> on the face ROI (19.9% → 23.2%) and nothing on the eye ROIs. The same maps reach Rank-1 100% when fitted </w:t>
+      </w:r>
+      <w:r>
+        <w:rPr>
+          <w:i/>
+        </w:rPr>
+        <w:t>including</w:t>
+      </w:r>
+      <w:r>
+        <w:t xml:space="preserve"> the target — they memorise identities rather than invert the operator. The protection is a generalisation barrier, not an information-theoretic one.</w:t>
+      </w:r>
+    </w:p>
+    <w:p>
+      <w:pPr>
+        <w:spacing w:after="120"/>
+      </w:pPr>
+      <w:r>
+        <w:rPr>
+          <w:b/>
+        </w:rPr>
+        <w:t>Table 4.</w:t>
       </w:r>
       <w:r>
         <w:t xml:space="preserve"> Identity leakage across release strategies. A1: the attacker holds enrolment photographs; A2: the attacker holds only the release. TAR at FAR = 1e-3 (ArcFace) and ARI at k = 18, with 95% participant-level bootstrap intervals.</w:t>
@@ -1996,7 +3121,7 @@
               <w:rPr>
                 <w:sz w:val="17"/>
               </w:rPr>
-              <w:t>22.0% [6.1, 41.3]</w:t>
+              <w:t>18.4% [5.1, 35.4]</w:t>
             </w:r>
           </w:p>
         </w:tc>
@@ -2009,7 +3134,7 @@
               <w:rPr>
                 <w:sz w:val="17"/>
               </w:rPr>
-              <w:t>23.3% [7.2, 43.2]</w:t>
+              <w:t>22.0% [6.8, 40.7]</w:t>
             </w:r>
           </w:p>
         </w:tc>
@@ -2022,7 +3147,7 @@
               <w:rPr>
                 <w:sz w:val="17"/>
               </w:rPr>
-              <w:t>22.0% (face is synthetic)</w:t>
+              <w:t>18.4% (face is synthetic)</w:t>
             </w:r>
           </w:p>
         </w:tc>
@@ -2705,6 +3830,20 @@
     </w:p>
     <w:p>
       <w:pPr>
+        <w:spacing w:after="120"/>
+      </w:pPr>
+      <w:r>
+        <w:rPr>
+          <w:b/>
+        </w:rPr>
+        <w:t>A model-free check on the pupil.</w:t>
+      </w:r>
+      <w:r>
+        <w:t xml:space="preserve"> End-to-end error mixes the information a release carries with how well a model trained on it transfers. We therefore also measure the pupil directly. FaceMesh [facemesh] locates both iris centres on the released face crop and on the original crop of the same frame, each expressed in its eye's own corner-to-corner frame, which removes head pose and crop placement. We report the within-participant correlation of the released pupil position with the original one and with the EyeLink gaze coordinate, on 4,680 frames identical across all releases.</w:t>
+      </w:r>
+    </w:p>
+    <w:p>
+      <w:pPr>
         <w:pStyle w:val="Heading2"/>
       </w:pPr>
       <w:r>
@@ -2716,7 +3855,7 @@
         <w:spacing w:after="120"/>
       </w:pPr>
       <w:r>
-        <w:t>Table 3 reports SimSwap under condition (ii); Table 4 reports DeepPrivacy2 and FAMS under the same models, initialisations and harness. Before any DeepPrivacy2 or FAMS number was computed, the real-data arm was re-run through the same pipeline and reproduced Table 3 to within 0.0012 cm on all 100 folds.</w:t>
+        <w:t>Table 5 reports SimSwap under condition (ii); Table 6 reports DeepPrivacy2 and FAMS under the same models, initialisations and harness. Before any DeepPrivacy2 or FAMS number was computed, the real-data arm was re-run through the same pipeline and reproduced Table 5 to within 0.0012 cm on all 100 folds.</w:t>
       </w:r>
     </w:p>
     <w:p>
@@ -2727,7 +3866,7 @@
         <w:rPr>
           <w:b/>
         </w:rPr>
-        <w:t>Table 3.</w:t>
+        <w:t>Table 5.</w:t>
       </w:r>
       <w:r>
         <w:t xml:space="preserve"> Gaze error (cm) under condition (ii) for SimSwap: trained on real data, deployed on de-identified crops. Mean over five folds, then mean ± SD over five independent initialisations; in parentheses, the change against the same model's real-data baseline. The SD is the noise floor of the comparison (0.04–0.20 cm on the baseline): no difference smaller than it can be supported in either direction.</w:t>
@@ -3171,10 +4310,10 @@
         <w:rPr>
           <w:b/>
         </w:rPr>
-        <w:t>Table 4.</w:t>
-      </w:r>
-      <w:r>
-        <w:t xml:space="preserve"> Condition (ii) for DeepPrivacy2 (face and full-body modes, fixed and per-frame identity) and FAMS (fresh noise per frame, all 210,924 task frames). Mean ± SD over five initialisations; in parentheses, or as listed for FAMS, the change against the real-data baseline in Table 3.</w:t>
+        <w:t>Table 6.</w:t>
+      </w:r>
+      <w:r>
+        <w:t xml:space="preserve"> Condition (ii) for DeepPrivacy2 (face and full-body modes, fixed and per-frame identity) and FAMS (fresh noise per frame, all 210,924 task frames). Mean ± SD over five initialisations; in parentheses, or as listed for FAMS, the change against the real-data baseline in Table 5.</w:t>
       </w:r>
     </w:p>
     <w:p>
@@ -4244,7 +5383,7 @@
         <w:rPr>
           <w:b/>
         </w:rPr>
-        <w:t>Table 5.</w:t>
+        <w:t>Table 7.</w:t>
       </w:r>
       <w:r>
         <w:t xml:space="preserve"> Hybrid minus Full Synthetic (cm), paired within initialisation, mean ± SD over five draws; negative means the genuine ocular crops recover accuracy. All 40 draw-level values are negative, and the across-draw SD is an order of magnitude below the effect in every cell.</w:t>
@@ -4678,7 +5817,7 @@
         <w:spacing w:after="120"/>
       </w:pPr>
       <w:r>
-        <w:t>Changing the source template from Identity A to Identity B changes the Full Synthetic error by +0.63 to +3.38 cm, but the Hybrid error by only −0.34 to +0.86 cm, and Hybrid recovers most of the penalty under both templates (Table 5). The synthesis penalty depends strongly on the template; the Hybrid error changes much less.</w:t>
+        <w:t>Changing the source template from Identity A to Identity B changes the Full Synthetic error by +0.63 to +3.38 cm, but the Hybrid error by only −0.34 to +0.86 cm, and Hybrid recovers most of the penalty under both templates (Table 7). The synthesis penalty depends strongly on the template; the Hybrid error changes much less.</w:t>
       </w:r>
     </w:p>
     <w:p>
@@ -4697,10 +5836,10 @@
         <w:rPr>
           <w:b/>
         </w:rPr>
-        <w:t>Table 6.</w:t>
-      </w:r>
-      <w:r>
-        <w:t xml:space="preserve"> Penalty (cm) against each model's own real-data baseline, under the three conditions: mean over MobileNet-V3 Large, AFFNet and MGazeNet, with [min, max] across the three. Condition (i) is the mean over five independent initialisations per cell (per-draw SDs 0.01–0.83 cm), against the five-draw real-data mean; condition (ii) is recomputed over the same three architectures so the columns are comparable. Retraining uses the same recipe and participant partition as the real-data models. iTracker (about 9 h per fold) is reported separately in Table 8. Negative Hybrid values read as indistinguishable from baseline, not as gains.</w:t>
+        <w:t>Table 8.</w:t>
+      </w:r>
+      <w:r>
+        <w:t xml:space="preserve"> Penalty (cm) against each model's own real-data baseline, under the three conditions: mean over MobileNet-V3 Large, AFFNet and MGazeNet, with [min, max] across the three. Condition (i) is the mean over five independent initialisations per cell (per-draw SDs 0.01–0.83 cm), against the five-draw real-data mean; condition (ii) is recomputed over the same three architectures so the columns are comparable. Retraining uses the same recipe and participant partition as the real-data models. iTracker (about 9 h per fold) is reported separately in Table 12. Negative Hybrid values read as indistinguishable from baseline, not as gains.</w:t>
       </w:r>
     </w:p>
     <w:tbl>
@@ -5739,7 +6878,7 @@
         <w:t>Retraining does not rescue full synthesis.</w:t>
       </w:r>
       <w:r>
-        <w:t xml:space="preserve"> For SimSwap, the penalty survives retraining: +2.2 to +3.1 cm when the retrained model is tested on the release, and +2.5 to +6.2 cm when it is deployed on real faces — where two of the three architectures end up at or beyond the no-information reference. The synthesis penalty in Table 3 is therefore mostly lost information, not domain shift: a model cannot learn from synthetic eyes what synthetic eyes do not carry. A Full Synthetic release is of little use to a third party who wants a gaze model for real users.</w:t>
+        <w:t xml:space="preserve"> For SimSwap, the penalty survives retraining: +2.2 to +3.1 cm when the retrained model is tested on the release, and +2.5 to +6.2 cm when it is deployed on real faces — where two of the three architectures end up at or beyond the no-information reference. The synthesis penalty in Table 5 is therefore mostly lost information, not domain shift: a model cannot learn from synthetic eyes what synthetic eyes do not carry. A Full Synthetic release is of little use to a third party who wants a gaze model for real users.</w:t>
       </w:r>
     </w:p>
     <w:p>
@@ -5776,7 +6915,7 @@
         <w:t>Hybrid recovers the penalty in every condition.</w:t>
       </w:r>
       <w:r>
-        <w:t xml:space="preserve"> Restoring the genuine ocular ROIs recovers 91–103% of the penalty when the retrained model is deployed on real faces and 98–106% on the release, for both families, both DeepPrivacy2 modes and both identity regimes; every Hybrid cell in condition (i) lies between −0.19 and +0.23 cm of baseline, inside the initialisation noise floor or at its edge. FAMS falls in the same band (−0.14 to +0.07 cm); its percentages (82–111% and 96–106%) are noisier because its Full Synthetic penalty on real faces is small, +0.39 cm for AFFNet. The central utility finding of Table 5 therefore does not depend on how the model was trained.</w:t>
+        <w:t xml:space="preserve"> Restoring the genuine ocular ROIs recovers 91–103% of the penalty when the retrained model is deployed on real faces and 98–106% on the release, for both families, both DeepPrivacy2 modes and both identity regimes; every Hybrid cell in condition (i) lies between −0.19 and +0.23 cm of baseline, inside the initialisation noise floor or at its edge. FAMS falls in the same band (−0.14 to +0.07 cm); its percentages (82–111% and 96–106%) are noisier because its Full Synthetic penalty on real faces is small, +0.39 cm for AFFNet. The central utility finding of Table 7 therefore does not depend on how the model was trained.</w:t>
       </w:r>
     </w:p>
     <w:p>
@@ -5787,10 +6926,10 @@
         <w:rPr>
           <w:b/>
         </w:rPr>
-        <w:t>A diffusion anonymiser keeps most of the gaze signal.</w:t>
-      </w:r>
-      <w:r>
-        <w:t xml:space="preserve"> FAMS looks, under condition (ii), like the others: +4.1 to +5.1 cm, its absolute error close to predicting the mean. Retraining shows that this is mostly domain shift. A model trained on FAMS-anonymised frames and deployed on real faces is +0.94 cm from one trained on real frames, averaged over architectures and five initialisations — +1.15 ± 0.03 (MobileNet-V3), +0.39 ± 0.21 (AFFNet), +1.29 ± 0.06 (MGazeNet) — with absolute errors of 6.0–6.3 cm against 9.4 for predicting the mean. SimSwap A retrained the same way loses +3.83 cm and DeepPrivacy2 +4.51; FAMS is better than both in every one of 15 paired draws. Tested on the release instead of on real faces, the same models lose more (+1.56 to +2.57 cm). The direction is the reverse of SimSwap's, whose retrained models do worse on real faces than on the release, and DeepPrivacy2 is equal across the two (within 0.4 cm). What a model learns from FAMS frames transfers to real eyes better than it applies to FAMS frames themselves, consistent with the diffusion step perturbing the eye region differently in every frame. FAMS is the only full-synthesis release we tested that a third party could train a useful model on. On the privacy axis it is also the only method that breaks per-participant consistency without being asked to (§7); what keeps it linkable is the face crop it does not fully cover.</w:t>
+        <w:t>A diffusion anonymiser transfers better; it does not keep more gaze.</w:t>
+      </w:r>
+      <w:r>
+        <w:t xml:space="preserve"> FAMS looks, under condition (ii), like the others: +4.1 to +5.1 cm. Retrained on its release and deployed on real faces, models lose only +0.94 cm on average — +1.15 ± 0.03 (MobileNet-V3), +0.39 ± 0.21 (AFFNet), +1.29 ± 0.06 (MGazeNet) — against +3.83 for SimSwap A and +4.51 for DeepPrivacy2, and FAMS is better than both in every one of 15 paired draws. Two measurements show that this is not because its eyes carry more gaze. The model-free pupil test (Table 9) finds the opposite: SimSwap's synthetic pupils follow the participant's true horizontal gaze more closely than FAMS's in all 17 participants with ground truth (r = 0.79–0.83 against 0.68–0.69; unprocessed 0.87). And models that see only the eye crops (Table 10) reproduce the advantage on real faces — +0.96 to +1.16 cm for FAMS against +2.71 to +6.77 for SimSwap — but not inside the release, where the two are comparable (+2.04 to +2.72 against +1.98 to +2.95, each method better for one eyes-only architecture in every draw). The difference is transfer: models trained on SimSwap eyes fail on real eyes, models trained on FAMS eyes do not. A plausible reading, which we did not test, is diversity: SimSwap maps every participant onto one template's eyes, whereas FAMS draws a new identity every frame. Tested on its own release, a FAMS-trained model is less accurate than on real faces (+1.56 to +2.57 cm), the reverse of SimSwap. FAMS is therefore the more useful release for training models deployed on real users, for reasons that have nothing to do with keeping more of the pupil; on the privacy axis it breaks per-participant consistency without being asked to, yet its face crop still verifies against the participant's photographs and stays linkable (§7).</w:t>
       </w:r>
     </w:p>
     <w:p>
@@ -5801,6 +6940,678 @@
         <w:rPr>
           <w:b/>
         </w:rPr>
+        <w:t>Table 9.</w:t>
+      </w:r>
+      <w:r>
+        <w:t xml:space="preserve"> Pupil-position preservation, model-free (§8.1): within-participant correlation of the released pupil position with the original one (horizontal, vertical) and with EyeLink gaze, mean over participants; 4,680 identical frames.</w:t>
+      </w:r>
+    </w:p>
+    <w:tbl>
+      <w:tblPr>
+        <w:tblStyle w:val="TableGrid"/>
+        <w:tblW w:type="auto" w:w="0"/>
+        <w:tblLook w:firstColumn="1" w:firstRow="1" w:lastColumn="0" w:lastRow="0" w:noHBand="0" w:noVBand="1" w:val="04A0"/>
+      </w:tblPr>
+      <w:tblGrid>
+        <w:gridCol w:w="1949"/>
+        <w:gridCol w:w="1949"/>
+        <w:gridCol w:w="1949"/>
+        <w:gridCol w:w="1949"/>
+        <w:gridCol w:w="1949"/>
+      </w:tblGrid>
+      <w:tr>
+        <w:tc>
+          <w:tcPr>
+            <w:tcW w:type="dxa" w:w="1949"/>
+          </w:tcPr>
+          <w:p>
+            <w:r>
+              <w:rPr>
+                <w:b/>
+                <w:sz w:val="17"/>
+              </w:rPr>
+              <w:t>Release</w:t>
+            </w:r>
+          </w:p>
+        </w:tc>
+        <w:tc>
+          <w:tcPr>
+            <w:tcW w:type="dxa" w:w="1949"/>
+          </w:tcPr>
+          <w:p>
+            <w:r>
+              <w:rPr>
+                <w:b/>
+                <w:sz w:val="17"/>
+              </w:rPr>
+              <w:t>r with original, horizontal</w:t>
+            </w:r>
+          </w:p>
+        </w:tc>
+        <w:tc>
+          <w:tcPr>
+            <w:tcW w:type="dxa" w:w="1949"/>
+          </w:tcPr>
+          <w:p>
+            <w:r>
+              <w:rPr>
+                <w:b/>
+                <w:sz w:val="17"/>
+              </w:rPr>
+              <w:t>r with original, vertical</w:t>
+            </w:r>
+          </w:p>
+        </w:tc>
+        <w:tc>
+          <w:tcPr>
+            <w:tcW w:type="dxa" w:w="1949"/>
+          </w:tcPr>
+          <w:p>
+            <w:r>
+              <w:rPr>
+                <w:b/>
+                <w:sz w:val="17"/>
+              </w:rPr>
+              <w:t>r with gaze x</w:t>
+            </w:r>
+          </w:p>
+        </w:tc>
+        <w:tc>
+          <w:tcPr>
+            <w:tcW w:type="dxa" w:w="1949"/>
+          </w:tcPr>
+          <w:p>
+            <w:r>
+              <w:rPr>
+                <w:b/>
+                <w:sz w:val="17"/>
+              </w:rPr>
+              <w:t>r with gaze y</w:t>
+            </w:r>
+          </w:p>
+        </w:tc>
+      </w:tr>
+      <w:tr>
+        <w:tc>
+          <w:tcPr>
+            <w:tcW w:type="dxa" w:w="1949"/>
+          </w:tcPr>
+          <w:p>
+            <w:r>
+              <w:rPr>
+                <w:sz w:val="17"/>
+              </w:rPr>
+              <w:t>Unprocessed</w:t>
+            </w:r>
+          </w:p>
+        </w:tc>
+        <w:tc>
+          <w:tcPr>
+            <w:tcW w:type="dxa" w:w="1949"/>
+          </w:tcPr>
+          <w:p>
+            <w:r>
+              <w:rPr>
+                <w:sz w:val="17"/>
+              </w:rPr>
+              <w:t>1</w:t>
+            </w:r>
+          </w:p>
+        </w:tc>
+        <w:tc>
+          <w:tcPr>
+            <w:tcW w:type="dxa" w:w="1949"/>
+          </w:tcPr>
+          <w:p>
+            <w:r>
+              <w:rPr>
+                <w:sz w:val="17"/>
+              </w:rPr>
+              <w:t>1</w:t>
+            </w:r>
+          </w:p>
+        </w:tc>
+        <w:tc>
+          <w:tcPr>
+            <w:tcW w:type="dxa" w:w="1949"/>
+          </w:tcPr>
+          <w:p>
+            <w:r>
+              <w:rPr>
+                <w:sz w:val="17"/>
+              </w:rPr>
+              <w:t>0.87</w:t>
+            </w:r>
+          </w:p>
+        </w:tc>
+        <w:tc>
+          <w:tcPr>
+            <w:tcW w:type="dxa" w:w="1949"/>
+          </w:tcPr>
+          <w:p>
+            <w:r>
+              <w:rPr>
+                <w:sz w:val="17"/>
+              </w:rPr>
+              <w:t>0.56</w:t>
+            </w:r>
+          </w:p>
+        </w:tc>
+      </w:tr>
+      <w:tr>
+        <w:tc>
+          <w:tcPr>
+            <w:tcW w:type="dxa" w:w="1949"/>
+          </w:tcPr>
+          <w:p>
+            <w:r>
+              <w:rPr>
+                <w:sz w:val="17"/>
+              </w:rPr>
+              <w:t>SimSwap, Identity A</w:t>
+            </w:r>
+          </w:p>
+        </w:tc>
+        <w:tc>
+          <w:tcPr>
+            <w:tcW w:type="dxa" w:w="1949"/>
+          </w:tcPr>
+          <w:p>
+            <w:r>
+              <w:rPr>
+                <w:sz w:val="17"/>
+              </w:rPr>
+              <w:t>0.70</w:t>
+            </w:r>
+          </w:p>
+        </w:tc>
+        <w:tc>
+          <w:tcPr>
+            <w:tcW w:type="dxa" w:w="1949"/>
+          </w:tcPr>
+          <w:p>
+            <w:r>
+              <w:rPr>
+                <w:sz w:val="17"/>
+              </w:rPr>
+              <w:t>0.44</w:t>
+            </w:r>
+          </w:p>
+        </w:tc>
+        <w:tc>
+          <w:tcPr>
+            <w:tcW w:type="dxa" w:w="1949"/>
+          </w:tcPr>
+          <w:p>
+            <w:r>
+              <w:rPr>
+                <w:sz w:val="17"/>
+              </w:rPr>
+              <w:t>0.79</w:t>
+            </w:r>
+          </w:p>
+        </w:tc>
+        <w:tc>
+          <w:tcPr>
+            <w:tcW w:type="dxa" w:w="1949"/>
+          </w:tcPr>
+          <w:p>
+            <w:r>
+              <w:rPr>
+                <w:sz w:val="17"/>
+              </w:rPr>
+              <w:t>0.29</w:t>
+            </w:r>
+          </w:p>
+        </w:tc>
+      </w:tr>
+      <w:tr>
+        <w:tc>
+          <w:tcPr>
+            <w:tcW w:type="dxa" w:w="1949"/>
+          </w:tcPr>
+          <w:p>
+            <w:r>
+              <w:rPr>
+                <w:sz w:val="17"/>
+              </w:rPr>
+              <w:t>SimSwap, Identity B</w:t>
+            </w:r>
+          </w:p>
+        </w:tc>
+        <w:tc>
+          <w:tcPr>
+            <w:tcW w:type="dxa" w:w="1949"/>
+          </w:tcPr>
+          <w:p>
+            <w:r>
+              <w:rPr>
+                <w:sz w:val="17"/>
+              </w:rPr>
+              <w:t>0.70</w:t>
+            </w:r>
+          </w:p>
+        </w:tc>
+        <w:tc>
+          <w:tcPr>
+            <w:tcW w:type="dxa" w:w="1949"/>
+          </w:tcPr>
+          <w:p>
+            <w:r>
+              <w:rPr>
+                <w:sz w:val="17"/>
+              </w:rPr>
+              <w:t>0.44</w:t>
+            </w:r>
+          </w:p>
+        </w:tc>
+        <w:tc>
+          <w:tcPr>
+            <w:tcW w:type="dxa" w:w="1949"/>
+          </w:tcPr>
+          <w:p>
+            <w:r>
+              <w:rPr>
+                <w:sz w:val="17"/>
+              </w:rPr>
+              <w:t>0.83</w:t>
+            </w:r>
+          </w:p>
+        </w:tc>
+        <w:tc>
+          <w:tcPr>
+            <w:tcW w:type="dxa" w:w="1949"/>
+          </w:tcPr>
+          <w:p>
+            <w:r>
+              <w:rPr>
+                <w:sz w:val="17"/>
+              </w:rPr>
+              <w:t>0.28</w:t>
+            </w:r>
+          </w:p>
+        </w:tc>
+      </w:tr>
+      <w:tr>
+        <w:tc>
+          <w:tcPr>
+            <w:tcW w:type="dxa" w:w="1949"/>
+          </w:tcPr>
+          <w:p>
+            <w:r>
+              <w:rPr>
+                <w:sz w:val="17"/>
+              </w:rPr>
+              <w:t>FAMS</w:t>
+            </w:r>
+          </w:p>
+        </w:tc>
+        <w:tc>
+          <w:tcPr>
+            <w:tcW w:type="dxa" w:w="1949"/>
+          </w:tcPr>
+          <w:p>
+            <w:r>
+              <w:rPr>
+                <w:sz w:val="17"/>
+              </w:rPr>
+              <w:t>0.61</w:t>
+            </w:r>
+          </w:p>
+        </w:tc>
+        <w:tc>
+          <w:tcPr>
+            <w:tcW w:type="dxa" w:w="1949"/>
+          </w:tcPr>
+          <w:p>
+            <w:r>
+              <w:rPr>
+                <w:sz w:val="17"/>
+              </w:rPr>
+              <w:t>0.35</w:t>
+            </w:r>
+          </w:p>
+        </w:tc>
+        <w:tc>
+          <w:tcPr>
+            <w:tcW w:type="dxa" w:w="1949"/>
+          </w:tcPr>
+          <w:p>
+            <w:r>
+              <w:rPr>
+                <w:sz w:val="17"/>
+              </w:rPr>
+              <w:t>0.69</w:t>
+            </w:r>
+          </w:p>
+        </w:tc>
+        <w:tc>
+          <w:tcPr>
+            <w:tcW w:type="dxa" w:w="1949"/>
+          </w:tcPr>
+          <w:p>
+            <w:r>
+              <w:rPr>
+                <w:sz w:val="17"/>
+              </w:rPr>
+              <w:t>0.21</w:t>
+            </w:r>
+          </w:p>
+        </w:tc>
+      </w:tr>
+      <w:tr>
+        <w:tc>
+          <w:tcPr>
+            <w:tcW w:type="dxa" w:w="1949"/>
+          </w:tcPr>
+          <w:p>
+            <w:r>
+              <w:rPr>
+                <w:sz w:val="17"/>
+              </w:rPr>
+              <w:t>DeepPrivacy2 (face and full body)</w:t>
+            </w:r>
+          </w:p>
+        </w:tc>
+        <w:tc>
+          <w:tcPr>
+            <w:tcW w:type="dxa" w:w="1949"/>
+          </w:tcPr>
+          <w:p>
+            <w:r>
+              <w:rPr>
+                <w:sz w:val="17"/>
+              </w:rPr>
+              <w:t>≈ 0</w:t>
+            </w:r>
+          </w:p>
+        </w:tc>
+        <w:tc>
+          <w:tcPr>
+            <w:tcW w:type="dxa" w:w="1949"/>
+          </w:tcPr>
+          <w:p>
+            <w:r>
+              <w:rPr>
+                <w:sz w:val="17"/>
+              </w:rPr>
+              <w:t>≈ 0</w:t>
+            </w:r>
+          </w:p>
+        </w:tc>
+        <w:tc>
+          <w:tcPr>
+            <w:tcW w:type="dxa" w:w="1949"/>
+          </w:tcPr>
+          <w:p>
+            <w:r>
+              <w:rPr>
+                <w:sz w:val="17"/>
+              </w:rPr>
+              <w:t>0.06</w:t>
+            </w:r>
+          </w:p>
+        </w:tc>
+        <w:tc>
+          <w:tcPr>
+            <w:tcW w:type="dxa" w:w="1949"/>
+          </w:tcPr>
+          <w:p>
+            <w:r>
+              <w:rPr>
+                <w:sz w:val="17"/>
+              </w:rPr>
+              <w:t>0.05–0.07</w:t>
+            </w:r>
+          </w:p>
+        </w:tc>
+      </w:tr>
+    </w:tbl>
+    <w:p/>
+    <w:p>
+      <w:pPr>
+        <w:spacing w:after="120"/>
+      </w:pPr>
+      <w:r>
+        <w:rPr>
+          <w:b/>
+        </w:rPr>
+        <w:t>Table 10.</w:t>
+      </w:r>
+      <w:r>
+        <w:t xml:space="preserve"> Stream isolation: eyes-only and face-only models retrained on each release, five initialisations; penalty (cm, mean ± SD) against the same model trained on real data, paired within initialisation.</w:t>
+      </w:r>
+    </w:p>
+    <w:tbl>
+      <w:tblPr>
+        <w:tblStyle w:val="TableGrid"/>
+        <w:tblW w:type="auto" w:w="0"/>
+        <w:tblLook w:firstColumn="1" w:firstRow="1" w:lastColumn="0" w:lastRow="0" w:noHBand="0" w:noVBand="1" w:val="04A0"/>
+      </w:tblPr>
+      <w:tblGrid>
+        <w:gridCol w:w="3249"/>
+        <w:gridCol w:w="3249"/>
+        <w:gridCol w:w="3249"/>
+      </w:tblGrid>
+      <w:tr>
+        <w:tc>
+          <w:tcPr>
+            <w:tcW w:type="dxa" w:w="3249"/>
+          </w:tcPr>
+          <w:p>
+            <w:r>
+              <w:rPr>
+                <w:b/>
+                <w:sz w:val="17"/>
+              </w:rPr>
+              <w:t>Model (real-data error)</w:t>
+            </w:r>
+          </w:p>
+        </w:tc>
+        <w:tc>
+          <w:tcPr>
+            <w:tcW w:type="dxa" w:w="3249"/>
+          </w:tcPr>
+          <w:p>
+            <w:r>
+              <w:rPr>
+                <w:b/>
+                <w:sz w:val="17"/>
+              </w:rPr>
+              <w:t>Tested on real faces: SimSwap A / B / FAMS</w:t>
+            </w:r>
+          </w:p>
+        </w:tc>
+        <w:tc>
+          <w:tcPr>
+            <w:tcW w:type="dxa" w:w="3249"/>
+          </w:tcPr>
+          <w:p>
+            <w:r>
+              <w:rPr>
+                <w:b/>
+                <w:sz w:val="17"/>
+              </w:rPr>
+              <w:t>Tested on the release: SimSwap A / B / FAMS</w:t>
+            </w:r>
+          </w:p>
+        </w:tc>
+      </w:tr>
+      <w:tr>
+        <w:tc>
+          <w:tcPr>
+            <w:tcW w:type="dxa" w:w="3249"/>
+          </w:tcPr>
+          <w:p>
+            <w:r>
+              <w:rPr>
+                <w:sz w:val="17"/>
+              </w:rPr>
+              <w:t>Eyes-only MobileNet-V3 (4.95)</w:t>
+            </w:r>
+          </w:p>
+        </w:tc>
+        <w:tc>
+          <w:tcPr>
+            <w:tcW w:type="dxa" w:w="3249"/>
+          </w:tcPr>
+          <w:p>
+            <w:r>
+              <w:rPr>
+                <w:sz w:val="17"/>
+              </w:rPr>
+              <w:t xml:space="preserve">+2.71 ± 0.93 / +3.56 ± 0.39 / </w:t>
+            </w:r>
+            <w:r>
+              <w:rPr>
+                <w:b/>
+                <w:sz w:val="17"/>
+              </w:rPr>
+              <w:t>+1.16 ± 0.10</w:t>
+            </w:r>
+          </w:p>
+        </w:tc>
+        <w:tc>
+          <w:tcPr>
+            <w:tcW w:type="dxa" w:w="3249"/>
+          </w:tcPr>
+          <w:p>
+            <w:r>
+              <w:rPr>
+                <w:b/>
+                <w:sz w:val="17"/>
+              </w:rPr>
+              <w:t>+2.44 ± 0.36 / +1.98 ± 0.22</w:t>
+            </w:r>
+            <w:r>
+              <w:rPr>
+                <w:sz w:val="17"/>
+              </w:rPr>
+              <w:t xml:space="preserve"> / +2.72 ± 0.21</w:t>
+            </w:r>
+          </w:p>
+        </w:tc>
+      </w:tr>
+      <w:tr>
+        <w:tc>
+          <w:tcPr>
+            <w:tcW w:type="dxa" w:w="3249"/>
+          </w:tcPr>
+          <w:p>
+            <w:r>
+              <w:rPr>
+                <w:sz w:val="17"/>
+              </w:rPr>
+              <w:t>Eyes-only MGazeNet (5.14)</w:t>
+            </w:r>
+          </w:p>
+        </w:tc>
+        <w:tc>
+          <w:tcPr>
+            <w:tcW w:type="dxa" w:w="3249"/>
+          </w:tcPr>
+          <w:p>
+            <w:r>
+              <w:rPr>
+                <w:sz w:val="17"/>
+              </w:rPr>
+              <w:t xml:space="preserve">+4.79 ± 0.94 / +6.77 ± 0.56 / </w:t>
+            </w:r>
+            <w:r>
+              <w:rPr>
+                <w:b/>
+                <w:sz w:val="17"/>
+              </w:rPr>
+              <w:t>+0.96 ± 0.27</w:t>
+            </w:r>
+          </w:p>
+        </w:tc>
+        <w:tc>
+          <w:tcPr>
+            <w:tcW w:type="dxa" w:w="3249"/>
+          </w:tcPr>
+          <w:p>
+            <w:r>
+              <w:rPr>
+                <w:sz w:val="17"/>
+              </w:rPr>
+              <w:t xml:space="preserve">+2.83 ± 0.38 / +2.95 ± 0.12 / </w:t>
+            </w:r>
+            <w:r>
+              <w:rPr>
+                <w:b/>
+                <w:sz w:val="17"/>
+              </w:rPr>
+              <w:t>+2.04 ± 0.17</w:t>
+            </w:r>
+          </w:p>
+        </w:tc>
+      </w:tr>
+      <w:tr>
+        <w:tc>
+          <w:tcPr>
+            <w:tcW w:type="dxa" w:w="3249"/>
+          </w:tcPr>
+          <w:p>
+            <w:r>
+              <w:rPr>
+                <w:sz w:val="17"/>
+              </w:rPr>
+              <w:t>Face-only MobileViT (5.29)</w:t>
+            </w:r>
+          </w:p>
+        </w:tc>
+        <w:tc>
+          <w:tcPr>
+            <w:tcW w:type="dxa" w:w="3249"/>
+          </w:tcPr>
+          <w:p>
+            <w:r>
+              <w:rPr>
+                <w:sz w:val="17"/>
+              </w:rPr>
+              <w:t xml:space="preserve">+4.51 ± 0.40 / +3.87 ± 0.59 / </w:t>
+            </w:r>
+            <w:r>
+              <w:rPr>
+                <w:b/>
+                <w:sz w:val="17"/>
+              </w:rPr>
+              <w:t>+1.44 ± 0.26</w:t>
+            </w:r>
+          </w:p>
+        </w:tc>
+        <w:tc>
+          <w:tcPr>
+            <w:tcW w:type="dxa" w:w="3249"/>
+          </w:tcPr>
+          <w:p>
+            <w:r>
+              <w:rPr>
+                <w:sz w:val="17"/>
+              </w:rPr>
+              <w:t xml:space="preserve">+3.67 ± 0.16 / +2.98 ± 0.33 / </w:t>
+            </w:r>
+            <w:r>
+              <w:rPr>
+                <w:b/>
+                <w:sz w:val="17"/>
+              </w:rPr>
+              <w:t>+2.24 ± 0.29</w:t>
+            </w:r>
+          </w:p>
+        </w:tc>
+      </w:tr>
+    </w:tbl>
+    <w:p/>
+    <w:p>
+      <w:pPr>
+        <w:spacing w:after="120"/>
+      </w:pPr>
+      <w:r>
+        <w:rPr>
+          <w:b/>
+        </w:rPr>
         <w:t>Releasing eye geometry instead of pixels does not escape the trade-off.</w:t>
       </w:r>
       <w:r>
@@ -5815,7 +7626,7 @@
         <w:rPr>
           <w:b/>
         </w:rPr>
-        <w:t>Table 7.</w:t>
+        <w:t>Table 11.</w:t>
       </w:r>
       <w:r>
         <w:t xml:space="preserve"> Releasing FaceMesh eye geometry instead of pixels: gaze error of gradient-boosted regressors (no per-participant calibration) and release-only privacy of the released features, with 95% participant-level intervals.</w:t>
@@ -6252,7 +8063,7 @@
         <w:t>Privacy against utility for every protocol tested.</w:t>
       </w:r>
       <w:r>
-        <w:t xml:space="preserve"> Horizontal: gaze-error penalty of a model retrained on the release and deployed on real faces (mean of three architectures). Vertical: release-only linkage, the ARI at k = 18 of the most linkable crop the release contains (face or eye ROI). Circles: Full Synthetic; squares: Hybrid (original eyes); star: unprocessed data. Dashed red: no-information reference (predicting the mean gaze point); dashed grey: linkage floor. The shaded corner — private and useful — contains no protocol. Hybrid sits at the utility of real data and the linkage of real data; SimSwap and DeepPrivacy2 Full Synthetic lose most of the gaze signal and none of the linkage. The single point that leaves the top row (DeepPrivacy2 full body with a fresh identity per frame, ARI 0.297) is one on which a retrained gaze model learns nothing (+4.34 cm, at the no-information reference). Restoring the original eyes to it (square 13) recovers the utility and, with it, the linkage (0.849). The diffusion anonymiser (circle 14) is the one full-synthesis release near the utility of real data (+0.94 cm, against +3.83 for SimSwap A and +4.51 for DeepPrivacy2), and its face crop keeps it in the linkable region (0.853). Diamonds: releasing FaceMesh eye geometry instead of pixels — the least linkable tier (four iris coordinates, ARI 0.267) is also near the no-information level.</w:t>
+        <w:t xml:space="preserve"> Horizontal: gaze-error penalty of a model retrained on the release and deployed on real faces (mean of three architectures). Vertical: release-only linkage, the ARI at k = 18 of the most linkable crop the release contains (face or eye ROI). Circles: Full Synthetic; squares: Hybrid (original eyes); star: unprocessed data. Dashed red: no-information reference (predicting the mean gaze point); dashed grey: linkage floor. The shaded corner — private and useful — contains no protocol. Hybrid sits at the utility of real data and the linkage of real data; SimSwap and DeepPrivacy2 Full Synthetic lose most of the gaze signal and none of the linkage. The single point that leaves the top row (DeepPrivacy2 full body with a fresh identity per frame, ARI 0.297) is one on which a retrained gaze model learns nothing (+4.34 cm, at the no-information reference). Restoring the original eyes to it (square 13) recovers the utility and, with it, the linkage (0.849). The diffusion anonymiser (circle 14) is the one full-synthesis release near the utility of real data (+0.94 cm, against +3.83 for SimSwap A and +4.51 for DeepPrivacy2) — because models trained on it transfer to real eyes, not because its pupils carry more gaze (§8.3) — and its face crop keeps it in the linkable region (0.853). Diamonds: releasing FaceMesh eye geometry instead of pixels — the least linkable tier (four iris coordinates, ARI 0.267) is also near the no-information level.</w:t>
       </w:r>
     </w:p>
     <w:p>
@@ -6263,7 +8074,7 @@
         <w:rPr>
           <w:b/>
         </w:rPr>
-        <w:t>Table 8.</w:t>
+        <w:t>Table 12.</w:t>
       </w:r>
       <w:r>
         <w:t xml:space="preserve"> iTracker under the three conditions, one initialisation in condition (i). Penalty (cm) against its five-draw real-data baseline of 5.85 cm; predicting the mean corresponds to +3.52 cm.</w:t>
@@ -6829,7 +8640,7 @@
         <w:spacing w:after="120"/>
       </w:pPr>
       <w:r>
-        <w:t>A centimetre figure on its own does not say whether a protocol is usable; it has to be set against what each biomarker needs to resolve. Tables 3–6 report the uncalibrated error, which is the right quantity for comparing arms, because holding calibration out isolates the effect of the imagery. It is the wrong quantity for asking whether the instrument is clinically usable, because a deployed screening tool calibrates each user. With per-participant calibration the same four architectures reach 3.70–5.11 cm on real data, which at the 80–120 cm viewing distance of our protocol is 1.8–3.7°.</w:t>
+        <w:t>A centimetre figure on its own does not say whether a protocol is usable; it has to be set against what each biomarker needs to resolve. Tables 5–8 report the uncalibrated error, which is the right quantity for comparing arms, because holding calibration out isolates the effect of the imagery. It is the wrong quantity for asking whether the instrument is clinically usable, because a deployed screening tool calibrates each user. With per-participant calibration the same four architectures reach 3.70–5.11 cm on real data, which at the 80–120 cm viewing distance of our protocol is 1.8–3.7°.</w:t>
       </w:r>
     </w:p>
     <w:p>
@@ -6840,7 +8651,7 @@
         <w:rPr>
           <w:b/>
         </w:rPr>
-        <w:t>Table 9.</w:t>
+        <w:t>Table 13.</w:t>
       </w:r>
       <w:r>
         <w:t xml:space="preserve"> What each oculomotor biomarker must resolve, against the calibrated error of 1.8–3.7°. Requirements are derived from published normative ranges.</w:t>
@@ -7215,7 +9026,7 @@
         <w:rPr>
           <w:b/>
         </w:rPr>
-        <w:t>Table 10.</w:t>
+        <w:t>Table 14.</w:t>
       </w:r>
       <w:r>
         <w:t xml:space="preserve"> Calibrated error per release protocol, in centimetres and in degrees of visual angle at 120 and 80 cm, as ranges over the four architectures.</w:t>
@@ -7420,7 +9231,7 @@
         <w:spacing w:after="120"/>
       </w:pPr>
       <w:r>
-        <w:t>Webcam-based eye tracking validated on clinically relevant saccade and free-viewing paradigms reports about 1.42° mean error [webcamval]. That figure is obtained after careful per-user calibration, so the like-for-like comparison is with our calibrated 1.8–3.7°, not with the uncalibrated numbers in Table 3; on that basis the two sit in the same regime, with ours somewhat coarser.</w:t>
+        <w:t>Webcam-based eye tracking validated on clinically relevant saccade and free-viewing paradigms reports about 1.42° mean error [webcamval]. That figure is obtained after careful per-user calibration, so the like-for-like comparison is with our calibrated 1.8–3.7°, not with the uncalibrated numbers in Table 5; on that basis the two sit in the same regime, with ours somewhat coarser.</w:t>
       </w:r>
     </w:p>
     <w:p>
@@ -7461,10 +9272,10 @@
         <w:rPr>
           <w:b/>
         </w:rPr>
-        <w:t>The operative threat is release-only linkage, and it lives outside the edit domain.</w:t>
-      </w:r>
-      <w:r>
-        <w:t xml:space="preserve"> An attacker holding photographs of participants is defeated by every full-synthesis method we tested (A1 at or near the floor). An attacker holding only the release is not: the same synthetic eye crops that score 0.2% against photographs verify at 43% within the release, and face crops partition exactly by participant. The channels that carry this — hair and skin at the crop border, head pose, crop geometry, illumination — are left alone by inner-face editing, and two of them need no face model at all: crop dimensions alone identify 66.7% of participants, photometric statistics alone link at ARI 0.87–0.90. A privacy number reported without its attacker therefore cannot tell a dataset author whether a release is safe.</w:t>
+        <w:t>Re-identification survives on the face crop; linkability survives everywhere.</w:t>
+      </w:r>
+      <w:r>
+        <w:t xml:space="preserve"> Synthesising the eyes defeats an attacker holding the participants' photographs on the eye crops — A1 is at the floor for every full-synthesis method — but not on the face crop: SimSwap's and FAMS's synthetic faces still verify against the participant's own photographs at 18–24% TAR under ArcFace, against a 1.6% floor, and only DeepPrivacy2, which repaints the face, reaches the floor. Linkability is harder still: the same synthetic eye crops that score 0.2% against photographs verify at 43% within the release, and face crops partition exactly by participant. Under the European test for anonymisation, being able to single out each participant's records is enough for a release to remain personal data, whether or not anyone is named [wp29anon]. The channels that carry this — hair and skin at the crop border, head pose, crop geometry, illumination — are left alone by inner-face editing, and two of them need no face model at all: crop dimensions alone identify 66.7% of participants, photometric statistics alone link at ARI 0.87–0.90. A privacy number reported without its attacker therefore cannot tell a dataset author whether a release is safe.</w:t>
       </w:r>
     </w:p>
     <w:p>
@@ -7487,7 +9298,7 @@
         <w:t>and</w:t>
       </w:r>
       <w:r>
-        <w:t xml:space="preserve"> the release contains nothing the generator leaves untouched. We observed each half separately. The diffusion anonymiser breaks per-participant consistency by construction and keeps most of the gaze signal — models retrained on it lose 0.4–1.3 cm on real faces where SimSwap loses 2.5–6.2 — but leaves the face crop linkable (ARI 0.85–0.94). Full-body inpainting with a fresh identity per frame meets both halves and breaks discovery of the cohort (face-crop ARI 0.297), but it repaints the eyes, and a gaze model trained on it learns nothing. Even there, an attacker with a few labelled frames per person still verifies 36% of them: the condition blocks discovery, not verification. What a releasable gaze corpus would need is therefore specific: a generator that preserves the ocular geometry the way the diffusion anonymiser does, edits everything the released crop contains, and resamples identity per recording session rather than per frame — per-frame resampling breaks the temporal coherence gaze pipelines rely on, and per-session resampling cannot be verified on a single-session corpus like ours. We know of no method that meets all three.</w:t>
+        <w:t xml:space="preserve"> the release contains nothing the generator leaves untouched; it matters for releases that strip participant identifiers, since one that keeps them is linkable by construction. We observed each half separately. The diffusion anonymiser breaks per-participant consistency by construction and yields models that transfer to real faces — though its pupils carry less gaze than SimSwap's — but leaves the face crop linkable (ARI 0.85–0.94) and, under ArcFace, verifiable against the participant's photographs. Full-body inpainting with a fresh identity per frame meets both halves and breaks discovery of the cohort (face-crop ARI 0.297), but it repaints the eyes, and a gaze model trained on it learns nothing. Even there, an attacker with a few labelled frames per person still verifies 36% of them: the condition blocks discovery, not verification. What a releasable gaze corpus would need is therefore specific: a generator that keeps the pupil at least as faithfully as face swapping does, produces eyes from which models transfer to real users as the diffusion anonymiser's do, edits everything the released crop contains, and resamples identity per recording session rather than per frame — per-frame resampling breaks the temporal coherence gaze pipelines rely on, and per-session resampling cannot be verified on a single-session corpus like ours. We know of no method that meets all four.</w:t>
       </w:r>
     </w:p>
     <w:p>
@@ -7501,7 +9312,7 @@
         <w:t>Utility has to be measured the way the release will be used.</w:t>
       </w:r>
       <w:r>
-        <w:t xml:space="preserve"> Deploying a model trained on real data on de-identified crops conflates two things that retraining separates. For inpainting, most of the deployment penalty is domain shift, yet what remains after retraining is the no-information level: the repainted eyes carry no recoverable gaze. For face swapping the penalty survives retraining, and for one architecture a model trained on the swapped release is worse than predicting the mean on real faces. A utility figure for a released gaze corpus should therefore come from models trained on the release and tested on real faces, reported beside the error of predicting the mean gaze point.</w:t>
+        <w:t xml:space="preserve"> Deploying a model trained on real data on de-identified crops conflates two things that retraining separates. For inpainting, most of the deployment penalty is domain shift, yet what remains after retraining is the no-information level: the repainted eyes carry no recoverable gaze. For face swapping the penalty survives retraining, and for one architecture a model trained on the swapped release is worse than predicting the mean on real faces. A utility figure for a released gaze corpus should therefore come from models trained on the release and tested on real faces, reported beside the error of predicting the mean gaze point — and the pupil should be checked directly, because transfer and information can diverge: the release that transfers best carries less pupil signal than the one that transfers worst.</w:t>
       </w:r>
     </w:p>
     <w:p>
@@ -7515,7 +9326,7 @@
         <w:t>What this means for releasing gaze data now.</w:t>
       </w:r>
       <w:r>
-        <w:t xml:space="preserve"> None of the protocols we measured makes a smartphone gaze corpus safe for open deposit, so CognitiveGaze is shared under controlled access, with derived gaze traces in an open tier whose own linkage we measured rather than assumed (ARI 0.033, low but not zero). We release the measurements as a tool, </w:t>
+        <w:t xml:space="preserve"> None of the protocols we measured makes a smartphone gaze corpus anonymous in the European sense: a usable release keeps each participant's frames together, so it is linkable by construction, and every gaze-preserving protocol also leaves residual re-identification on the face or eye crops. CognitiveGaze is therefore shared under controlled access, with derived gaze traces in an open tier whose own linkage we measured rather than assumed (ARI 0.033, low but not zero). We release the measurements as a tool, </w:t>
       </w:r>
       <w:r>
         <w:rPr>
@@ -7548,7 +9359,7 @@
         <w:spacing w:after="120"/>
       </w:pPr>
       <w:r>
-        <w:t>Table 11 distils the results into seven guidelines for authors of appearance-based gaze datasets, each with the evidence behind it and how to check it. The full fifteen-item checklist and the audit tool are in the supplementary material [privaudit-repo].</w:t>
+        <w:t>Table 15 distils the results into seven guidelines for authors of appearance-based gaze datasets, each with the evidence behind it and how to check it. The full fifteen-item checklist and the audit tool are in the supplementary material [privaudit-repo].</w:t>
       </w:r>
     </w:p>
     <w:p>
@@ -7559,7 +9370,7 @@
         <w:rPr>
           <w:b/>
         </w:rPr>
-        <w:t>Table 11.</w:t>
+        <w:t>Table 15.</w:t>
       </w:r>
       <w:r>
         <w:t xml:space="preserve"> Design guidelines for releasing gaze data.</w:t>
@@ -7659,26 +9470,13 @@
                 <w:b/>
                 <w:sz w:val="17"/>
               </w:rPr>
-              <w:t>Name both attackers and run both.</w:t>
-            </w:r>
-            <w:r>
-              <w:rPr>
-                <w:sz w:val="17"/>
-              </w:rPr>
-              <w:t xml:space="preserve"> Report re-identification from photographs (A1) </w:t>
-            </w:r>
-            <w:r>
-              <w:rPr>
-                <w:i/>
-                <w:sz w:val="17"/>
-              </w:rPr>
-              <w:t>and</w:t>
-            </w:r>
-            <w:r>
-              <w:rPr>
-                <w:sz w:val="17"/>
-              </w:rPr>
-              <w:t xml:space="preserve"> linkage within the release (A2).</w:t>
+              <w:t>Report re-identification on every released stream, and test linkability.</w:t>
+            </w:r>
+            <w:r>
+              <w:rPr>
+                <w:sz w:val="17"/>
+              </w:rPr>
+              <w:t xml:space="preserve"> Run A1 against photographs on each stream, face crop included, and report whether the content singles out participants (A2) as the anonymisation test.</w:t>
             </w:r>
           </w:p>
         </w:tc>
@@ -7691,7 +9489,7 @@
               <w:rPr>
                 <w:sz w:val="17"/>
               </w:rPr>
-              <w:t>Identical synthetic eye crops: 0.2% under A1, 43% under A2.</w:t>
+              <w:t>Synthetic eye crops: 0.2% under A1, 43% under A2; synthetic face crops still 18–24% under A1.</w:t>
             </w:r>
           </w:p>
         </w:tc>
@@ -7977,13 +9775,13 @@
                 <w:b/>
                 <w:sz w:val="17"/>
               </w:rPr>
-              <w:t>Measure utility by training on the release.</w:t>
-            </w:r>
-            <w:r>
-              <w:rPr>
-                <w:sz w:val="17"/>
-              </w:rPr>
-              <w:t xml:space="preserve"> Test on real faces, and report the predict-the-mean error beside it.</w:t>
+              <w:t>Measure utility by training on the release, and check the pupil directly.</w:t>
+            </w:r>
+            <w:r>
+              <w:rPr>
+                <w:sz w:val="17"/>
+              </w:rPr>
+              <w:t xml:space="preserve"> Test on real faces, report the predict-the-mean error beside it, and measure whether the released pupil still follows true gaze.</w:t>
             </w:r>
           </w:p>
         </w:tc>
@@ -7996,7 +9794,7 @@
               <w:rPr>
                 <w:sz w:val="17"/>
               </w:rPr>
-              <w:t>Deployment-only penalties of +10–15 cm shrink to the no-information level after retraining; SimSwap can be worse than the mean.</w:t>
+              <w:t>Deployment-only penalties of +10–15 cm shrink to the no-information level after retraining; FAMS transfers best yet its pupils track gaze less closely than SimSwap's (17/17 participants).</w:t>
             </w:r>
           </w:p>
         </w:tc>
@@ -8090,7 +9888,7 @@
         <w:spacing w:after="120"/>
       </w:pPr>
       <w:r>
-        <w:t>Five constraints bound these conclusions. Participants were recorded in a single session. We attacked the resulting confound directly — photometric normalisation and a large within-session illumination change both leave the linkage intact — so the recogniser is not exploiting imaging conditions. But the dissociation is partial: changing the screen does not change the ambient lamp, the camera position or the seating, and "this participant's skin tone under this lamp" cannot be separated from "this recording's exposure" without a second session. That also bounds the photometric attack we report, which is high precisely because the two are confounded. The longitudinal tracking that makes linkage consequential is itself the cross-session case, so a second recording remains the decisive experiment and we did not run one. The cohort is 18 healthy adults, moderately homogeneous in ethnicity and age and recruited from a single institution, so we make no claim about clinical populations and describe the contribution as an evaluation of dataset release rather than of home screening. Privacy is measured with two recogniser families, both trained on web-scale face corpora. The structural claim is tested on one replacement method (two templates), one removal method in two modes and one diffusion method; methods editing in diffusion latent space are untested. Full-body DeepPrivacy2 ran without its generator for persons that DensePose fails to map (the weights are no longer distributed). The participant was mapped and repainted in every frame; in 1.4% of frames a second person region took the unmapped path and was left unedited, outside the released crops. On footage with more people, or people DensePose cannot map, that path would release them unedited. Retraining on the release was run with five initialisations for three architectures and one for iTracker (about 9 h per fold); FAMS was retrained on the three faster architectures only.</w:t>
+        <w:t>Five constraints bound these conclusions. Participants were recorded in a single session. We attacked the resulting confound directly — photometric normalisation and a large within-session illumination change both leave the linkage intact — so the recogniser is not exploiting imaging conditions. But the dissociation is partial: changing the screen does not change the ambient lamp, the camera position or the seating, and "this participant's skin tone under this lamp" cannot be separated from "this recording's exposure" without a second session. That also bounds the photometric attack we report, which is high precisely because the two are confounded. The longitudinal tracking that makes linkage consequential is itself the cross-session case, so a second recording remains the decisive experiment and we did not run one. The cohort is 18 healthy adults, moderately homogeneous in ethnicity and age and recruited from a single institution, so we make no claim about clinical populations and describe the contribution as an evaluation of dataset release rather than of home screening. Privacy is measured with two recogniser families, both trained on web-scale face corpora, and they can disagree: FaceNet places the FAMS face crop at its floor where ArcFace does not. Recognition by people who know the participants — who use hairstyle, glasses and face shape, which FAMS preserves — was not measured. The structural claim is tested on one replacement method (two templates), one removal method in two modes and one diffusion method; methods editing in diffusion latent space are untested. Full-body DeepPrivacy2 ran without its generator for persons that DensePose fails to map (the weights are no longer distributed). The participant was mapped and repainted in every frame; in 1.4% of frames a second person region took the unmapped path and was left unedited, outside the released crops. On footage with more people, or people DensePose cannot map, that path would release them unedited. Retraining on the release was run with five initialisations for three architectures and one for iTracker (about 9 h per fold); FAMS was retrained on the three faster architectures only.</w:t>
       </w:r>
     </w:p>
     <w:p>

</xml_diff>

<commit_message>
Abstract cut to 258 words; highlighted-changes Word version vs 2026-10-15
Co-Authored-By: Claude Opus 5.5 <noreply@anthropic.com>
Claude-Session: https://claude.ai/code/session_01J7Eoy7KDxWK2PLKxYcPUkj
</commit_message>
<xml_diff>
--- a/results/paper/MANUSCRIPT.docx
+++ b/results/paper/MANUSCRIPT.docx
@@ -23,7 +23,7 @@
         <w:spacing w:after="120"/>
       </w:pPr>
       <w:r>
-        <w:t>Smartphone eye tracking moves oculomotor assessment out of the clinic, but what it records is video of the participant's face — which is what blocks the dataset sharing the field depends on. Face swapping has been proposed to make such video shareable, and has been evaluated by whether the swapped face still matches the real one and how much gaze or behaviour survives. Neither evaluation asks whether the release can be linked to itself without any outside reference, or what a gaze model trained on the release is worth. We measure both.</w:t>
+        <w:t>Smartphone eye tracking moves oculomotor assessment out of the clinic, but it records video of the participant's face, which blocks the dataset sharing the field depends on. Face de-identification has been proposed as the remedy and judged by whether the de-identified face still matches the real one. We measure what such a release protects and what a gaze model trained on it is worth.</w:t>
       </w:r>
     </w:p>
     <w:p>
@@ -31,7 +31,7 @@
         <w:spacing w:after="120"/>
       </w:pPr>
       <w:r>
-        <w:t>We introduce CognitiveGaze: 18 participants, seven oculomotor tasks, recorded simultaneously by a smartphone and an EyeLink 1000, so every smartphone frame carries a physiological ground-truth gaze coordinate rather than a screen-target label. Utility is measured by deploying four gaze architectures on de-identified crops and by retraining three of them on the de-identified release. Privacy is measured on the released crops themselves, with pretrained recognisers, two attacker models, and a control establishing what "no identity signal" scores on single-session data.</w:t>
+        <w:t>We introduce CognitiveGaze: 18 participants performing seven oculomotor tasks, recorded simultaneously by a smartphone and an EyeLink 1000, so every frame carries physiological ground-truth gaze. We evaluate face swapping, inpainting and diffusion de-identification with four gaze architectures, deployed on and retrained on each release, and with two face recognisers.</w:t>
       </w:r>
     </w:p>
     <w:p>
@@ -39,7 +39,7 @@
         <w:spacing w:after="120"/>
       </w:pPr>
       <w:r>
-        <w:t>The axes do not trade as assumed. Retaining the genuine ocular region recovers 85–101% of the synthesis penalty in every architecture, and 91–106% when the models are retrained on the release — yet those same crops verify identity at 62–80% TAR at FAR 1e-3 against a measured 1.6% floor, under two unrelated recognisers. The eye pixels that make gaze estimation work are the pixels that identify. Full synthesis breaks the link between the released eye crops and the real face, but the synthetic face crop still verifies against the participant's own photographs (18–24% TAR under ArcFace), retraining leaves a 2.2–6.2 cm cost, and the release still singles out every participant: an unsupervised partition recovers exactly the 18 individuals, even from a 120 px ocular crop containing no hair, ears, clothing or face outline. Removal by inpainting fares worse: a model retrained on it is no better than predicting the screen centre. A diffusion anonymiser yields models that transfer to real faces far better (0.4–1.3 cm against 2.5–6.2 cm), but not because it keeps more gaze: its pupils follow true gaze less closely than SimSwap's, and stronger settings trade pupil signal for identity protection without reducing linkability. Releasing eye landmarks instead of pixels links too and carries almost no gaze signal. A usable gaze corpus must keep each participant's frames together, so it is linkable by construction; within the content, the one configuration that breaks linkage — repainting the whole person with a fresh identity every frame — is one on which a retrained gaze model learns nothing. We state what a releasable gaze corpus would require, and report what our own tiered release leaks when measured rather than assumed.</w:t>
+        <w:t>Retaining the genuine eye region recovers 85–106% of the accuracy lost to synthesis, yet those eye crops verify identity at 62–80% against a 1.6% floor: the eye pixels that make gaze estimation work are the pixels that identify. Synthesising the eyes defeats matching on the eye crops, but synthetic face crops still verify at 18–24%, and every release that retains gaze information still singles out each participant, which under European anonymisation guidance leaves it personal data. Inpainted eyes carry no recoverable gaze. A diffusion anonymiser yields the models that transfer best to real faces (0.4–1.3 cm against 2.5–6.2 cm), but its pupils follow true gaze less closely than face-swapped ones, and stronger settings trade pupil signal for identity without reducing linkability. No configuration we tested is both private and useful. We state what a releasable gaze corpus requires and release an audit tool and checklist.</w:t>
       </w:r>
     </w:p>
     <w:p>

</xml_diff>

<commit_message>
Clarify photometry paragraphs: recogniser does not depend on photometry; photometry links independently
Co-Authored-By: Claude Opus 5.5 <noreply@anthropic.com>
Claude-Session: https://claude.ai/code/session_01J7Eoy7KDxWK2PLKxYcPUkj
</commit_message>
<xml_diff>
--- a/results/paper/MANUSCRIPT.docx
+++ b/results/paper/MANUSCRIPT.docx
@@ -1637,7 +1637,7 @@
         <w:t>person</w:t>
       </w:r>
       <w:r>
-        <w:t xml:space="preserve"> rather than of the room. We therefore attack that channel directly. Removing per-crop brightness and contrast entirely leaves the linkage intact (ARI 0.684 → 0.742 on the swapped left eye; verification 62.2% → 73.0% on the right), local histogram equalisation costs 0.05–0.14 without collapsing it, and a large within-session illumination change — gallery from the dark-screen stimulus blocks, probe from the natural-image blocks — leaves it intact and raises it to 0.918 / 0.931 on unmodified crops. The recogniser is therefore not relying on photometry.</w:t>
+        <w:t xml:space="preserve"> rather than of the room. We therefore attack that channel directly. Removing per-crop brightness and contrast entirely leaves the linkage intact (ARI 0.684 → 0.742 on the swapped left eye; verification 62.2% → 73.0% on the right), local histogram equalisation costs 0.05–0.14 without collapsing it, and a large within-session illumination change — gallery from the dark-screen stimulus blocks, probe from the natural-image blocks — leaves it intact and raises it to 0.918 / 0.931 on unmodified crops. The recogniser's linkage therefore does not depend on photometry: with brightness, contrast and colour cast removed, it still separates the participants.</w:t>
       </w:r>
     </w:p>
     <w:p>
@@ -1648,10 +1648,10 @@
         <w:rPr>
           <w:b/>
         </w:rPr>
-        <w:t>Photometry is nonetheless a second, independent linkage channel.</w:t>
-      </w:r>
-      <w:r>
-        <w:t xml:space="preserve"> Twenty-one summary statistics per crop — per-channel means, percentiles, white-balance ratios, dynamic range, no structure at all — recover the participants at </w:t>
+        <w:t>Photometry also links on its own, as a separate channel.</w:t>
+      </w:r>
+      <w:r>
+        <w:t xml:space="preserve"> The converse holds as well: photometry does not need the recogniser. Twenty-one summary statistics per crop — per-channel means, percentiles, white-balance ratios, dynamic range, no structure at all — recover the participants at </w:t>
       </w:r>
       <w:r>
         <w:rPr>
@@ -1660,7 +1660,7 @@
         <w:t>ARI 0.87–0.90</w:t>
       </w:r>
       <w:r>
-        <w:t xml:space="preserve"> with no face model whatsoever, and identity replacement does not touch this channel: 0.898 / 0.901 on swapped crops against 0.870 / 0.902 on originals. A release that does not normalise crop photometry is linkable without any recogniser at all.</w:t>
+        <w:t xml:space="preserve"> with no face model whatsoever, and identity replacement does not touch this channel: 0.898 / 0.901 on swapped crops against 0.870 / 0.902 on originals. On single-session data this channel mixes the person with the recording (§11). The two channels are independent, so closing one leaves the other: normalising crop photometry removes this channel but not the recogniser's, and a release that does not normalise it is linkable without any recogniser at all.</w:t>
       </w:r>
     </w:p>
     <w:p>

</xml_diff>

<commit_message>
Name the four train-test conditions R->R, R->D, D->R, D->D; R->R stated as the reference; figure S1 relabelled
Co-Authored-By: Claude Opus 5.5 <noreply@anthropic.com>
Claude-Session: https://claude.ai/code/session_01J7Eoy7KDxWK2PLKxYcPUkj
</commit_message>
<xml_diff>
--- a/results/paper/MANUSCRIPT.docx
+++ b/results/paper/MANUSCRIPT.docx
@@ -366,7 +366,7 @@
         <w:t>CognitiveGaze, and a four-architecture utility benchmark under de-identification.</w:t>
       </w:r>
       <w:r>
-        <w:t xml:space="preserve"> 18 participants, smartphone and EyeLink 1000 recorded simultaneously across seven oculomotor tasks. We report the utility cost of both de-identification protocols, for two de-identification families, under three conditions — trained on real data and deployed on the de-identified crops, and retrained on the de-identified release then tested on real or on de-identified faces — against a measured initialisation noise floor and a predict-the-mean reference that marks where a model has learned no gaze at all, including a face-only positive control that isolates whether a model's ocular stream is active at all.</w:t>
+        <w:t xml:space="preserve"> 18 participants, smartphone and EyeLink 1000 recorded simultaneously across seven oculomotor tasks. We report the utility cost of both de-identification protocols, for two de-identification families, under three train–test conditions besides the real-data reference — trained on real data and deployed on the de-identified crops, and retrained on the de-identified release then tested on real or on de-identified faces — against a measured initialisation noise floor and a predict-the-mean reference that marks where a model has learned no gaze at all, including a face-only positive control that isolates whether a model's ocular stream is active at all.</w:t>
       </w:r>
     </w:p>
     <w:p>
@@ -3751,46 +3751,66 @@
         <w:rPr>
           <w:b/>
         </w:rPr>
-        <w:t>Three conditions.</w:t>
-      </w:r>
-      <w:r>
-        <w:t xml:space="preserve"> A utility number answers a question only once it says who trained the model on what. We report three. In </w:t>
-      </w:r>
+        <w:t>Four train–test conditions.</w:t>
+      </w:r>
+      <w:r>
+        <w:t xml:space="preserve"> A utility number answers a question only once it says what the model was trained on and what it was tested on. We cross the two and name each condition train→test, with R for real and D for de-identified data:</w:t>
+      </w:r>
+    </w:p>
+    <w:p>
+      <w:pPr>
+        <w:pStyle w:val="ListBullet"/>
+      </w:pPr>
       <w:r>
         <w:rPr>
           <w:b/>
         </w:rPr>
-        <w:t>condition (ii)</w:t>
-      </w:r>
-      <w:r>
-        <w:t xml:space="preserve">, models trained on real data are deployed on de-identified crops: the cost to a pipeline that receives de-identified input. In </w:t>
-      </w:r>
+        <w:t>R→R</w:t>
+      </w:r>
+      <w:r>
+        <w:t xml:space="preserve"> — trained and tested on real data. This is the reference: every penalty below is the difference from the same model's R→R error.</w:t>
+      </w:r>
+    </w:p>
+    <w:p>
+      <w:pPr>
+        <w:pStyle w:val="ListBullet"/>
+      </w:pPr>
       <w:r>
         <w:rPr>
           <w:b/>
         </w:rPr>
-        <w:t>condition (i)</w:t>
-      </w:r>
-      <w:r>
-        <w:t xml:space="preserve">, models are retrained on the de-identified release, with the same recipe, participant partition and hyperparameters as the real-data models, and tested either on </w:t>
-      </w:r>
+        <w:t>R→D</w:t>
+      </w:r>
+      <w:r>
+        <w:t xml:space="preserve"> — trained on real data, deployed on de-identified crops: the cost to a pipeline that receives de-identified input.</w:t>
+      </w:r>
+    </w:p>
+    <w:p>
+      <w:pPr>
+        <w:pStyle w:val="ListBullet"/>
+      </w:pPr>
       <w:r>
         <w:rPr>
           <w:b/>
         </w:rPr>
-        <w:t>real faces</w:t>
-      </w:r>
-      <w:r>
-        <w:t xml:space="preserve"> — a third party training on the released corpus and deploying the model on its own users — or on </w:t>
-      </w:r>
+        <w:t>D→R</w:t>
+      </w:r>
+      <w:r>
+        <w:t xml:space="preserve"> — retrained on the de-identified release and tested on real faces: a third party training on the released corpus and deploying the model on its own users.</w:t>
+      </w:r>
+    </w:p>
+    <w:p>
+      <w:pPr>
+        <w:pStyle w:val="ListBullet"/>
+      </w:pPr>
       <w:r>
         <w:rPr>
           <w:b/>
         </w:rPr>
-        <w:t>de-identified faces</w:t>
-      </w:r>
-      <w:r>
-        <w:t xml:space="preserve"> — benchmarking on the release itself. Condition (ii) is the only one that can separate information loss from domain shift when read alongside (i): a penalty that retraining removes was shift; one that survives retraining was information.</w:t>
+        <w:t>D→D</w:t>
+      </w:r>
+      <w:r>
+        <w:t xml:space="preserve"> — retrained and tested on the de-identified release: benchmarking on the release itself.</w:t>
       </w:r>
     </w:p>
     <w:p>
@@ -3798,34 +3818,7 @@
         <w:spacing w:after="120"/>
       </w:pPr>
       <w:r>
-        <w:t xml:space="preserve">Two references bound every number. The </w:t>
-      </w:r>
-      <w:r>
-        <w:rPr>
-          <w:b/>
-        </w:rPr>
-        <w:t>initialisation noise floor</w:t>
-      </w:r>
-      <w:r>
-        <w:t xml:space="preserve"> is the spread of the real-data model over five independent initialisations, 0.04–0.20 cm. The </w:t>
-      </w:r>
-      <w:r>
-        <w:rPr>
-          <w:b/>
-        </w:rPr>
-        <w:t>no-information reference</w:t>
-      </w:r>
-      <w:r>
-        <w:t xml:space="preserve"> is the error of predicting the training participants' mean gaze point for every frame: </w:t>
-      </w:r>
-      <w:r>
-        <w:rPr>
-          <w:b/>
-        </w:rPr>
-        <w:t>9.37 cm</w:t>
-      </w:r>
-      <w:r>
-        <w:t>, a penalty of +3.70 to +4.41 cm depending on the backbone's own baseline. A model at that level has learned no gaze.</w:t>
+        <w:t>Retraining uses the same recipe, participant partition and hyperparameters as the R→R models. Read together, R→D and D→R separate domain shift from information loss: a penalty that retraining removes was shift; one that survives retraining was information.</w:t>
       </w:r>
     </w:p>
     <w:p>
@@ -3833,6 +3826,41 @@
         <w:spacing w:after="120"/>
       </w:pPr>
       <w:r>
+        <w:t xml:space="preserve">Two references bound every number. The </w:t>
+      </w:r>
+      <w:r>
+        <w:rPr>
+          <w:b/>
+        </w:rPr>
+        <w:t>initialisation noise floor</w:t>
+      </w:r>
+      <w:r>
+        <w:t xml:space="preserve"> is the spread of the real-data model over five independent initialisations, 0.04–0.20 cm. The </w:t>
+      </w:r>
+      <w:r>
+        <w:rPr>
+          <w:b/>
+        </w:rPr>
+        <w:t>no-information reference</w:t>
+      </w:r>
+      <w:r>
+        <w:t xml:space="preserve"> is the error of predicting the training participants' mean gaze point for every frame: </w:t>
+      </w:r>
+      <w:r>
+        <w:rPr>
+          <w:b/>
+        </w:rPr>
+        <w:t>9.37 cm</w:t>
+      </w:r>
+      <w:r>
+        <w:t>, a penalty of +3.70 to +4.41 cm depending on the backbone's own baseline. A model at that level has learned no gaze.</w:t>
+      </w:r>
+    </w:p>
+    <w:p>
+      <w:pPr>
+        <w:spacing w:after="120"/>
+      </w:pPr>
+      <w:r>
         <w:rPr>
           <w:b/>
         </w:rPr>
@@ -3847,7 +3875,7 @@
         <w:pStyle w:val="Heading2"/>
       </w:pPr>
       <w:r>
-        <w:t>8.2 Models trained on real data (condition (ii))</w:t>
+        <w:t>8.2 Models trained on real data (R→D)</w:t>
       </w:r>
     </w:p>
     <w:p>
@@ -3855,7 +3883,7 @@
         <w:spacing w:after="120"/>
       </w:pPr>
       <w:r>
-        <w:t>Table 5 reports SimSwap under condition (ii); Table 6 reports DeepPrivacy2 and FAMS under the same models, initialisations and harness. Before any DeepPrivacy2 or FAMS number was computed, the real-data arm was re-run through the same pipeline and reproduced Table 5 to within 0.0012 cm on all 100 folds.</w:t>
+        <w:t>Table 5 reports SimSwap under R→D; Table 6 reports DeepPrivacy2 and FAMS under the same models, initialisations and harness. Before any DeepPrivacy2 or FAMS number was computed, the real-data arm was re-run through the same pipeline and reproduced Table 5 to within 0.0012 cm on all 100 folds.</w:t>
       </w:r>
     </w:p>
     <w:p>
@@ -3869,7 +3897,7 @@
         <w:t>Table 5.</w:t>
       </w:r>
       <w:r>
-        <w:t xml:space="preserve"> Gaze error (cm) under condition (ii) for SimSwap: trained on real data, deployed on de-identified crops. Mean over five folds, then mean ± SD over five independent initialisations; in parentheses, the change against the same model's real-data baseline. The SD is the noise floor of the comparison (0.04–0.20 cm on the baseline): no difference smaller than it can be supported in either direction.</w:t>
+        <w:t xml:space="preserve"> Gaze error (cm) under R→D for SimSwap: trained on real data, deployed on de-identified crops. Mean over five folds, then mean ± SD over five independent initialisations; in parentheses, the change against the same model's real-data baseline. The SD is the noise floor of the comparison (0.04–0.20 cm on the baseline): no difference smaller than it can be supported in either direction.</w:t>
       </w:r>
     </w:p>
     <w:tbl>
@@ -3911,7 +3939,7 @@
                 <w:b/>
                 <w:sz w:val="17"/>
               </w:rPr>
-              <w:t>Real Data</w:t>
+              <w:t>R→R (real data)</w:t>
             </w:r>
           </w:p>
         </w:tc>
@@ -4313,7 +4341,7 @@
         <w:t>Table 6.</w:t>
       </w:r>
       <w:r>
-        <w:t xml:space="preserve"> Condition (ii) for DeepPrivacy2 (face and full-body modes, fixed and per-frame identity) and FAMS (fresh noise per frame, all 210,924 task frames). Mean ± SD over five initialisations; in parentheses, or as listed for FAMS, the change against the real-data baseline in Table 5.</w:t>
+        <w:t xml:space="preserve"> R→D for DeepPrivacy2 (face and full-body modes, fixed and per-frame identity) and FAMS (fresh noise per frame, all 210,924 task frames). Mean ± SD over five initialisations; in parentheses, or as listed for FAMS, the change against the real-data baseline in Table 5.</w:t>
       </w:r>
     </w:p>
     <w:p>
@@ -5112,7 +5140,7 @@
                 <w:b/>
                 <w:sz w:val="17"/>
               </w:rPr>
-              <w:t>Real Data</w:t>
+              <w:t>R→R (real data)</w:t>
             </w:r>
           </w:p>
         </w:tc>
@@ -5372,7 +5400,7 @@
         <w:spacing w:after="120"/>
       </w:pPr>
       <w:r>
-        <w:t>Deployed on DeepPrivacy2 crops, real-data models are worse than predicting the mean: 15.9–20.5 cm in face mode and 14.6–17.8 cm in full-body mode, against 9.37 cm. A model given repainted eyes is confidently wrong. Hybrid recovers 91–101% of the face-mode penalty and 93–99% of the full-body one, as it does for SimSwap. Every one of the 421,848 full-body frames had the participant detected and repainted. In 2,861 of them (1.4%) the detector also returned a second person region without a surface map, which the pipeline leaves unedited; the participant's released crops in those frames are changed as much as in all others, so no original pixels reach the release. Under deployment alone FAMS looks worse than SimSwap (+4.1 to +5.1 cm, against +2.4 to +3.7 cm for SimSwap A), and Hybrid recovers 93–100% of its penalty. Section 8.3 shows that most of the DeepPrivacy2 and FAMS penalty under condition (ii) is domain shift.</w:t>
+        <w:t>Deployed on DeepPrivacy2 crops, real-data models are worse than predicting the mean: 15.9–20.5 cm in face mode and 14.6–17.8 cm in full-body mode, against 9.37 cm. A model given repainted eyes is confidently wrong. Hybrid recovers 91–101% of the face-mode penalty and 93–99% of the full-body one, as it does for SimSwap. Every one of the 421,848 full-body frames had the participant detected and repainted. In 2,861 of them (1.4%) the detector also returned a second person region without a surface map, which the pipeline leaves unedited; the participant's released crops in those frames are changed as much as in all others, so no original pixels reach the release. Under deployment alone FAMS looks worse than SimSwap (+4.1 to +5.1 cm, against +2.4 to +3.7 cm for SimSwap A), and Hybrid recovers 93–100% of its penalty. Section 8.3 shows that most of the DeepPrivacy2 and FAMS penalty under R→D is domain shift.</w:t>
       </w:r>
     </w:p>
     <w:p>
@@ -5825,7 +5853,7 @@
         <w:pStyle w:val="Heading2"/>
       </w:pPr>
       <w:r>
-        <w:t>8.3 Models retrained on the release (condition (i))</w:t>
+        <w:t>8.3 Models retrained on the release (D→R and D→D)</w:t>
       </w:r>
     </w:p>
     <w:p>
@@ -5839,7 +5867,7 @@
         <w:t>Table 8.</w:t>
       </w:r>
       <w:r>
-        <w:t xml:space="preserve"> Penalty (cm) against each model's own real-data baseline, under the three conditions: mean over MobileNet-V3 Large, AFFNet and MGazeNet, with [min, max] across the three. Condition (i) is the mean over five independent initialisations per cell (per-draw SDs 0.01–0.83 cm), against the five-draw real-data mean; condition (ii) is recomputed over the same three architectures so the columns are comparable. Retraining uses the same recipe and participant partition as the real-data models. iTracker (about 9 h per fold) is reported separately in Table 12. Negative Hybrid values read as indistinguishable from baseline, not as gains.</w:t>
+        <w:t xml:space="preserve"> Penalty (cm) against each model's own R→R error (MobileNet-V3 Large 4.98, AFFNet 5.67, MGazeNet 4.96 cm, five-draw means), under R→D, D→R and D→D: mean over the three architectures, with [min, max] across them. D→R and D→D are means over five independent initialisations per cell (per-draw SDs 0.01–0.83 cm); R→D is recomputed over the same three architectures so the columns are comparable. Retraining uses the same recipe and participant partition as the real-data models. iTracker (about 9 h per fold) is reported separately in Table 12. Negative Hybrid values read as indistinguishable from baseline, not as gains.</w:t>
       </w:r>
     </w:p>
     <w:tbl>
@@ -5879,7 +5907,7 @@
                 <w:b/>
                 <w:sz w:val="17"/>
               </w:rPr>
-              <w:t>(ii) train real, test de-id</w:t>
+              <w:t>R→D</w:t>
             </w:r>
           </w:p>
         </w:tc>
@@ -5893,7 +5921,7 @@
                 <w:b/>
                 <w:sz w:val="17"/>
               </w:rPr>
-              <w:t>(i) train de-id, test real</w:t>
+              <w:t>D→R</w:t>
             </w:r>
           </w:p>
         </w:tc>
@@ -5907,7 +5935,7 @@
                 <w:b/>
                 <w:sz w:val="17"/>
               </w:rPr>
-              <w:t>(i) train de-id, test de-id</w:t>
+              <w:t>D→D</w:t>
             </w:r>
           </w:p>
         </w:tc>
@@ -6892,7 +6920,7 @@
         <w:t>Removal by inpainting leaves no gaze signal at all.</w:t>
       </w:r>
       <w:r>
-        <w:t xml:space="preserve"> For DeepPrivacy2 the picture is the reverse. More than half of the condition (ii) penalty </w:t>
+        <w:t xml:space="preserve"> For DeepPrivacy2 the picture is the reverse. More than half of the R→D penalty </w:t>
       </w:r>
       <w:r>
         <w:rPr>
@@ -6915,7 +6943,7 @@
         <w:t>Hybrid recovers the penalty in every condition.</w:t>
       </w:r>
       <w:r>
-        <w:t xml:space="preserve"> Restoring the genuine ocular ROIs recovers 91–103% of the penalty when the retrained model is deployed on real faces and 98–106% on the release, for both families, both DeepPrivacy2 modes and both identity regimes; every Hybrid cell in condition (i) lies between −0.19 and +0.23 cm of baseline, inside the initialisation noise floor or at its edge. FAMS falls in the same band (−0.14 to +0.07 cm); its percentages (82–111% and 96–106%) are noisier because its Full Synthetic penalty on real faces is small, +0.39 cm for AFFNet. The central utility finding of Table 7 therefore does not depend on how the model was trained.</w:t>
+        <w:t xml:space="preserve"> Restoring the genuine ocular ROIs recovers 91–103% of the penalty when the retrained model is deployed on real faces and 98–106% on the release, for both families, both DeepPrivacy2 modes and both identity regimes; every retrained Hybrid cell (D→R and D→D) lies between −0.19 and +0.23 cm of baseline, inside the initialisation noise floor or at its edge. FAMS falls in the same band (−0.14 to +0.07 cm); its percentages (82–111% and 96–106%) are noisier because its Full Synthetic penalty on real faces is small, +0.39 cm for AFFNet. The central utility finding of Table 7 therefore does not depend on how the model was trained.</w:t>
       </w:r>
     </w:p>
     <w:p>
@@ -6929,7 +6957,7 @@
         <w:t>A diffusion anonymiser transfers better; it does not keep more gaze.</w:t>
       </w:r>
       <w:r>
-        <w:t xml:space="preserve"> FAMS looks, under condition (ii), like the others: +4.1 to +5.1 cm. Retrained on its release and deployed on real faces, models lose only +0.94 cm on average — +1.15 ± 0.03 (MobileNet-V3), +0.39 ± 0.21 (AFFNet), +1.29 ± 0.06 (MGazeNet) — against +3.83 for SimSwap A and +4.51 for DeepPrivacy2, and FAMS is better than both in every one of 15 paired draws. Two measurements show that this is not because its eyes carry more gaze. The model-free pupil test (Table 9) finds the opposite: SimSwap's synthetic pupils follow the participant's true horizontal gaze more closely than FAMS's in all 17 participants with ground truth (r = 0.79–0.83 against 0.68–0.69; unprocessed 0.87). And models that see only the eye crops (Table 10) reproduce the advantage on real faces — +0.96 to +1.16 cm for FAMS against +2.71 to +6.77 for SimSwap — but not inside the release, where the two are comparable (+2.04 to +2.72 against +1.98 to +2.95, each method better for one eyes-only architecture in every draw). The difference is transfer: models trained on SimSwap eyes fail on real eyes, models trained on FAMS eyes do not. A plausible reading, which we did not test, is diversity: SimSwap maps every participant onto one template's eyes, whereas FAMS draws a new identity every frame. Tested on its own release, a FAMS-trained model is less accurate than on real faces (+1.56 to +2.57 cm), the reverse of SimSwap. FAMS is therefore the more useful release for training models deployed on real users, for reasons that have nothing to do with keeping more of the pupil; on the privacy axis it breaks per-participant consistency without being asked to, yet its face crop still verifies against the participant's photographs and stays linkable (§7).</w:t>
+        <w:t xml:space="preserve"> FAMS looks, under R→D, like the others: +4.1 to +5.1 cm. Retrained on its release and deployed on real faces, models lose only +0.94 cm on average — +1.15 ± 0.03 (MobileNet-V3), +0.39 ± 0.21 (AFFNet), +1.29 ± 0.06 (MGazeNet) — against +3.83 for SimSwap A and +4.51 for DeepPrivacy2, and FAMS is better than both in every one of 15 paired draws. Two measurements show that this is not because its eyes carry more gaze. The model-free pupil test (Table 9) finds the opposite: SimSwap's synthetic pupils follow the participant's true horizontal gaze more closely than FAMS's in all 17 participants with ground truth (r = 0.79–0.83 against 0.68–0.69; unprocessed 0.87). And models that see only the eye crops (Table 10) reproduce the advantage on real faces — +0.96 to +1.16 cm for FAMS against +2.71 to +6.77 for SimSwap — but not inside the release, where the two are comparable (+2.04 to +2.72 against +1.98 to +2.95, each method better for one eyes-only architecture in every draw). The difference is transfer: models trained on SimSwap eyes fail on real eyes, models trained on FAMS eyes do not. A plausible reading, which we did not test, is diversity: SimSwap maps every participant onto one template's eyes, whereas FAMS draws a new identity every frame. Tested on its own release, a FAMS-trained model is less accurate than on real faces (+1.56 to +2.57 cm), the reverse of SimSwap. FAMS is therefore the more useful release for training models deployed on real users, for reasons that have nothing to do with keeping more of the pupil; on the privacy axis it breaks per-participant consistency without being asked to, yet its face crop still verifies against the participant's photographs and stays linkable (§7).</w:t>
       </w:r>
     </w:p>
     <w:p>
@@ -7993,7 +8021,7 @@
         <w:t>The identity regime costs nothing; the edit domain costs everything.</w:t>
       </w:r>
       <w:r>
-        <w:t xml:space="preserve"> Once models are trained on the release, resampling the synthetic identity every frame changes utility by −0.63 to +0.19 cm against a fixed identity, across both DeepPrivacy2 modes, both arms and both test sets — never worse by more than 0.19 cm. In condition (ii) the Full Synthetic arm moves by up to 1.2 cm, but there both regimes are already worse than predicting the mean. What destroys utility is repainting the eyes — and repainting everything the crop contains, eyes included, is what §7 found necessary to break face-crop linkage.</w:t>
+        <w:t xml:space="preserve"> Once models are trained on the release, resampling the synthetic identity every frame changes utility by −0.63 to +0.19 cm against a fixed identity, across both DeepPrivacy2 modes, both arms and both test sets — never worse by more than 0.19 cm. Under R→D the Full Synthetic arm moves by up to 1.2 cm, but there both regimes are already worse than predicting the mean. What destroys utility is repainting the eyes — and repainting everything the crop contains, eyes included, is what §7 found necessary to break face-crop linkage.</w:t>
       </w:r>
     </w:p>
     <w:p>
@@ -8077,7 +8105,7 @@
         <w:t>Table 12.</w:t>
       </w:r>
       <w:r>
-        <w:t xml:space="preserve"> iTracker under the three conditions, one initialisation in condition (i). Penalty (cm) against its five-draw real-data baseline of 5.85 cm; predicting the mean corresponds to +3.52 cm.</w:t>
+        <w:t xml:space="preserve"> iTracker under R→D, D→R and D→D, one initialisation for the retrained conditions. Penalty (cm) against its five-draw R→R error of 5.85 cm; predicting the mean corresponds to +3.52 cm.</w:t>
       </w:r>
     </w:p>
     <w:tbl>
@@ -8117,7 +8145,7 @@
                 <w:b/>
                 <w:sz w:val="17"/>
               </w:rPr>
-              <w:t>(ii)</w:t>
+              <w:t>R→D</w:t>
             </w:r>
           </w:p>
         </w:tc>
@@ -8131,7 +8159,7 @@
                 <w:b/>
                 <w:sz w:val="17"/>
               </w:rPr>
-              <w:t>(i) test real</w:t>
+              <w:t>D→R</w:t>
             </w:r>
           </w:p>
         </w:tc>
@@ -8145,7 +8173,7 @@
                 <w:b/>
                 <w:sz w:val="17"/>
               </w:rPr>
-              <w:t>(i) test de-id</w:t>
+              <w:t>D→D</w:t>
             </w:r>
           </w:p>
         </w:tc>
@@ -9904,7 +9932,7 @@
         <w:spacing w:after="120"/>
       </w:pPr>
       <w:r>
-        <w:t>De-identification for gaze data has been judged by whether the face still looks like the participant. We measured instead whether the release can still be linked and whether a model trained on it still works, across three generator families, two release forms and three training conditions. No configuration was both: the ones that keep the gaze signal keep the identity, and the one that breaks linkage leaves nothing to learn from. The two-part condition says what a generator would have to do to change that, and the audit tool lets a dataset author check, before release, whether theirs does.</w:t>
+        <w:t>De-identification for gaze data has been judged by whether the face still looks like the participant. We measured instead whether the release can still be linked and whether a model trained on it still works, across three generator families, two release forms and four train–test conditions. No configuration was both: the ones that keep the gaze signal keep the identity, and the one that breaks linkage leaves nothing to learn from. The two-part condition says what a generator would have to do to change that, and the audit tool lets a dataset author check, before release, whether theirs does.</w:t>
       </w:r>
     </w:p>
     <w:p>
@@ -9996,7 +10024,7 @@
         <w:rPr>
           <w:b/>
         </w:rPr>
-        <w:t>Utility under three training conditions.</w:t>
+        <w:t>Utility under R→D, D→R and D→D.</w:t>
       </w:r>
       <w:r>
         <w:t xml:space="preserve"> </w:t>
@@ -10017,7 +10045,7 @@
         <w:t>(b)</w:t>
       </w:r>
       <w:r>
-        <w:t xml:space="preserve"> Hybrid penalty against each model's real-data baseline, for models trained on real data and tested on de-identified crops (grey), and models retrained on the release and tested on real (green) or de-identified (purple) faces. Bars: mean of three architectures; dots: each architecture. Red band: no-information reference; grey band: initialisation noise floor. Retraining removes most of the DeepPrivacy2 penalty but stops at the no-information level; it does not remove SimSwap's; for FAMS it removes most of it on real faces (+0.94 cm) and less on the release (+2.15 cm). Hybrid recovers most of the penalty in every condition and, once retrained, lies within the noise floor.</w:t>
+        <w:t xml:space="preserve"> Hybrid penalty against each model's R→R baseline, for models trained on real data and tested on de-identified crops (R→D, grey), and models retrained on the release and tested on real (D→R, green) or de-identified (D→D, purple) faces. Bars: mean of three architectures; dots: each architecture. Red band: no-information reference; grey band: initialisation noise floor. Retraining removes most of the DeepPrivacy2 penalty but stops at the no-information level; it does not remove SimSwap's; for FAMS it removes most of it on real faces (+0.94 cm) and less on the release (+2.15 cm). Hybrid recovers most of the penalty in every condition and, once retrained, lies within the noise floor.</w:t>
       </w:r>
     </w:p>
     <w:p>

</xml_diff>

<commit_message>
Style pass: no semicolons or em dashes, plainer academic voice; Hybrid recovery 82-111% across all families
Co-Authored-By: Claude Opus 5.5 <noreply@anthropic.com>
Claude-Session: https://claude.ai/code/session_01J7Eoy7KDxWK2PLKxYcPUkj
</commit_message>
<xml_diff>
--- a/results/paper/MANUSCRIPT.docx
+++ b/results/paper/MANUSCRIPT.docx
@@ -23,7 +23,7 @@
         <w:spacing w:after="120"/>
       </w:pPr>
       <w:r>
-        <w:t>Smartphone eye tracking moves oculomotor assessment out of the clinic, but it records video of the participant's face, which blocks the dataset sharing the field depends on. Face de-identification has been proposed as the remedy and judged by whether the de-identified face still matches the real one. We measure what such a release protects and what a gaze model trained on it is worth.</w:t>
+        <w:t>Smartphone eye tracking can bring oculomotor assessment out of the clinic, but it records video of the participant's face, and this is what prevents the field from sharing data. Face de-identification has been proposed as a remedy and is usually judged by whether the processed face still matches the real one. We ask instead what such a release protects and how useful it remains for training gaze models.</w:t>
       </w:r>
     </w:p>
     <w:p>
@@ -31,7 +31,7 @@
         <w:spacing w:after="120"/>
       </w:pPr>
       <w:r>
-        <w:t>We introduce CognitiveGaze: 18 participants performing seven oculomotor tasks, recorded simultaneously by a smartphone and an EyeLink 1000, so every frame carries physiological ground-truth gaze. We evaluate face swapping, inpainting and diffusion de-identification with four gaze architectures, deployed on and retrained on each release, and with two face recognisers.</w:t>
+        <w:t>We introduce CognitiveGaze, in which 18 participants performed seven oculomotor tasks while a smartphone and an EyeLink 1000 recorded them simultaneously, so every frame carries physiological ground-truth gaze. We evaluate face swapping, inpainting and diffusion-based de-identification with four gaze architectures, each deployed on and retrained on every release, and with two face recognisers.</w:t>
       </w:r>
     </w:p>
     <w:p>
@@ -39,7 +39,7 @@
         <w:spacing w:after="120"/>
       </w:pPr>
       <w:r>
-        <w:t>Retaining the genuine eye region recovers 85–106% of the accuracy lost to synthesis, yet those eye crops verify identity at 62–80% against a 1.6% floor: the eye pixels that make gaze estimation work are the pixels that identify. Synthesising the eyes defeats matching on the eye crops, but synthetic face crops still verify at 18–24%, and every release that retains gaze information still singles out each participant, which under European anonymisation guidance leaves it personal data. Inpainted eyes carry no recoverable gaze. A diffusion anonymiser yields the models that transfer best to real faces (0.4–1.3 cm against 2.5–6.2 cm), but its pupils follow true gaze less closely than face-swapped ones, and stronger settings trade pupil signal for identity without reducing linkability. No configuration we tested is both private and useful. We state what a releasable gaze corpus requires and release an audit tool and checklist.</w:t>
+        <w:t>Keeping the genuine eye region recovers 82–111% of the accuracy lost to synthesis, yet these eye crops verify identity at 62–80% against a 1.6% floor. The pixels that make gaze estimation work are also the pixels that identify the participant. Synthesising the eyes prevents matching on the eye crops, but synthetic face crops still verify at 18–24%, and every release that retains gaze information still singles out each participant, which under European anonymisation guidance leaves it personal data. Inpainted eyes carry no recoverable gaze. A diffusion anonymiser produces the models that transfer best to real faces (0.4–1.3 cm against 2.5–6.2 cm), although its pupils follow true gaze less closely than face-swapped ones, and stronger settings trade pupil signal for identity protection without reducing linkability. None of the configurations we tested is both private and useful. We describe what a releasable gaze corpus would require and release an audit tool and checklist.</w:t>
       </w:r>
     </w:p>
     <w:p>
@@ -137,7 +137,7 @@
         <w:spacing w:after="120"/>
       </w:pPr>
       <w:r>
-        <w:t>Oculomotor function is a sensitive marker of neurological and cognitive change, but the instruments that measure it well, such as the EyeLink 1000, are confined to the clinic. Smartphone gaze estimation moves the measurement to where patients are [krafka16, valliappan20]; it does not move the data. A smartphone eye tracker records the participant's face, and face video is not a shareable research artefact.</w:t>
+        <w:t>Oculomotor function is a sensitive marker of neurological and cognitive change, but the instruments that measure it well, such as the EyeLink 1000, are largely confined to the clinic. Smartphone gaze estimation can take the measurement to where patients are [krafka16, valliappan20]. The data, however, stay where they were recorded. A smartphone eye tracker films the participant's face, and face video cannot simply be shared as a research artefact.</w:t>
       </w:r>
     </w:p>
     <w:p>
@@ -145,7 +145,7 @@
         <w:spacing w:after="120"/>
       </w:pPr>
       <w:r>
-        <w:t>The result is a cycle that reproduces its own scarcity (Figure 1). Because few public corpora record the face under usable conditions, studies converge on the same ones — GazeCapture above all [krafka16] — and inherit their assumptions: a hand-held phone, a small screen, a short viewing distance, and the position of an on-screen target in place of measured gaze. Newer corpora adopt the same protocol for comparability [zjugaze, dynamicgaze]. Clinical protocols violate most of these assumptions: stimuli span a large display viewed from about a metre, and the quantity of interest is the gaze trajectory. Groups that record such data hold it in separate silos, which leaves analysis choices without a common reference [simmons11, carp12]. Releasing the data meets the privacy problem: face video of a study participant is personal data and, in a clinical study, health data under the GDPR [gdpr], and HIPAA lists full-face photographs among the identifiers to be removed [hipaa]. The standard exits do not yield a usable public corpus. Blurring or masking removes the geometry a gaze model reads [blurmask, disguises]; homomorphic encryption and federated learning leave the data with its holder and are costly for video [acar18he, kairouz21fl]; controlled access restricts who can use it. The next group again finds the same few corpora.</w:t>
+        <w:t>This produces a cycle in which data remain scarce (Figure 1). Few public corpora record the face under usable conditions, so most studies build on the same ones, GazeCapture above all [krafka16], and inherit their assumptions: a hand-held phone, a small screen, a short viewing distance and the position of an on-screen target used in place of measured gaze. Newer corpora follow the same protocol for comparability [zjugaze, dynamicgaze]. Clinical protocols differ on most of these points. Stimuli span a large display viewed from about a metre, and the quantity of interest is the gaze trajectory. Clinical groups that collect such data usually keep it in separate silos, so analysis choices are rarely checked against a common reference [simmons11, carp12]. Releasing the data then runs into privacy constraints. Face video of a study participant is personal data, and in a clinical study it is also health data under the GDPR [gdpr]. HIPAA lists full-face photographs among the identifiers that must be removed [hipaa]. The usual workarounds do not produce a usable public corpus either. Blurring or masking removes the geometry a gaze model relies on [blurmask, disguises], homomorphic encryption and federated learning keep the data with its holder and are expensive for video [acar18he, kairouz21fl], and controlled access limits who can use the data. The next group then faces the same shortage.</w:t>
       </w:r>
     </w:p>
     <w:p>
@@ -198,7 +198,7 @@
         <w:t>Figure 1.</w:t>
       </w:r>
       <w:r>
-        <w:t xml:space="preserve"> The data-scarcity cycle in smartphone gaze research. A de-identification that removes identity and keeps gaze would break it at step 5; this paper measures whether any current method does.</w:t>
+        <w:t xml:space="preserve"> The data-scarcity cycle in smartphone gaze research. A de-identification method that removed identity while keeping gaze would break the cycle at step 5. This paper tests whether current methods do.</w:t>
       </w:r>
     </w:p>
     <w:p>
@@ -206,7 +206,7 @@
         <w:spacing w:after="120"/>
       </w:pPr>
       <w:r>
-        <w:t>The cycle could break at one step: a transformation that removes identity and keeps the gaze signal would allow open release. Generative de-identification is the candidate. Face swapping is meant to preserve the geometry a gaze model reads — head pose, eyelid aperture, iris position — and has been applied to clinical video of movement disorders, autism assessments and seizures [zhu20deepfakes, disguises, li24seizure]. Gaze degrades under it unless the generator is constrained to keep it [wilson23gaze], and a recent evaluation concludes that face swapping hides identity effectively [mustu25]. These evaluations ask whether the swapped face still matches the real one.</w:t>
+        <w:t>A transformation that removed identity while keeping the gaze signal would allow open release, and generative de-identification is the obvious candidate. Face swapping is designed to preserve head pose, eyelid aperture and iris position, which are what a gaze model uses, and it has been applied to clinical video of movement disorders, autism assessments and seizures [zhu20deepfakes, disguises, li24seizure]. Gaze is not well preserved unless the generator is explicitly constrained to keep it [wilson23gaze], and a recent evaluation concluded that face swapping hides identity effectively [mustu25]. These evaluations ask whether the swapped face can still be matched to the real one.</w:t>
       </w:r>
     </w:p>
     <w:p>
@@ -214,7 +214,7 @@
         <w:spacing w:after="120"/>
       </w:pPr>
       <w:r>
-        <w:t>For gaze data this question is insufficient, for two structural reasons. First, the eye region is itself a biometric: a 120 px eye crop verifies identity at 62–80% at a false-accept rate of 1e-3, against a measured floor of 1.6%, so a protocol that restores accuracy by retaining genuine eye pixels releases the biometric with them. Second, synthesising the whole face removes the correspondence between the released eye crops and the real face, but not between the synthetic face crop and the real face, and it leaves the corpus partitionable by individual. Under European guidance on anonymisation, that suffices for the data to remain personal data [wp29anon]. The channels that carry this lie outside the region generators edit.</w:t>
+        <w:t>For gaze data we argue that this question is not sufficient, for two reasons. First, the eye region is itself a biometric. A 120 px eye crop verifies identity at 62–80% at a false-accept rate of 1e-3, against a measured floor of 1.6%, so any protocol that recovers accuracy by keeping the genuine eye pixels also releases this biometric. Second, synthesising the whole face breaks the link between the released eye crops and the real face but not between the synthetic face crop and the real face, and the corpus can still be partitioned by individual. Under European anonymisation guidance this is enough for the data to remain personal data [wp29anon]. The cues that allow this lie outside the region the generators edit.</w:t>
       </w:r>
     </w:p>
     <w:p>
@@ -222,7 +222,7 @@
         <w:spacing w:after="120"/>
       </w:pPr>
       <w:r>
-        <w:t>To measure this we recorded CognitiveGaze: 18 participants performing seven oculomotor tasks, recorded simultaneously by a smartphone and an EyeLink 1000, so that every frame carries physiological ground-truth gaze rather than a target label. Its protocol deliberately departs from GazeCapture's — stimuli on a 53 × 30 cm display at 80–120 cm — and is the kind of clinical corpus the cycle keeps unreleased. On the privacy axis we follow security practice: a stated attacker, recognisers never trained on our data, a second recogniser as a cross-check, and a session-nuisance control that measures what "no identity signal" scores on single-session recordings.</w:t>
+        <w:t>To measure these effects we recorded CognitiveGaze. Eighteen participants performed seven oculomotor tasks while a smartphone and an EyeLink 1000 recorded them simultaneously, so every frame carries physiological ground-truth gaze instead of a target label. The protocol deliberately departs from that of GazeCapture, with stimuli on a 53 × 30 cm display at 80–120 cm, and it is the kind of clinical corpus that usually stays unreleased. For privacy we follow common practice in security research. We state the attacker, use recognisers that were never trained on our data, cross-check with a second recogniser, and measure what "no identity signal" scores on single-session recordings.</w:t>
       </w:r>
     </w:p>
     <w:p>
@@ -230,7 +230,7 @@
         <w:spacing w:after="120"/>
       </w:pPr>
       <w:r>
-        <w:t>Our contributions are:</w:t>
+        <w:t>This paper makes four contributions.</w:t>
       </w:r>
     </w:p>
     <w:p>
@@ -244,7 +244,7 @@
         <w:t>A privacy evaluation protocol for gaze corpora.</w:t>
       </w:r>
       <w:r>
-        <w:t xml:space="preserve"> We separate re-identification from photographs (A1) from a test of whether the content singles out individuals (A2, the linkability criterion of European anonymisation guidance), show that the two differ by up to 60 points on identical crops, and release the protocol as an audit tool and fifteen-item checklist [privaudit-repo] that reproduces every eye-crop result in this paper.</w:t>
+        <w:t xml:space="preserve"> We distinguish re-identification from photographs (A1) from a test of whether the released content singles out individuals (A2), which corresponds to the linkability criterion in European anonymisation guidance. The two can differ by up to 60 points on the same crops. We release the protocol as an audit tool with a fifteen-item checklist [privaudit-repo], which reproduces every eye-crop result in this paper.</w:t>
       </w:r>
     </w:p>
     <w:p>
@@ -258,7 +258,7 @@
         <w:t>Evidence that gaze utility and identity share the eye region.</w:t>
       </w:r>
       <w:r>
-        <w:t xml:space="preserve"> Retaining genuine eye crops recovers 85–106% of the synthesis penalty for SimSwap and DeepPrivacy2 in every architecture and condition, and those crops identify at 62–80%. Releasing eye landmarks instead of pixels still links the corpus while carrying almost no gaze signal.</w:t>
+        <w:t xml:space="preserve"> Keeping the genuine eye crops recovers 82–111% of the synthesis penalty across architectures and conditions, and the same crops identify participants at 62–80%. Releasing eye landmarks instead of pixels still allows linkage while carrying almost no gaze signal.</w:t>
       </w:r>
     </w:p>
     <w:p>
@@ -272,16 +272,7 @@
         <w:t>A tested two-part condition for content-based linkage.</w:t>
       </w:r>
       <w:r>
-        <w:t xml:space="preserve"> Linkage from released content falls only when the synthetic identity is not held fixed per participant </w:t>
-      </w:r>
-      <w:r>
-        <w:rPr>
-          <w:i/>
-        </w:rPr>
-        <w:t>and</w:t>
-      </w:r>
-      <w:r>
-        <w:t xml:space="preserve"> the release contains nothing outside the generator's edit domain. A 2×2 experiment with DeepPrivacy2 confirms it, and a diffusion method not used to derive it behaves as predicted.</w:t>
+        <w:t xml:space="preserve"> Linkage from the released content disappears only when the synthetic identity is not held fixed per participant and the release contains nothing outside the generator's edit region. We confirm this in a 2×2 experiment with DeepPrivacy2 and show that a diffusion method, which played no part in deriving the condition, behaves as it predicts.</w:t>
       </w:r>
     </w:p>
     <w:p>
@@ -295,7 +286,7 @@
         <w:t>A utility benchmark under de-identification.</w:t>
       </w:r>
       <w:r>
-        <w:t xml:space="preserve"> Four architectures, three generator families and four train–test conditions, with an initialisation noise floor, a no-information reference, stream-isolated models and a model-free pupil test. It shows that the release whose models transfer best to real users is not the one whose pupils carry the most gaze.</w:t>
+        <w:t xml:space="preserve"> We cover four architectures, three generator families and four train–test conditions, with an initialisation noise floor, a no-information reference, stream-isolated models and a model-free pupil test. The release whose models transfer best to real users turns out not to be the one whose pupils carry the most gaze information.</w:t>
       </w:r>
     </w:p>
     <w:p>
@@ -317,7 +308,7 @@
         <w:t>Smartphone gaze estimation.</w:t>
       </w:r>
       <w:r>
-        <w:t xml:space="preserve"> iTracker and GazeCapture established appearance-based gaze estimation on phones [krafka16], and Valliappan et al. reached research-grade accuracy with per-user calibration [valliappan20]. AFFNet [affnet] and MGazeNet [zhu24] condition eye features on facial context through adaptive normalisation. All consume the same artefacts — a face crop, two eye crops and a face grid — and inherit the same data-sharing problem.</w:t>
+        <w:t xml:space="preserve"> iTracker and the GazeCapture corpus established appearance-based gaze estimation on phones [krafka16], and Valliappan et al. reached research-grade accuracy with per-user calibration [valliappan20]. AFFNet [affnet] and MGazeNet [zhu24] condition the eye features on facial context through adaptive normalisation. All of these models take the same inputs (a face crop, two eye crops and a face grid) and therefore face the same data-sharing problem.</w:t>
       </w:r>
     </w:p>
     <w:p>
@@ -331,7 +322,7 @@
         <w:t>Face de-identification.</w:t>
       </w:r>
       <w:r>
-        <w:t xml:space="preserve"> Removal methods include k-Same and its neural successors [newton05, ksamenet]; DeepPrivacy and DeepPrivacy2, which inpaint the face or the whole body [deepprivacy, deepprivacy2]; CIAGAN [ciagan]; and diffusion methods that condition on the source face [fams] or edit diffusion latents [fluid, apl]. Swapping methods such as SimSwap and SimSwap++ replace identity instead [simswap, simswappp]. Inpainting the eyes is expected to destroy gaze, whereas swapping is meant to preserve it. We test both expectations and find that, on the privacy axis, what the edit domain leaves out matters more than the objective.</w:t>
+        <w:t xml:space="preserve"> Methods that remove identity include k-Same and its neural successors [newton05, ksamenet], DeepPrivacy and DeepPrivacy2, which inpaint the face or the whole body [deepprivacy, deepprivacy2], CIAGAN [ciagan], and diffusion methods that either condition on the source face [fams] or edit in latent space [fluid, apl]. Face-swapping methods such as SimSwap and SimSwap++ replace identity instead [simswap, simswappp]. One would expect inpainting the eyes to destroy gaze and swapping to preserve it. We test both expectations and find that, for privacy, what the edit region leaves untouched matters more than the training objective.</w:t>
       </w:r>
     </w:p>
     <w:p>
@@ -345,7 +336,7 @@
         <w:t>Face swapping for clinical video.</w:t>
       </w:r>
       <w:r>
-        <w:t xml:space="preserve"> Swapping has been applied to movement-disorder videos, preserving the body keypoints needed for diagnosis [zhu20deepfakes], and to seizure videos, rated subjectively for retained semiology [li24seizure]. Wilson et al. gave the first privacy–utility methodology for patient-privacy face swaps, measuring gaze and expression against blurring [disguises], and later added a gaze loss because full-face objectives do not preserve the eye region [wilson23gaze]. A digital mask for clinical video [digitalmask] was promptly contested [maskconcerns]. Muştu and Ekenel conclude that face swapping hides identity effectively, measured by matching the swapped face to the real one [mustu25]. Our results agree for synthesised eye crops but not for synthetic face crops, and that test does not ask whether the release singles out individuals — the linkability criterion of European guidance [wp29anon], which survives swapping almost intact.</w:t>
+        <w:t xml:space="preserve"> Face swapping has been applied to videos of movement disorders, where the body keypoints needed for diagnosis were preserved [zhu20deepfakes], and to seizure videos, which were rated subjectively for retained semiology [li24seizure]. Wilson et al. proposed the first privacy–utility methodology for face swaps in patient video, comparing gaze and expression preservation with blurring [disguises], and later added a gaze loss because full-face objectives did not preserve the eye region [wilson23gaze]. A digital mask for clinical video [digitalmask] was soon questioned [maskconcerns]. Muştu and Ekenel concluded that face swapping hides identity effectively, based on matching swapped faces to real ones [mustu25]. Our results agree for synthesised eye crops but not for synthetic face crops. Their test also does not ask whether the release singles out individuals, which is the linkability criterion in European guidance [wp29anon] and which face swapping leaves almost intact.</w:t>
       </w:r>
     </w:p>
     <w:p>
@@ -359,7 +350,7 @@
         <w:t>Eye movement as a biometric.</w:t>
       </w:r>
       <w:r>
-        <w:t xml:space="preserve"> Identity is recoverable from eye movement itself [rigas, holland, bioeye]. Privacy research on eye tracking has developed differential privacy for gaze streams [bozkir, steil], learned obfuscation [fuhl] and private scanpath comparison [scanpath], reviewed in [etprivreview] and, for mobile devices, in [alsakar25]. We therefore measure, rather than assume, the risk of a pixel-free release tier.</w:t>
+        <w:t xml:space="preserve"> Identity can be recovered from eye movements alone [rigas, holland, bioeye]. Privacy research on eye tracking has proposed differential privacy for gaze streams [bozkir, steil], learned obfuscation [fuhl] and private scanpath comparison [scanpath], reviewed in [etprivreview] and, for mobile devices, in [alsakar25]. For this reason we measure the risk of a release tier without images rather than assume it is safe.</w:t>
       </w:r>
     </w:p>
     <w:p>
@@ -381,7 +372,7 @@
         <w:t>Participants.</w:t>
       </w:r>
       <w:r>
-        <w:t xml:space="preserve"> Twenty-three volunteers (13 male, 10 female) were recruited; five were excluded before analysis for calibration failure or incomplete acquisition, leaving 18, aged 20–54 (median 29): White/Caucasian (12), East Asian (2), Black/African, Middle Eastern, Asian-Indian and mixed background (1 each). Exclusion criteria were photosensitive migraine, epilepsy, motion sickness and substance use affecting oculomotor function. Three participants wore glasses and were retained, because vision correction is often needed to complete a cognitive protocol. One participant has no usable ground-truth recording, so utility analyses use 17 participants and privacy analyses 18. The study was approved by the institutional ethics committee (reference withheld for review), and all participants gave written informed consent.</w:t>
+        <w:t xml:space="preserve"> We recruited 23 volunteers (13 male, 10 female). Five were excluded before analysis because of calibration failure or incomplete recordings, which left 18 participants aged 20 to 54 (median 29). Twelve described themselves as White/Caucasian, two as East Asian, and one each as Black/African, Middle Eastern, Asian-Indian and mixed background. People with photosensitive migraine, epilepsy, motion sickness or substance use affecting oculomotor function were not included. Three participants wore glasses, and we kept them because many people need vision correction to complete a cognitive protocol. One participant has no usable ground-truth recording, so the utility analyses use 17 participants and the privacy analyses use 18. The study was approved by the institutional ethics committee (reference withheld for review), and all participants gave written informed consent.</w:t>
       </w:r>
     </w:p>
     <w:p>
@@ -395,7 +386,7 @@
         <w:t>Apparatus and tasks.</w:t>
       </w:r>
       <w:r>
-        <w:t xml:space="preserve"> Participants sat 80–120 cm from a 53.3 × 29.6 cm display (1920 × 1080 px) without head restraint (Figure 2). An EyeLink 1000 recorded ground truth at 1000 Hz after nine-point calibration; a smartphone (Xiaomi Mi 8) mounted below the display recorded the face with its rear camera at 30 fps. The battery, designed with rehabilitation specialists and informed by [valliappan20], comprised fixation stability, prosaccades, anti-saccades, smooth pursuit, optokinetic nystagmus, free viewing of 30 OSIE scenes [osie] and visual search in 12 of them, presented with PsychoPy. Blink frames were retained and annotated.</w:t>
+        <w:t xml:space="preserve"> Participants sat 80–120 cm from a 53.3 × 29.6 cm display (1920 × 1080 px) without head restraint (Figure 2). An EyeLink 1000 recorded gaze at 1000 Hz after a nine-point calibration, and a smartphone (Xiaomi Mi 8) mounted below the display filmed the face with its rear camera at 30 fps. The task battery was designed with rehabilitation specialists, following [valliappan20], and consisted of fixation stability, prosaccades, anti-saccades, smooth pursuit, optokinetic nystagmus, free viewing of 30 OSIE scenes [osie] and visual search in 12 of these scenes. All tasks were presented with PsychoPy. Blink frames were kept and annotated.</w:t>
       </w:r>
     </w:p>
     <w:p>
@@ -409,7 +400,7 @@
         <w:t>Synchronisation.</w:t>
       </w:r>
       <w:r>
-        <w:t xml:space="preserve"> A 0.6 s tone preceding each block was recorded by the phone and timestamped by the experiment software. Its detected onset anchors video frames to EyeLink time, and the ground truth is resampled to 30 Hz, so each frame carries a gaze coordinate.</w:t>
+        <w:t xml:space="preserve"> Each block began with a 0.6 s tone, which the phone recorded and the experiment software timestamped. We use the detected onset to align video frames with EyeLink time and resample the ground truth to 30 Hz, so that each frame carries a gaze coordinate.</w:t>
       </w:r>
     </w:p>
     <w:p>
@@ -434,7 +425,7 @@
         <w:t>Figure 2.</w:t>
       </w:r>
       <w:r>
-        <w:t xml:space="preserve"> Data acquisition. (A) Participant station: display at 80–120 cm, smartphone below it, EyeLink 1000 recording ground truth. (B) Control workstation.</w:t>
+        <w:t xml:space="preserve"> Data acquisition. (A) Participant station with the display at 80–120 cm, the smartphone below it and the EyeLink 1000 recording ground truth. (B) Control workstation.</w:t>
       </w:r>
     </w:p>
     <w:p>
@@ -450,7 +441,7 @@
         <w:spacing w:after="120"/>
       </w:pPr>
       <w:r>
-        <w:t>All models take the left-eye, right-eye and face crops (224 × 224) and a 25 × 25 face grid, and regress the gaze point on the display. We evaluate four published architectures (Table 1, Figure 3): two fuse streams late, and two modulate eye features with a guidance factor regressed from the face. Training minimises mean squared error; we report mean Euclidean error in centimetres on the display. We use participant-wise five-fold cross-validation [kfold], re-initialise weights for every fold, keep the best validation epoch, and train every configuration from five independent initialisations, whose spread is the noise floor of all utility comparisons. Arms are compared on the uncalibrated model; for the clinical analysis (§8.4) the regression head is additionally fine-tuned per participant on calibration frames recorded before the tasks. A face-only model, which receives no eye crops, serves as a null control.</w:t>
+        <w:t>All models take the left-eye, right-eye and face crops (224 × 224) together with a 25 × 25 face grid and regress the gaze point on the display. We evaluate four published architectures (Table 1, Figure 3). Two fuse the streams late, and two use a guidance factor regressed from the face to modulate the eye features. Models are trained with a mean-squared-error loss, and we report the mean Euclidean error in centimetres on the display. We use participant-wise five-fold cross-validation [kfold], re-initialise the weights for every fold and keep the checkpoint with the lowest validation error. Every configuration is trained from five independent initialisations, and their spread defines the noise floor for all utility comparisons. We compare arms on the uncalibrated model. For the clinical analysis (§8.4) we also fine-tune the regression head for each participant on calibration frames recorded before the tasks. A face-only model, which never sees the eye crops, serves as a null control.</w:t>
       </w:r>
     </w:p>
     <w:p>
@@ -627,7 +618,7 @@
               <w:rPr>
                 <w:sz w:val="17"/>
               </w:rPr>
-              <w:t>CNNs with SE blocks; face-regressed guidance factor</w:t>
+              <w:t>CNNs with SE blocks, face-regressed guidance factor</w:t>
             </w:r>
           </w:p>
         </w:tc>
@@ -668,7 +659,7 @@
               <w:rPr>
                 <w:sz w:val="17"/>
               </w:rPr>
-              <w:t>CNNs with SE blocks; face-regressed guidance factor</w:t>
+              <w:t>CNNs with SE blocks, face-regressed guidance factor</w:t>
             </w:r>
           </w:p>
         </w:tc>
@@ -726,7 +717,7 @@
         <w:spacing w:after="120"/>
       </w:pPr>
       <w:r>
-        <w:t>We test three families that differ in what they edit and how they treat identity. Every operator runs on the original frame, and released crops are re-extracted with the stored per-frame geometry, so they are pixel-comparable across arms.</w:t>
+        <w:t>We test three families of methods that differ in what they edit and how they handle identity. Each method runs on the original frame, and we cut the released crops from the processed frame using the stored per-frame geometry, so crops are pixel-aligned across arms.</w:t>
       </w:r>
     </w:p>
     <w:p>
@@ -737,10 +728,10 @@
         <w:rPr>
           <w:b/>
         </w:rPr>
-        <w:t>Replacement: SimSwap++.</w:t>
+        <w:t>Replacement (SimSwap++).</w:t>
       </w:r>
       <w:r>
-        <w:t xml:space="preserve"> An adapted SimSwap++ [simswappp] transfers a source identity onto the participant's face while preserving pose, expression and gaze direction; each participant maps to the same synthetic appearance in every frame. Two source templates of different appearance (Identity A and B; Figure 4) separate the method from the template. We call this family SimSwap below.</w:t>
+        <w:t xml:space="preserve"> An adapted SimSwap++ [simswappp] transfers a source identity onto the participant's face and preserves pose, expression and gaze direction. Each participant is mapped to the same synthetic appearance in every frame. We use two source templates with different appearance (Identity A and B, Figure 4) to separate the method from the choice of template, and refer to this family as SimSwap below.</w:t>
       </w:r>
     </w:p>
     <w:p>
@@ -751,10 +742,10 @@
         <w:rPr>
           <w:b/>
         </w:rPr>
-        <w:t>Removal: DeepPrivacy2.</w:t>
+        <w:t>Removal (DeepPrivacy2).</w:t>
       </w:r>
       <w:r>
-        <w:t xml:space="preserve"> DeepPrivacy2 [deepprivacy2] inpaints the detected face box (face mode) or the whole person, guided by a dense surface map (full-body mode). The latent code is fixed per participant or drawn per frame (truncation 1.0).</w:t>
+        <w:t xml:space="preserve"> DeepPrivacy2 [deepprivacy2] inpaints either the detected face box (face mode) or the whole person, guided by a dense surface map (full-body mode). The latent code is either fixed per participant or drawn anew for each frame, with truncation set to 1.0.</w:t>
       </w:r>
     </w:p>
     <w:p>
@@ -765,10 +756,10 @@
         <w:rPr>
           <w:b/>
         </w:rPr>
-        <w:t>Diffusion: FAMS.</w:t>
+        <w:t>Diffusion (FAMS).</w:t>
       </w:r>
       <w:r>
-        <w:t xml:space="preserve"> Face Anonymization Made Simple [fams] conditions a diffusion model on the source face and pastes back an aligned square covering face, forehead and some hair. We use the authors' setting (anonymisation degree 1.25, 25 steps, guidance 4.0) with the noise seed fixed per participant or drawn per frame, on all 210,924 task frames, and sweep the degree from 1.35 to 3.0 on a privacy sample (§7).</w:t>
+        <w:t xml:space="preserve"> Face Anonymization Made Simple [fams] conditions a diffusion model on the source face and pastes an aligned square covering the face, forehead and part of the hair back into the frame. We use the authors' setting (anonymisation degree 1.25, 25 steps, guidance 4.0) with the noise seed either fixed per participant or drawn per frame, on all 210,924 task frames. We also sweep the degree from 1.35 to 3.0 on a privacy sample (§7).</w:t>
       </w:r>
     </w:p>
     <w:p>
@@ -782,7 +773,7 @@
         <w:t>Release protocols.</w:t>
       </w:r>
       <w:r>
-        <w:t xml:space="preserve"> </w:t>
+        <w:t xml:space="preserve"> In </w:t>
       </w:r>
       <w:r>
         <w:rPr>
@@ -791,7 +782,7 @@
         <w:t>Full Synthetic</w:t>
       </w:r>
       <w:r>
-        <w:t xml:space="preserve"> takes every crop from the de-identified frame. </w:t>
+        <w:t xml:space="preserve">, every crop is taken from the de-identified frame. In </w:t>
       </w:r>
       <w:r>
         <w:rPr>
@@ -800,7 +791,7 @@
         <w:t>Hybrid</w:t>
       </w:r>
       <w:r>
-        <w:t xml:space="preserve"> combines the de-identified face crop with the original eye crops (Figure 5), testing whether the face can be de-identified while the eyes stay genuine. As §7 shows, Hybrid preserves utility, not privacy.</w:t>
+        <w:t>, the de-identified face crop is combined with the original eye crops (Figure 5), which tests whether the face can be de-identified while the eyes remain genuine. Section 7 shows that Hybrid preserves utility but not privacy.</w:t>
       </w:r>
     </w:p>
     <w:p>
@@ -825,7 +816,7 @@
         <w:t>Figure 4.</w:t>
       </w:r>
       <w:r>
-        <w:t xml:space="preserve"> SimSwap++ with two source templates (Identity A and B): identity is replaced; pose, expression and surroundings are preserved.</w:t>
+        <w:t xml:space="preserve"> SimSwap++ with two source templates (Identity A and B). Identity is replaced, while pose, expression and surroundings are preserved.</w:t>
       </w:r>
     </w:p>
     <w:p>
@@ -850,7 +841,7 @@
         <w:t>Figure 5.</w:t>
       </w:r>
       <w:r>
-        <w:t xml:space="preserve"> Release protocols. (A) Full Synthetic: all crops from the de-identified frame. (B) Hybrid: de-identified face crop with the original eye crops.</w:t>
+        <w:t xml:space="preserve"> Release protocols. (A) Full Synthetic, with all crops taken from the de-identified frame. (B) Hybrid, combining the de-identified face crop with the original eye crops.</w:t>
       </w:r>
     </w:p>
     <w:p>
@@ -869,10 +860,10 @@
         <w:rPr>
           <w:b/>
         </w:rPr>
-        <w:t>Released artefact.</w:t>
+        <w:t>Released data.</w:t>
       </w:r>
       <w:r>
-        <w:t xml:space="preserve"> A release contains the cropped streams the models consume — face crop, two eye crops and face grid — not the video. All attacks operate on these crops.</w:t>
+        <w:t xml:space="preserve"> A release contains the cropped streams the models use (the face crop, the two eye crops and the face grid) and not the video. All attacks operate on these crops.</w:t>
       </w:r>
     </w:p>
     <w:p>
@@ -886,25 +877,7 @@
         <w:t>Attacks.</w:t>
       </w:r>
       <w:r>
-        <w:t xml:space="preserve"> </w:t>
-      </w:r>
-      <w:r>
-        <w:rPr>
-          <w:i/>
-        </w:rPr>
-        <w:t>A1, re-identification from photographs,</w:t>
-      </w:r>
-      <w:r>
-        <w:t xml:space="preserve"> is the primary threat: the attacker holds photographs of candidate individuals, for instance members of the recruitment pool, and asks whom a released crop shows. Gallery images are original crops from the first half of each recording; probes are released crops from the second half. </w:t>
-      </w:r>
-      <w:r>
-        <w:rPr>
-          <w:i/>
-        </w:rPr>
-        <w:t>A2, linkability,</w:t>
-      </w:r>
-      <w:r>
-        <w:t xml:space="preserve"> tests a property rather than an adversary: whether the content alone lets frames be grouped by individual. It operationalises two of the three criteria by which the Article 29 Working Party assesses anonymisation, singling out and linkability [wp29anon]; records that can be isolated per person remain personal data even without a name [gdpr]. A usable gaze corpus keeps each participant's frames together for participant-wise splits and calibration, and is therefore linkable by construction; A2 asks whether the content would restore that grouping if identifiers were removed. The two tests can differ by 60 points on identical crops (Figure S2).</w:t>
+        <w:t xml:space="preserve"> We treat re-identification from photographs (A1) as the primary threat. The attacker holds photographs of candidate individuals, for example members of the recruitment pool, and asks which of them a released crop shows. The gallery consists of original crops from the first half of each recording and the probes are released crops from the second half. The second test (A2) concerns a property of the data, namely whether the content alone allows frames to be grouped by individual. It corresponds to two of the three criteria the Article 29 Working Party uses to assess anonymisation, singling out and linkability [wp29anon], and records that can be isolated per person remain personal data even when no name is attached [gdpr]. A usable gaze corpus has to keep each participant's frames together for participant-wise splits and calibration, so it is linkable by construction. A2 asks whether the content would restore this grouping if the identifiers were removed. On the same crops the two tests can differ by 60 points (Figure S2).</w:t>
       </w:r>
     </w:p>
     <w:p>
@@ -918,7 +891,7 @@
         <w:t>Recognisers.</w:t>
       </w:r>
       <w:r>
-        <w:t xml:space="preserve"> ArcFace (InsightFace buffalo_l, w600k_r50) is used without adaptation, with cosine similarity to per-participant templates. Key measurements are repeated with FaceNet (Inception-ResNet-v1 trained on VGGFace2), which differs in backbone, training data and objective. Each recogniser is quoted against its own floor (ArcFace 1.57%, FaceNet 3.52%). Detection and alignment are taken from the original frame, so a method gains nothing by defeating the detector.</w:t>
+        <w:t xml:space="preserve"> We use ArcFace (InsightFace buffalo_l, w600k_r50) without adaptation and compare embeddings to per-participant templates by cosine similarity. The key measurements are repeated with FaceNet (Inception-ResNet-v1 trained on VGGFace2), which differs from ArcFace in backbone, training data and objective. Each recogniser is compared against its own floor (1.57% for ArcFace and 3.52% for FaceNet). Faces are detected and aligned on the original frame, so a method cannot appear private simply by defeating the detector.</w:t>
       </w:r>
     </w:p>
     <w:p>
@@ -932,7 +905,7 @@
         <w:t>Metrics.</w:t>
       </w:r>
       <w:r>
-        <w:t xml:space="preserve"> For A1, TAR at FAR = 1e-3 is primary; closed-set Rank-1 is not evidence on these data (below). For A2 we report the adjusted Rand index (ARI) of a k-means partition at the true k = 18, the k selected unaided by silhouette, and within-release verification (first-half templates, second-half probes).</w:t>
+        <w:t xml:space="preserve"> For A1 we report the true-accept rate (TAR) at a false-accept rate (FAR) of 1e-3. Closed-set Rank-1 is not informative on these data, as explained below. For A2 we report the adjusted Rand index (ARI) of a k-means partition at the true k = 18, the k chosen without supervision by the silhouette score, and verification within the release, with templates from the first half and probes from the second half of each recording.</w:t>
       </w:r>
     </w:p>
     <w:p>
@@ -946,7 +919,7 @@
         <w:t>Session-nuisance floor.</w:t>
       </w:r>
       <w:r>
-        <w:t xml:space="preserve"> Each participant was recorded in one session, so lighting, seating and background are constant within a participant and differ between participants. Running every attack on a 120 px face-free patch of the same frames gives Rank-1 50.5% (chance 5.6%), TAR 1.6% and ARI 0.089 (0.074 for the eye pipeline), with k = 2 selected. Rank-1 is therefore uninformative here; TAR and ARI are read against these floors.</w:t>
+        <w:t xml:space="preserve"> Each participant was recorded in a single session, so lighting, seating and background are constant for each person but differ between people. Running every attack on a 120 px face-free patch of the same frames gives a Rank-1 of 50.5% (chance is 5.6%), a TAR of 1.6% and an ARI of 0.089 (0.074 for the eye pipeline), with k = 2 selected. Rank-1 is therefore uninformative here, and we read TAR and ARI against these floors.</w:t>
       </w:r>
     </w:p>
     <w:p>
@@ -960,7 +933,7 @@
         <w:t>Uncertainty.</w:t>
       </w:r>
       <w:r>
-        <w:t xml:space="preserve"> Privacy intervals are 95% participant-level cluster bootstraps. Verification intervals keep the full-data operating threshold and resample participants' genuine scores (2,000 replicates), because re-estimating a 1-in-1,000 impostor quantile in each resample biases the interval upward. Linkage intervals resample participants, give duplicates a shared label, and refit (1,000 replicates).</w:t>
+        <w:t xml:space="preserve"> All privacy intervals are 95% participant-level cluster bootstraps. For verification we keep the operating threshold estimated on the full data and resample participants' genuine scores (2,000 replicates), because re-estimating a 1-in-1,000 impostor quantile in each resample biases the interval upward. For linkage we resample participants, give duplicated participants a shared label and refit (1,000 replicates).</w:t>
       </w:r>
     </w:p>
     <w:p>
@@ -974,7 +947,7 @@
         <w:t>Tooling.</w:t>
       </w:r>
       <w:r>
-        <w:t xml:space="preserve"> All attacks, floors and intervals are packaged as privaudit, which maps each result onto the release checklist. On this study's saved embeddings it reproduces all 32 eye-crop verification and linkage values exactly; re-embedding the crops from scratch, all 46 audited values agree within GPU inference noise.</w:t>
+        <w:t xml:space="preserve"> All attacks, floors and intervals are implemented in privaudit, which maps each result onto the release checklist. Run on the embeddings saved in this study, it reproduces all 32 eye-crop verification and linkage values exactly. When the crops are re-embedded from scratch, all 46 audited values agree within GPU inference noise.</w:t>
       </w:r>
     </w:p>
     <w:p>
@@ -990,7 +963,7 @@
         <w:spacing w:after="120"/>
       </w:pPr>
       <w:r>
-        <w:t>Table 2 summarises SimSwap under both tests, Table 3 gives face-crop A1 for every family, and Figure 6 gives linkage.</w:t>
+        <w:t>Table 2 summarises the results for SimSwap under both tests, Table 3 reports face-crop A1 for every family and Figure 6 shows the linkage results.</w:t>
       </w:r>
     </w:p>
     <w:p>
@@ -1001,10 +974,10 @@
         <w:rPr>
           <w:b/>
         </w:rPr>
-        <w:t>The eye region identifies.</w:t>
+        <w:t>Eye crops.</w:t>
       </w:r>
       <w:r>
-        <w:t xml:space="preserve"> An unprocessed 120 px eye crop verifies at 66.6% (left) and 62.2% (right) under ArcFace, and at 69.1% and 81.2% under FaceNet, against floors of 1.6% and 3.5%. Hybrid retains these crops and therefore their leakage: what restores utility in Hybrid also releases the eye biometric.</w:t>
+        <w:t xml:space="preserve"> An unprocessed 120 px eye crop verifies at 66.6% (left) and 62.2% (right) with ArcFace, and at 69.1% and 81.2% with FaceNet, against floors of 1.6% and 3.5%. Hybrid releases these crops unchanged and therefore leaks the same information. The component that restores utility in Hybrid is also the one that exposes the eye biometric.</w:t>
       </w:r>
     </w:p>
     <w:p>
@@ -1015,10 +988,10 @@
         <w:rPr>
           <w:b/>
         </w:rPr>
-        <w:t>Synthesis protects eye crops, not face crops.</w:t>
+        <w:t>Synthesised eyes and faces.</w:t>
       </w:r>
       <w:r>
-        <w:t xml:space="preserve"> With the eyes synthesised, eye-crop A1 falls to 0.2% and 1.8% (FaceNet 0.0% and 1.5%), at the floor for both templates and both recognisers. The synthetic face crop still verifies at 18.4% [5.1, 35.4] (Identity A) and 22.0% [6.8, 40.7] (Identity B) under ArcFace. FaceNet agrees for Identity A (14.4% against its 3.5% floor) but not for Identity B (0.2%). With 18 participants, these intervals support "above floor, an order of magnitude below unprocessed imagery", not a finer grading.</w:t>
+        <w:t xml:space="preserve"> When the eyes are synthesised as well, eye-crop A1 drops to 0.2% and 1.8% (FaceNet 0.0% and 1.5%), which is at the floor for both templates and both recognisers. The synthetic face crop is a different matter. With ArcFace it still verifies at 18.4% [5.1, 35.4] for Identity A and 22.0% [6.8, 40.7] for Identity B. FaceNet agrees for Identity A (14.4% against its 3.5% floor) but not for Identity B (0.2%). With 18 participants the intervals support a statement that the face crop is above the floor and an order of magnitude below unprocessed imagery, and nothing finer.</w:t>
       </w:r>
     </w:p>
     <w:p>
@@ -1029,10 +1002,10 @@
         <w:rPr>
           <w:b/>
         </w:rPr>
-        <w:t>The release remains linkable.</w:t>
+        <w:t>Linkage within the release.</w:t>
       </w:r>
       <w:r>
-        <w:t xml:space="preserve"> An unsupervised partition recovers the participants exactly from face crops (ARI 1.000 at k = 18; floor 0.089) for both templates, because replacement maps each participant to the same synthetic appearance every time. The synthetic eye crops that score 0.2% under A1 verify at 42.8% and 62.5% within the release. Linkage persists in the 120 px eye crop, which excludes hair, clothing and face outline: ARI 0.68–0.79 against 0.84–0.85 for unprocessed eyes, with overlapping intervals (e.g. [0.59, 0.86] against [0.70, 0.96]).</w:t>
+        <w:t xml:space="preserve"> An unsupervised partition of the face crops recovers the participants exactly (ARI 1.000 at k = 18, floor 0.089) for both templates, because each participant is always mapped to the same synthetic appearance. Synthetic eye crops that reach only 0.2% under A1 verify at 42.8% and 62.5% within the release. Linkage also survives in the 120 px eye crop, which excludes hair, clothing and the face outline, with ARI 0.68–0.79 compared with 0.84–0.85 for unprocessed eyes and overlapping intervals (for example [0.59, 0.86] and [0.70, 0.96]).</w:t>
       </w:r>
     </w:p>
     <w:p>
@@ -1046,7 +1019,7 @@
         <w:t>Table 2.</w:t>
       </w:r>
       <w:r>
-        <w:t xml:space="preserve"> SimSwap under A1 (TAR at FAR 1e-3, ArcFace) and A2 (ARI at k = 18), with 95% participant-level intervals. Hybrid face crops are synthetic; its eye crops are unaltered.</w:t>
+        <w:t xml:space="preserve"> SimSwap under A1 (TAR at FAR 1e-3, ArcFace) and A2 (ARI at k = 18), with 95% participant-level intervals. In Hybrid the face crops are synthetic and the eye crops are unaltered.</w:t>
       </w:r>
     </w:p>
     <w:tbl>
@@ -1704,10 +1677,10 @@
         <w:rPr>
           <w:b/>
         </w:rPr>
-        <w:t>Linkage is not an illumination artefact, but photometry also links.</w:t>
+        <w:t>Illumination and photometry.</w:t>
       </w:r>
       <w:r>
-        <w:t xml:space="preserve"> Removing per-crop brightness and contrast leaves eye-crop linkage intact (ARI 0.684 → 0.742), local histogram equalisation reduces it by only 0.05–0.14, and a large within-session illumination change (dark-screen versus natural-image blocks) does not reduce it. The recogniser therefore does not depend on photometry. Conversely, 21 photometric statistics per crop link participants without any face model (ARI 0.87–0.90), and identity replacement leaves them unchanged. The two channels are independent, so normalising photometry closes only the second; on single-session data, the photometric channel also mixes person and recording (§11). Crop geometry is a third channel: face and eye crop sizes alone identify 66.7% of participants, and 94.4% with inter-ocular distance. Our release normalises crop geometry.</w:t>
+        <w:t xml:space="preserve"> Removing per-crop brightness and contrast does not reduce eye-crop linkage (ARI 0.684 to 0.742), local histogram equalisation lowers it by only 0.05–0.14, and a large change in illumination within the session (dark-screen against natural-image blocks) does not lower it at all. The recogniser therefore does not depend on photometry. Photometry on its own also links, however. Twenty-one photometric statistics per crop group the participants without any face model (ARI 0.87–0.90), and identity replacement leaves them unchanged. The two channels are independent, so normalising photometry removes only the second one. On single-session data the photometric channel also mixes properties of the person with properties of the recording (§11). Crop geometry provides a third channel, since face and eye crop sizes alone identify 66.7% of participants and 94.4% once inter-ocular distance is added. Our release uses fixed crop sizes.</w:t>
       </w:r>
     </w:p>
     <w:p>
@@ -1718,10 +1691,10 @@
         <w:rPr>
           <w:b/>
         </w:rPr>
-        <w:t>A two-part condition, tested on a second family.</w:t>
+        <w:t>A two-part condition, tested on DeepPrivacy2.</w:t>
       </w:r>
       <w:r>
-        <w:t xml:space="preserve"> DeepPrivacy2 removes rather than replaces identity. Its face mode edits 40% more of the crop than SimSwap; its full-body mode repaints the whole person, motivated by the concern that face anonymisation leaves identifiers outside the face [deepprivacy2]. Crossing edit domain with identity regime (Figure 6a), face-crop linkage is 1.000 with face editing and a fixed identity, 0.982 when either the domain is widened or the identity is resampled per frame, and 0.297 only when both are; an attacker who must estimate the cohort size then finds no structure (k = 2, ARI 0.000). Verification falls from 89.7–100% to 35.7% [27, 45], still well above the 1.6% floor: the condition prevents discovery of the partition, not verification by someone holding labelled frames. The fixed-identity full-body arm has the same low resolution and still links at 0.982, so the collapse reflects the identity regime rather than image quality. On the eye crop, which contains only edited pixels, per-frame identity alone suffices (ARI 0.805 → 0.148; floor 0.074). Against A1, every DeepPrivacy2 arm is at the floor on eye crops (≤ 1.2%) and face crops (≤ 1.6%; Table 3), consistent with DeepPrivacy2's own evaluation, which matches enrolment images to the release and does not test linkage.</w:t>
+        <w:t xml:space="preserve"> DeepPrivacy2 removes identity instead of replacing it. In face mode it edits 40% more of the crop than SimSwap, and in full-body mode it repaints the whole person, a mode motivated by the concern that face anonymisation leaves identifiers outside the face [deepprivacy2]. We cross the edit region with the identity regime (Figure 6a). Face-crop linkage is 1.000 with face editing and a fixed identity, 0.982 when either the region is widened or the identity is redrawn per frame, and 0.297 only when both are changed. An attacker who has to estimate the cohort size then finds no structure (k = 2, ARI 0.000). Verification falls from 89.7–100% to 35.7% [27, 45], which is still far above the 1.6% floor. The condition thus prevents an attacker from discovering the partition but not from verifying identities with a few labelled frames. The fixed-identity full-body arm has the same low resolution and still links at 0.982, so the drop comes from the identity regime and not from image quality. On the eye crop, which contains only edited pixels, drawing a new identity per frame is enough on its own (ARI 0.805 to 0.148, floor 0.074). Under A1 every DeepPrivacy2 arm is at the floor for eye crops (at most 1.2%) and face crops (at most 1.6%, Table 3). This agrees with DeepPrivacy2's own evaluation, which matches enrolment images to the release and does not test linkage.</w:t>
       </w:r>
     </w:p>
     <w:p>
@@ -1732,10 +1705,10 @@
         <w:rPr>
           <w:b/>
         </w:rPr>
-        <w:t>A diffusion method behaves as the condition predicts.</w:t>
+        <w:t>Diffusion-based de-identification.</w:t>
       </w:r>
       <w:r>
-        <w:t xml:space="preserve"> In FAMS, fixing the noise seed per participant does not fix the synthetic identity, which follows the source frame; the two seed regimes are indistinguishable on every measure. FAMS therefore breaks per-participant consistency by construction. Eye-crop linkage roughly halves (within-release verification 5–8% against 43–63% for SimSwap; ARI 0.29–0.33 against 0.68–0.80), though every interval stays above the eye floor. The face crop, whose border, pose and geometry the aligned square leaves intact, stays linkable (ARI 0.85–0.94). It also verifies against the participant's photographs at 24.1% [15.3, 33.6] under ArcFace, no lower than SimSwap, whereas FaceNet places it near its floor (5.9% [2.2, 10.5]; Table 3).</w:t>
+        <w:t xml:space="preserve"> In FAMS, fixing the noise seed per participant does not fix the synthetic identity, which follows the source frame, and the two seed regimes are indistinguishable on every measure. FAMS therefore breaks per-participant consistency by design. Eye-crop linkage roughly halves (within-release verification of 5–8% against 43–63% for SimSwap, and ARI 0.29–0.33 against 0.68–0.80), but all intervals remain above the eye floor. The face crop, whose border, pose and geometry lie outside the aligned square that FAMS edits, remains linkable (ARI 0.85–0.94). It also still verifies against the participant's photographs at 24.1% [15.3, 33.6] with ArcFace, no lower than SimSwap, whereas FaceNet places it close to its floor (5.9% [2.2, 10.5], Table 3).</w:t>
       </w:r>
     </w:p>
     <w:p>
@@ -1749,7 +1722,7 @@
         <w:t>Table 3.</w:t>
       </w:r>
       <w:r>
-        <w:t xml:space="preserve"> Face-crop A1 for every family: released face crops matched against the participant's original face crops. TAR at FAR 1e-3 with 95% participant-level intervals; floors 1.6% (ArcFace) and 3.52% (FaceNet).</w:t>
+        <w:t xml:space="preserve"> Face-crop A1 for every family: released face crops matched against the participant's original face crops. TAR at FAR 1e-3 with 95% participant-level intervals. The floors are 1.6% for ArcFace and 3.52% for FaceNet.</w:t>
       </w:r>
     </w:p>
     <w:tbl>
@@ -2145,10 +2118,10 @@
         <w:rPr>
           <w:b/>
         </w:rPr>
-        <w:t>Strength trades pupil signal for identity, not for linkability.</w:t>
+        <w:t>Anonymisation strength.</w:t>
       </w:r>
       <w:r>
-        <w:t xml:space="preserve"> Raising the FAMS degree from 1.25 to 1.5 — the strongest setting that still produces a face in more than 90% of frames; beyond it the generator degrades rather than anonymises — lowers ArcFace face verification from 24.1% to 10.1% [3.0, 19.3]; FaceNet reaches its floor from 1.35. Face-crop linkage is unchanged (ARI 0.81–0.90), and the correlation between the synthetic pupil and true horizontal gaze falls from 0.68 to 0.53 (Table 4; §8.1).</w:t>
+        <w:t xml:space="preserve"> Raising the FAMS degree from 1.25 to 1.5 reduces ArcFace face verification from 24.1% to 10.1% [3.0, 19.3], and FaceNet reaches its floor from 1.35 onwards. Degree 1.5 is the strongest setting at which the generator still produces a face in more than 90% of frames, and beyond it the output mostly degrades. Face-crop linkage does not change (ARI 0.81–0.90), and the correlation between the synthetic pupil and true horizontal gaze drops from 0.68 to 0.53 (Table 4, §8.1). Stronger settings therefore buy identity protection with pupil signal and leave linkability where it was.</w:t>
       </w:r>
     </w:p>
     <w:p>
@@ -2162,7 +2135,7 @@
         <w:t>Table 4.</w:t>
       </w:r>
       <w:r>
-        <w:t xml:space="preserve"> FAMS strength sweep on the privacy sample. Settings with more than 10% non-face outputs are not used for privacy conclusions. Pupil r: correlation of the synthetic pupil with horizontal EyeLink gaze (unprocessed 0.87; SimSwap A 0.79).</w:t>
+        <w:t xml:space="preserve"> FAMS strength sweep on the privacy sample. Settings with more than 10% non-face outputs are not used for privacy conclusions. Pupil r: correlation of the synthetic pupil with horizontal EyeLink gaze (0.87 for unprocessed data and 0.79 for SimSwap A). n/a: not evaluated.</w:t>
       </w:r>
     </w:p>
     <w:tbl>
@@ -2781,7 +2754,7 @@
               <w:rPr>
                 <w:sz w:val="17"/>
               </w:rPr>
-              <w:t>—</w:t>
+              <w:t>n/a</w:t>
             </w:r>
           </w:p>
         </w:tc>
@@ -2794,7 +2767,7 @@
               <w:rPr>
                 <w:sz w:val="17"/>
               </w:rPr>
-              <w:t>—</w:t>
+              <w:t>n/a</w:t>
             </w:r>
           </w:p>
         </w:tc>
@@ -2807,7 +2780,7 @@
               <w:rPr>
                 <w:sz w:val="17"/>
               </w:rPr>
-              <w:t>—</w:t>
+              <w:t>n/a</w:t>
             </w:r>
           </w:p>
         </w:tc>
@@ -2820,7 +2793,7 @@
               <w:rPr>
                 <w:sz w:val="17"/>
               </w:rPr>
-              <w:t>—</w:t>
+              <w:t>n/a</w:t>
             </w:r>
           </w:p>
         </w:tc>
@@ -2833,7 +2806,7 @@
               <w:rPr>
                 <w:sz w:val="17"/>
               </w:rPr>
-              <w:t>—</w:t>
+              <w:t>n/a</w:t>
             </w:r>
           </w:p>
         </w:tc>
@@ -2851,7 +2824,7 @@
         <w:t>Other residual risks.</w:t>
       </w:r>
       <w:r>
-        <w:t xml:space="preserve"> An adaptive attacker who fits a de-anonymisation map on other participants' paired imagery gains at most 3.3 points on the face crop and nothing on eye crops; fitted including the target, the same maps reach 100% Rank-1, so they memorise identities rather than invert the operator. Our open tier, which releases per-frame gaze estimates and oculomotor measures without imagery, links at ARI 0.033 at the correct k (purity 0.157 against 0.059 chance; permutation-null maximum 0.0015): low but not zero.</w:t>
+        <w:t xml:space="preserve"> An adaptive attacker who learns a de-anonymisation mapping from other participants' paired images gains at most 3.3 points on the face crop and nothing on the eye crops. When the target is included in the fit, the same mappings reach 100% Rank-1, which indicates that they memorise identities and do not invert the method. Our open tier, which releases per-frame gaze estimates and oculomotor measures without any images, links at an ARI of 0.033 at the correct k (purity 0.157 against 0.059 by chance, with a permutation-null maximum of 0.0015). This risk is low but not zero.</w:t>
       </w:r>
     </w:p>
     <w:p>
@@ -2913,7 +2886,7 @@
         <w:t>(a)</w:t>
       </w:r>
       <w:r>
-        <w:t xml:space="preserve"> DeepPrivacy2 face crops, edit domain (face box or whole person) crossed with identity regime (fixed or per frame): ARI at k = 18 and within-release verification (TAR at FAR 1e-3, 95% interval). Only the cell meeting both halves of the condition falls (ARI 0.297), and verification there remains 36%. </w:t>
+        <w:t xml:space="preserve"> DeepPrivacy2 face crops with the edit region (face box or whole person) crossed with the identity regime (fixed or per frame). Cells give the ARI at k = 18 and within-release verification (TAR at FAR 1e-3 with 95% interval). Linkage falls only in the cell that meets both parts of the condition (ARI 0.297), and verification there is still 36%. </w:t>
       </w:r>
       <w:r>
         <w:rPr>
@@ -2922,7 +2895,7 @@
         <w:t>(b)</w:t>
       </w:r>
       <w:r>
-        <w:t xml:space="preserve"> Eye-crop linkage for every arm with 95% participant-level intervals; dashed line, eye floor (0.074). Fixed-identity SimSwap and DeepPrivacy2 overlap unprocessed eyes; per-frame DeepPrivacy2 approaches the floor (0.12–0.17); FAMS lies between (0.29–0.33) under either seed regime.</w:t>
+        <w:t xml:space="preserve"> Eye-crop linkage for every arm with 95% participant-level intervals, with the eye floor (0.074) as a dashed line. SimSwap and fixed-identity DeepPrivacy2 overlap with unprocessed eyes, per-frame DeepPrivacy2 approaches the floor (0.12–0.17), and FAMS lies in between (0.29–0.33) under both seed regimes.</w:t>
       </w:r>
     </w:p>
     <w:p>
@@ -2949,10 +2922,10 @@
         <w:rPr>
           <w:b/>
         </w:rPr>
-        <w:t>Four train–test conditions,</w:t>
+        <w:t>Train–test conditions.</w:t>
       </w:r>
       <w:r>
-        <w:t xml:space="preserve"> named train→test, with R for real and D for de-identified data:</w:t>
+        <w:t xml:space="preserve"> We name each condition by what the model was trained and tested on, with R for real and D for de-identified data.</w:t>
       </w:r>
     </w:p>
     <w:p>
@@ -2963,10 +2936,10 @@
         <w:rPr>
           <w:b/>
         </w:rPr>
-        <w:t>R→R</w:t>
+        <w:t>R→R.</w:t>
       </w:r>
       <w:r>
-        <w:t xml:space="preserve"> — trained and tested on real data; the reference for every penalty.</w:t>
+        <w:t xml:space="preserve"> Trained and tested on real data. Every penalty below is measured against this reference.</w:t>
       </w:r>
     </w:p>
     <w:p>
@@ -2977,10 +2950,10 @@
         <w:rPr>
           <w:b/>
         </w:rPr>
-        <w:t>R→D</w:t>
+        <w:t>R→D.</w:t>
       </w:r>
       <w:r>
-        <w:t xml:space="preserve"> — trained on real data, tested on de-identified crops: the cost to a pipeline that receives de-identified input.</w:t>
+        <w:t xml:space="preserve"> Trained on real data and tested on de-identified crops, which is the cost for a pipeline that receives de-identified input.</w:t>
       </w:r>
     </w:p>
     <w:p>
@@ -2991,10 +2964,10 @@
         <w:rPr>
           <w:b/>
         </w:rPr>
-        <w:t>D→R</w:t>
+        <w:t>D→R.</w:t>
       </w:r>
       <w:r>
-        <w:t xml:space="preserve"> — retrained on the release, tested on real faces: a third party deploying the model on its own users.</w:t>
+        <w:t xml:space="preserve"> Retrained on the release and tested on real faces, as a third party would do when deploying a model on its own users.</w:t>
       </w:r>
     </w:p>
     <w:p>
@@ -3005,10 +2978,10 @@
         <w:rPr>
           <w:b/>
         </w:rPr>
-        <w:t>D→D</w:t>
+        <w:t>D→D.</w:t>
       </w:r>
       <w:r>
-        <w:t xml:space="preserve"> — retrained and tested on the release.</w:t>
+        <w:t xml:space="preserve"> Retrained and tested on the release.</w:t>
       </w:r>
     </w:p>
     <w:p>
@@ -3016,7 +2989,7 @@
         <w:spacing w:after="120"/>
       </w:pPr>
       <w:r>
-        <w:t>Retraining uses the R→R recipe, partition and hyperparameters. Read together, R→D and D→R separate domain shift, which retraining removes, from information loss, which it does not.</w:t>
+        <w:t>Retraining uses the R→R recipe, participant partition and hyperparameters. Comparing R→D with D→R separates domain shift, which retraining removes, from information loss, which it cannot recover.</w:t>
       </w:r>
     </w:p>
     <w:p>
@@ -3030,7 +3003,7 @@
         <w:t>References.</w:t>
       </w:r>
       <w:r>
-        <w:t xml:space="preserve"> The initialisation noise floor is the spread of R→R over five initialisations (0.04–0.20 cm). The no-information reference is the error of predicting the training participants' mean gaze point, 9.37 cm, a penalty of +3.70 to +4.41 cm depending on the architecture.</w:t>
+        <w:t xml:space="preserve"> The initialisation noise floor is the spread of R→R over five initialisations (0.04–0.20 cm). The no-information reference is the error obtained by always predicting the training participants' mean gaze point. It is 9.37 cm, a penalty of +3.70 to +4.41 cm depending on the architecture.</w:t>
       </w:r>
     </w:p>
     <w:p>
@@ -3044,7 +3017,7 @@
         <w:t>Pupil test.</w:t>
       </w:r>
       <w:r>
-        <w:t xml:space="preserve"> End-to-end error mixes the gaze information in a release with how well models trained on it transfer. We therefore locate both iris centres with FaceMesh [facemesh] on the released and original face crops of the same frames, express each in its eye's corner-to-corner frame, which removes head pose and crop placement, and report the within-participant correlation of the released pupil position with the original position and with EyeLink gaze, on 4,680 frames common to all releases.</w:t>
+        <w:t xml:space="preserve"> End-to-end error confounds the gaze information contained in a release with how well models trained on it transfer. We therefore also measure the pupil directly. FaceMesh [facemesh] locates both iris centres on the released and the original face crop of each frame, and we express each centre in the coordinate frame defined by the corners of its eye, which removes head pose and crop placement. We then compute, within each participant, the correlation of the released pupil position with the original position and with EyeLink gaze, on 4,680 frames shared by all releases.</w:t>
       </w:r>
     </w:p>
     <w:p>
@@ -3066,7 +3039,7 @@
         <w:t>Table 5.</w:t>
       </w:r>
       <w:r>
-        <w:t xml:space="preserve"> Gaze error (cm) under R→D for SimSwap: mean over five folds, then mean ± SD over five initialisations; in parentheses, the change against R→R.</w:t>
+        <w:t xml:space="preserve"> Gaze error (cm) under R→D for SimSwap: mean over five folds, then mean ± SD over five initialisations. Values in parentheses give the change against R→R.</w:t>
       </w:r>
     </w:p>
     <w:tbl>
@@ -3504,7 +3477,7 @@
         <w:spacing w:after="120"/>
       </w:pPr>
       <w:r>
-        <w:t>Restoring the genuine eye crops recovers most of the synthesis penalty. Full Synthetic costs +2.41 to +7.04 cm depending on model and template; Hybrid leaves +0.08 to +1.04 cm, recovering 85–101% (Table 6), and the paired difference is negative in every architecture, template and draw. The residual is small but mostly real: six of eight Hybrid arms are detectably worse than R→R, so Hybrid recovers rather than preserves accuracy. The face-only control, which cannot see the eye crops, gives identical results for both arms (within 0.001 cm), confirming that the comparison measures the eye stream, and the guidance-factor architectures recover as much as the late-fusion ones (AFFNet 92% and 98%). The synthesis penalty depends strongly on the template (Identity B minus A: +0.63 to +3.38 cm for Full Synthetic, −0.34 to +0.86 cm for Hybrid).</w:t>
+        <w:t>Restoring the genuine eye crops recovers most of the synthesis penalty. Full Synthetic costs +2.41 to +7.04 cm depending on the model and template, whereas Hybrid leaves +0.08 to +1.04 cm, which corresponds to a recovery of 85–101% (Table 6). The paired difference is negative for every architecture, template and draw. The remaining gap is small but mostly real, since six of the eight Hybrid arms are measurably worse than R→R, so we describe Hybrid as recovering accuracy, not preserving it. The face-only control, which cannot see the eye crops, gives the same result for both arms (within 0.001 cm), which confirms that the comparison isolates the eye stream. The guidance-factor architectures recover as much as the late-fusion ones (92% and 98% for AFFNet). The synthesis penalty depends strongly on the template (Identity B minus Identity A is +0.63 to +3.38 cm for Full Synthetic and −0.34 to +0.86 cm for Hybrid).</w:t>
       </w:r>
     </w:p>
     <w:p>
@@ -3512,7 +3485,7 @@
         <w:spacing w:after="120"/>
       </w:pPr>
       <w:r>
-        <w:t>DeepPrivacy2 and FAMS under R→D are reported in Table S1. Real-data models deployed on DeepPrivacy2 crops are worse than predicting the mean (14.6–20.5 cm against 9.37 cm), and FAMS costs +4.1 to +5.1 cm, more than SimSwap A (+2.4 to +3.7 cm). Hybrid recovers 91–101% (DeepPrivacy2 face), 93–99% (full body) and 93–100% (FAMS). Every one of the 421,848 full-body frames had the participant repainted; in 1.4% of them a second person region without a surface map was left unedited, outside the released crops. Before any DeepPrivacy2 or FAMS number was computed, the real-data arm re-run through the same pipeline reproduced Table 5 to within 0.0012 cm on all 100 folds.</w:t>
+        <w:t>Results for DeepPrivacy2 and FAMS under R→D are given in Table S1. Real-data models deployed on DeepPrivacy2 crops do worse than predicting the mean (14.6–20.5 cm against 9.37 cm), and FAMS costs +4.1 to +5.1 cm, more than SimSwap A (+2.4 to +3.7 cm). Hybrid recovers 91–101% for DeepPrivacy2 in face mode, 93–99% in full-body mode and 93–100% for FAMS. In all 421,848 full-body frames the participant was repainted. In 1.4% of these frames a second person region without a surface map was left unedited, but it lay outside the released crops. Before computing any DeepPrivacy2 or FAMS result, we re-ran the real-data arm through the same pipeline, and it reproduced Table 5 to within 0.0012 cm on all 100 folds.</w:t>
       </w:r>
     </w:p>
     <w:p>
@@ -3526,7 +3499,7 @@
         <w:t>Table 6.</w:t>
       </w:r>
       <w:r>
-        <w:t xml:space="preserve"> Hybrid minus Full Synthetic under R→D (cm), paired within initialisation, mean ± SD over five draws; negative values mean the genuine eye crops recover accuracy.</w:t>
+        <w:t xml:space="preserve"> Hybrid minus Full Synthetic under R→D (cm), paired within initialisation, mean ± SD over five draws. Negative values mean that the genuine eye crops recover accuracy.</w:t>
       </w:r>
     </w:p>
     <w:tbl>
@@ -3894,7 +3867,7 @@
         <w:t>Table 7.</w:t>
       </w:r>
       <w:r>
-        <w:t xml:space="preserve"> Penalty against R→R (cm): mean over MobileNet-V3 Large, AFFNet and MGazeNet, with [min, max] across them; D→R and D→D over five initialisations each. R→R errors are 4.98, 5.67 and 4.96 cm. FS: Full Synthetic; DP2: DeepPrivacy2. Negative Hybrid values denote no detectable difference, not gains.</w:t>
+        <w:t xml:space="preserve"> Penalty against R→R (cm): mean over MobileNet-V3 Large, AFFNet and MGazeNet, with [min, max] across them. D→R and D→D are averaged over five initialisations each. R→R errors are 4.98, 5.67 and 4.96 cm. FS stands for Full Synthetic and DP2 for DeepPrivacy2. Negative Hybrid values indicate no detectable difference rather than gains.</w:t>
       </w:r>
     </w:p>
     <w:tbl>
@@ -4922,10 +4895,10 @@
         <w:rPr>
           <w:b/>
         </w:rPr>
-        <w:t>Retraining does not rescue face swapping.</w:t>
+        <w:t>Face swapping.</w:t>
       </w:r>
       <w:r>
-        <w:t xml:space="preserve"> SimSwap's penalty survives retraining: +2.2 to +3.1 cm on the release and +2.5 to +6.2 cm on real faces, where two of three architectures reach the no-information level. Tested on the release, the penalty is positive in 148 of 150 fold-level cells. iTracker trained on SimSwap is worse than predicting the mean on real faces (+7.5 and +12.1 cm; Table S2) while fitting its synthetic training set normally.</w:t>
+        <w:t xml:space="preserve"> Retraining does not remove SimSwap's penalty, which stays at +2.2 to +3.1 cm on the release and +2.5 to +6.2 cm on real faces, where two of the three architectures reach the no-information level. On the release the penalty is positive in 148 of 150 fold-level cells. iTracker trained on SimSwap data does worse than predicting the mean on real faces (+7.5 and +12.1 cm, Table S2), even though it fits its synthetic training set normally.</w:t>
       </w:r>
     </w:p>
     <w:p>
@@ -4936,10 +4909,10 @@
         <w:rPr>
           <w:b/>
         </w:rPr>
-        <w:t>Inpainting leaves no gaze.</w:t>
+        <w:t>Inpainting.</w:t>
       </w:r>
       <w:r>
-        <w:t xml:space="preserve"> For DeepPrivacy2, 56–65% of the R→D penalty is domain shift, but the remainder is the no-information level in both modes, both identity regimes and both test sets: 580 of 600 fold-level errors are at or above predicting the mean, and none is more than 0.17 cm below it. Resampling the identity per frame changes utility by only −0.63 to +0.19 cm; repainting the eyes, not the identity regime, removes the gaze.</w:t>
+        <w:t xml:space="preserve"> For DeepPrivacy2, 56–65% of the R→D penalty is domain shift, but what remains after retraining is the no-information level in both modes, both identity regimes and both test sets. Of 600 fold-level errors, 580 are at or above the mean-prediction error and none is more than 0.17 cm below it. Drawing a new identity per frame changes utility by only −0.63 to +0.19 cm, which shows that the gaze is lost because the eyes are repainted and not because of the identity regime.</w:t>
       </w:r>
     </w:p>
     <w:p>
@@ -4950,10 +4923,10 @@
         <w:rPr>
           <w:b/>
         </w:rPr>
-        <w:t>Hybrid recovers the penalty in every condition:</w:t>
+        <w:t>Hybrid.</w:t>
       </w:r>
       <w:r>
-        <w:t xml:space="preserve"> 91–103% in D→R and 98–106% in D→D for SimSwap and DeepPrivacy2, with every retrained Hybrid cell within −0.19 to +0.23 cm of R→R, inside or at the edge of the noise floor (FAMS: −0.14 to +0.07 cm).</w:t>
+        <w:t xml:space="preserve"> Hybrid recovers the penalty in every condition, with 91–103% in D→R and 98–106% in D→D for SimSwap and DeepPrivacy2. Every retrained Hybrid cell lies within −0.19 to +0.23 cm of R→R, which is inside the noise floor or at its edge (−0.14 to +0.07 cm for FAMS).</w:t>
       </w:r>
     </w:p>
     <w:p>
@@ -4964,10 +4937,10 @@
         <w:rPr>
           <w:b/>
         </w:rPr>
-        <w:t>The diffusion release transfers better; it does not carry more gaze.</w:t>
+        <w:t>Diffusion-based de-identification.</w:t>
       </w:r>
       <w:r>
-        <w:t xml:space="preserve"> Retrained on FAMS and deployed on real faces, models lose +0.94 cm on average (+0.39 to +1.29), against +3.83 for SimSwap A and +4.51 for DeepPrivacy2, and FAMS is better than both in all 15 paired draws. Two measurements show that this is not because its eyes carry more gaze. In the pupil test (Table 8), SimSwap pupils follow true horizontal gaze more closely than FAMS pupils in all 17 participants with ground truth (r = 0.79–0.83 against 0.69; unprocessed 0.87). Eyes-only models (Table 9) reproduce the FAMS advantage on real faces (+0.96 to +1.16 cm against +2.71 to +6.77) but not within the release, where the two methods are comparable and each is better for one architecture in every draw. The difference is therefore transfer: models trained on SimSwap eyes fail on real eyes, whereas models trained on FAMS eyes do not. A plausible but untested explanation is diversity, since SimSwap maps every participant onto one template's eyes and FAMS draws a new identity per frame. Tested on its own release, a FAMS-trained model is less accurate than on real faces (+1.56 to +2.57 cm), the reverse of SimSwap.</w:t>
+        <w:t xml:space="preserve"> Models retrained on FAMS and deployed on real faces lose +0.94 cm on average (+0.39 to +1.29), compared with +3.83 cm for SimSwap A and +4.51 cm for DeepPrivacy2, and FAMS is better than both in all 15 paired draws. Two measurements suggest that this advantage does not come from more gaze information in the eyes. In the pupil test (Table 8), SimSwap pupils follow true horizontal gaze more closely than FAMS pupils in all 17 participants with ground truth (r = 0.79–0.83 against 0.69, with 0.87 for unprocessed data). Eyes-only models (Table 9) reproduce the FAMS advantage on real faces (+0.96 to +1.16 cm against +2.71 to +6.77 cm) but not within the release, where the two methods perform similarly and each is better for one of the two architectures in every draw. The difference therefore lies in transfer. Models trained on SimSwap eyes fail on real eyes and models trained on FAMS eyes do not. One plausible explanation, which we did not test, is diversity, because SimSwap maps every participant onto the eyes of a single template while FAMS draws a new identity for each frame. When tested on its own release, a FAMS-trained model is less accurate than on real faces (+1.56 to +2.57 cm), which is the opposite of what we observe for SimSwap.</w:t>
       </w:r>
     </w:p>
     <w:p>
@@ -5417,7 +5390,7 @@
         <w:t>Table 9.</w:t>
       </w:r>
       <w:r>
-        <w:t xml:space="preserve"> Stream isolation: eyes-only and face-only models retrained on each release (five initialisations); penalty against the same model under R→R (cm, mean ± SD).</w:t>
+        <w:t xml:space="preserve"> Stream isolation: eyes-only and face-only models retrained on each release (five initialisations), with the penalty against the same model under R→R (cm, mean ± SD).</w:t>
       </w:r>
     </w:p>
     <w:tbl>
@@ -5650,10 +5623,10 @@
         <w:rPr>
           <w:b/>
         </w:rPr>
-        <w:t>Releasing eye geometry instead of pixels does not escape the trade-off.</w:t>
+        <w:t>Landmark release.</w:t>
       </w:r>
       <w:r>
-        <w:t xml:space="preserve"> We regressed gaze from FaceMesh landmarks in three nested tiers, with the same participant split and attacks (Table 10). Four iris coordinates per frame predict gaze barely better than the mean (9.02 against 9.53 cm on these frames) yet link the release above the floor (ARI 0.267; 0.441 with 10-frame windows). Adding head position and eyelid shape improves gaze modestly and makes the features strongly linkable. Per-participant calibration lifts an iris-only mapping to about 5.2 cm, but requires every end user to enrol.</w:t>
+        <w:t xml:space="preserve"> We also regressed gaze from FaceMesh landmarks in three nested tiers, using the same participant split and attacks (Table 10). Four iris coordinates per frame predict gaze only slightly better than the mean (9.02 against 9.53 cm on these frames), yet they still link the release above the floor (ARI 0.267, or 0.441 with 10-frame windows). Adding head position and eyelid shape improves gaze prediction modestly and makes the features strongly linkable. Per-participant calibration brings an iris-only mapping to about 5.2 cm, but this requires every end user to enrol.</w:t>
       </w:r>
     </w:p>
     <w:p>
@@ -6062,7 +6035,7 @@
         <w:t>Figure 7.</w:t>
       </w:r>
       <w:r>
-        <w:t xml:space="preserve"> Privacy against utility for every protocol. Horizontal: D→R penalty, mean of three architectures. Vertical: ARI at k = 18 of the most linkable released crop (face or eye). Circles: Full Synthetic; squares: Hybrid; star: unprocessed; diamonds: landmark releases. Dashed red: no-information reference; dashed grey: linkage floor. The shaded private-and-useful corner is empty. The only point that leaves the top row (DeepPrivacy2 full body, per-frame identity, ARI 0.297) is at the no-information level (+4.34 cm), and restoring its original eyes (square 13) restores linkage (0.849). FAMS (circle 14) is the full-synthesis release closest to real-data utility (+0.94 cm) because its models transfer to real eyes, not because its pupils carry more gaze (§8.3), and its face crop remains linkable (0.853).</w:t>
+        <w:t xml:space="preserve"> Privacy against utility for every protocol. The horizontal axis is the D→R penalty averaged over three architectures, and the vertical axis is the ARI at k = 18 of the most linkable released crop (face or eye). Circles show Full Synthetic, squares Hybrid, the star unprocessed data and diamonds the landmark releases. The red dashed line marks the no-information reference and the grey dashed line the linkage floor. No protocol falls in the shaded private-and-useful corner. The only point below the top row (DeepPrivacy2 full body with per-frame identity, ARI 0.297) is at the no-information level (+4.34 cm), and restoring its original eyes (square 13) also restores linkage (0.849). FAMS (circle 14) is the full-synthesis release closest to real-data utility (+0.94 cm), because its models transfer to real eyes rather than because its pupils carry more gaze (§8.3), and its face crop remains linkable (0.853).</w:t>
       </w:r>
     </w:p>
     <w:p>
@@ -6078,7 +6051,7 @@
         <w:spacing w:after="120"/>
       </w:pPr>
       <w:r>
-        <w:t>Arms are compared uncalibrated, but a deployed screening tool calibrates each user. With per-participant calibration, the four architectures reach 3.70–5.11 cm on real data, or 1.8–3.7° at 80–120 cm. Table 11 sets this against what each biomarker must resolve. Anti-saccade direction, saccade latency (bias −16.8 ms, under one 33 ms frame) and search dispersion are usable; fixation stability and peak saccade velocity are beyond the instrument before de-identification is considered. Calibrated, Hybrid stays in the same regime (2.1–4.0°), whereas Full Synthetic moves to 3.5–8.0°, at which hemifield discrimination is no longer reliably resolved. Webcam eye tracking validated on clinical paradigms reports about 1.42° after per-user calibration [webcamval], the same regime as our calibrated 1.8–3.7°.</w:t>
+        <w:t>We compare arms without calibration, but a deployed screening tool would calibrate for each user. With per-participant calibration the four architectures reach 3.70–5.11 cm on real data, or 1.8–3.7° at 80–120 cm. Table 11 compares this with what each biomarker needs to resolve. Anti-saccade direction, saccade latency (bias of −16.8 ms, less than one 33 ms frame) and search dispersion can be measured, but fixation stability and peak saccade velocity are beyond the instrument even before de-identification. After calibration, Hybrid stays in the same range (2.1–4.0°), whereas Full Synthetic moves to 3.5–8.0°, at which the hemifield of an anti-saccade may no longer be resolved reliably. Webcam eye tracking validated on clinical paradigms reports about 1.42° after per-user calibration [webcamval], which is in the same range as our calibrated 1.8–3.7°.</w:t>
       </w:r>
     </w:p>
     <w:p>
@@ -6092,7 +6065,7 @@
         <w:t>Table 11.</w:t>
       </w:r>
       <w:r>
-        <w:t xml:space="preserve"> What each biomarker must resolve, against the calibrated error of 1.8–3.7°; requirements from published normative ranges.</w:t>
+        <w:t xml:space="preserve"> What each biomarker must resolve, compared with the calibrated error of 1.8–3.7°. Requirements are taken from published normative ranges.</w:t>
       </w:r>
     </w:p>
     <w:tbl>
@@ -6256,7 +6229,7 @@
               <w:rPr>
                 <w:sz w:val="17"/>
               </w:rPr>
-              <w:t>one frame; 100°/s detection threshold [saccadethresh]</w:t>
+              <w:t>one frame, with a 100°/s detection threshold [saccadethresh]</w:t>
             </w:r>
           </w:p>
         </w:tc>
@@ -6276,7 +6249,7 @@
               <w:rPr>
                 <w:sz w:val="17"/>
               </w:rPr>
-              <w:t xml:space="preserve"> — measured bias −16.8 ms, under one 33 ms frame</w:t>
+              <w:t xml:space="preserve"> (bias −16.8 ms, less than one 33 ms frame)</w:t>
             </w:r>
           </w:p>
         </w:tc>
@@ -6461,7 +6434,7 @@
         <w:spacing w:after="120"/>
       </w:pPr>
       <w:r>
-        <w:t>Our claims concern appearance-based gaze data — face and eye crops released for training gaze models — and do not extend to other sensing modalities.</w:t>
+        <w:t>Our conclusions concern appearance-based gaze data, that is, face and eye crops released for training gaze models, and they do not extend to other sensing modalities.</w:t>
       </w:r>
     </w:p>
     <w:p>
@@ -6472,10 +6445,10 @@
         <w:rPr>
           <w:b/>
         </w:rPr>
-        <w:t>Gaze utility and identity share the eye region.</w:t>
+        <w:t>The eye region.</w:t>
       </w:r>
       <w:r>
-        <w:t xml:space="preserve"> Every protocol that preserved utility did so by keeping genuine eye pixels, which identify at 62–80%. Releasing landmarks instead of pixels still links the corpus while carrying almost no gaze signal across participants.</w:t>
+        <w:t xml:space="preserve"> Every protocol that preserved utility did so by keeping genuine eye pixels, and these identify participants at 62–80%. Releasing landmarks instead of pixels still allows linkage while carrying almost no gaze signal across participants.</w:t>
       </w:r>
     </w:p>
     <w:p>
@@ -6486,10 +6459,10 @@
         <w:rPr>
           <w:b/>
         </w:rPr>
-        <w:t>Re-identification survives on the face crop; linkability survives everywhere.</w:t>
+        <w:t>Re-identification and linkability.</w:t>
       </w:r>
       <w:r>
-        <w:t xml:space="preserve"> Synthesised eyes defeat A1 on eye crops, but synthetic face crops from SimSwap and FAMS still verify at 18–24% under ArcFace; only DeepPrivacy2, which repaints the face, reaches the floor. Linkability is harder still: synthetic eye crops verify at up to 63% within the release, face crops partition exactly, and crop geometry and photometry link without any face model. Under European guidance, records that can be singled out remain personal data whether or not anyone is named [wp29anon]. A privacy figure reported without its test therefore cannot tell a dataset author whether a release is safe.</w:t>
+        <w:t xml:space="preserve"> Synthesised eyes prevent A1 on the eye crops, but the synthetic face crops of SimSwap and FAMS still verify at 18–24% with ArcFace, and only DeepPrivacy2, which repaints the face, reaches the floor. Linkability is harder to remove. Synthetic eye crops verify at up to 63% within the release, face crops partition exactly, and crop geometry and photometry link participants without any face model. Under European guidance, records that can be singled out remain personal data whether or not anyone is named [wp29anon]. A privacy figure reported without the test behind it therefore says little about whether a release is safe.</w:t>
       </w:r>
     </w:p>
     <w:p>
@@ -6500,10 +6473,10 @@
         <w:rPr>
           <w:b/>
         </w:rPr>
-        <w:t>What a releasable corpus would require.</w:t>
+        <w:t>Requirements for a releasable corpus.</w:t>
       </w:r>
       <w:r>
-        <w:t xml:space="preserve"> Content-based linkage falls only when identity is not fixed per participant and the release contains nothing the generator leaves untouched. This matters only for releases that strip participant identifiers, since a usable gaze corpus keeps them. We observed each half separately: FAMS breaks per-participant consistency but leaves the face crop linkable, and full-body inpainting with per-frame identity meets both halves but repaints the eyes. A releasable corpus would need a generator that keeps the pupil at least as faithfully as face swapping, produces eyes from which models transfer to real users as FAMS's do, edits everything the released crop contains, and resamples identity per session rather than per frame, which a single-session corpus cannot verify. We know of no method that meets all four.</w:t>
+        <w:t xml:space="preserve"> Linkage from the released content disappears only when identity is not fixed per participant and the release contains nothing the generator leaves untouched. This matters only for releases that remove participant identifiers, since a usable gaze corpus has to keep them. We observed each part of the condition separately. FAMS breaks per-participant consistency but leaves the face crop linkable, and full-body inpainting with per-frame identity meets both parts but repaints the eyes. A releasable corpus would need a generator that keeps the pupil at least as faithfully as face swapping, produces eyes from which models transfer to real users as well as FAMS does, edits everything in the released crop, and draws a new identity per session rather than per frame. The last requirement cannot be verified on a single-session corpus. We are not aware of any method that meets all four.</w:t>
       </w:r>
     </w:p>
     <w:p>
@@ -6514,10 +6487,10 @@
         <w:rPr>
           <w:b/>
         </w:rPr>
-        <w:t>Measure utility the way the release will be used.</w:t>
+        <w:t>Measuring utility.</w:t>
       </w:r>
       <w:r>
-        <w:t xml:space="preserve"> R→D conflates domain shift with information loss; retraining separates them. Utility figures for a release should come from D→R, reported beside the no-information reference, together with a direct check of the pupil, because transfer and information can diverge: the release that transfers best carries less pupil signal than the one that transfers worst.</w:t>
+        <w:t xml:space="preserve"> R→D mixes domain shift with information loss, and retraining separates the two. Utility for a release should therefore be reported under D→R together with the no-information reference. The pupil should also be checked directly, because transfer and information can diverge, as the release that transfers best carries less pupil signal than the one that transfers worst.</w:t>
       </w:r>
     </w:p>
     <w:p>
@@ -6528,10 +6501,10 @@
         <w:rPr>
           <w:b/>
         </w:rPr>
-        <w:t>Releasing gaze data now.</w:t>
+        <w:t>Releasing gaze data today.</w:t>
       </w:r>
       <w:r>
-        <w:t xml:space="preserve"> No protocol we measured makes a smartphone gaze corpus anonymous in the European sense: a usable release is linkable by construction, and every gaze-preserving protocol leaves residual re-identification. CognitiveGaze is therefore shared under controlled access, with derived gaze traces in an open tier whose linkage we measured (ARI 0.033). This leaves the cycle in Figure 1 unbroken, but changes how the next dataset author decides: both axes can be measured before release with privaudit, and generator developers know what a gaze-preserving method must achieve (§10).</w:t>
+        <w:t xml:space="preserve"> None of the protocols we measured makes a smartphone gaze corpus anonymous in the European sense. A usable release is linkable by construction, and every protocol that preserves gaze leaves some re-identification risk. We therefore share CognitiveGaze under controlled access, with derived gaze traces in an open tier whose linkage we measured (ARI 0.033). This does not break the cycle in Figure 1, but it changes the information available to the next dataset author, who can measure both privacy and utility with privaudit before release. It also gives developers of de-identification methods a concrete target (§10).</w:t>
       </w:r>
     </w:p>
     <w:p>
@@ -6547,7 +6520,7 @@
         <w:spacing w:after="120"/>
       </w:pPr>
       <w:r>
-        <w:t>Table 12 lists seven guidelines for authors of appearance-based gaze datasets; the full checklist and audit tool are in the supplementary material [privaudit-repo].</w:t>
+        <w:t>Table 12 lists seven guidelines for authors of appearance-based gaze datasets. The full checklist and the audit tool are provided as supplementary material [privaudit-repo].</w:t>
       </w:r>
     </w:p>
     <w:p>
@@ -6642,7 +6615,7 @@
               <w:rPr>
                 <w:sz w:val="17"/>
               </w:rPr>
-              <w:t>Run A1 on every released stream, face crop included, and test linkability (A2) as the anonymisation criterion.</w:t>
+              <w:t>Run A1 on every released stream, including the face crop, and test linkability (A2) as the anonymisation criterion.</w:t>
             </w:r>
           </w:p>
         </w:tc>
@@ -6655,7 +6628,7 @@
               <w:rPr>
                 <w:sz w:val="17"/>
               </w:rPr>
-              <w:t>Synthetic eye crops: 0.2% under A1, 43% within the release; synthetic face crops: 18–24% under A1.</w:t>
+              <w:t>Synthetic eye crops reach 0.2% under A1 but 43% within the release, and synthetic face crops 18–24% under A1.</w:t>
             </w:r>
           </w:p>
         </w:tc>
@@ -6737,7 +6710,7 @@
               <w:rPr>
                 <w:sz w:val="17"/>
               </w:rPr>
-              <w:t>Hybrid recovers 85–106% of utility; genuine eye crops verify at 62–80%.</w:t>
+              <w:t>Hybrid recovers 82–111% of utility, and genuine eye crops verify at 62–80%.</w:t>
             </w:r>
           </w:p>
         </w:tc>
@@ -6778,7 +6751,7 @@
               <w:rPr>
                 <w:sz w:val="17"/>
               </w:rPr>
-              <w:t>Crop size alone identifies 66.7%; photometry alone links at ARI 0.87–0.90.</w:t>
+              <w:t>Crop size alone identifies 66.7% of participants, and photometry alone links at ARI 0.87–0.90.</w:t>
             </w:r>
           </w:p>
         </w:tc>
@@ -6806,7 +6779,7 @@
               <w:rPr>
                 <w:sz w:val="17"/>
               </w:rPr>
-              <w:t>When stripping identifiers, resample identity and edit everything released.</w:t>
+              <w:t>When removing identifiers, redraw identity per frame and edit everything that is released.</w:t>
             </w:r>
           </w:p>
         </w:tc>
@@ -6819,7 +6792,7 @@
               <w:rPr>
                 <w:sz w:val="17"/>
               </w:rPr>
-              <w:t>Only that configuration breaks face-crop linkage (0.297); verification remains 36%.</w:t>
+              <w:t>Only this configuration breaks face-crop linkage (0.297), and verification still reaches 36%.</w:t>
             </w:r>
           </w:p>
         </w:tc>
@@ -6921,7 +6894,7 @@
         <w:spacing w:after="120"/>
       </w:pPr>
       <w:r>
-        <w:t>Participants were recorded in a single session. Photometric normalisation and a large within-session illumination change leave linkage intact, but ambient lighting, camera position and seating cannot be separated from the person without a second session, which also bounds the photometric attack; the longitudinal case that makes linkage consequential remains untested. The cohort of 18 healthy adults is moderately homogeneous and drawn from one institution, so absolute identity rates are cohort-dependent, whereas between-arm comparisons, which hold the cohort fixed, are not; we make no clinical claims. The two recognisers, both trained on web-scale face corpora, can disagree — FaceNet places FAMS face crops at its floor where ArcFace does not — and recognition by acquaintances, who use hairstyle, glasses and face shape that FAMS preserves, was not measured. We test one replacement method with two templates, one removal method in two modes and one diffusion method; latent-space diffusion editing is untested. Full-body DeepPrivacy2 left a second, unmapped person unedited in 1.4% of frames, outside the released crops. iTracker was retrained once per arm, and FAMS on the three faster architectures only.</w:t>
+        <w:t>Each participant was recorded in a single session. Photometric normalisation and a large illumination change within the session leave linkage intact, but ambient lighting, camera position and seating cannot be separated from the person without a second session. This also limits how far the photometric attack can be interpreted, and the longitudinal setting in which linkage matters most remains untested. The cohort of 18 healthy adults is fairly homogeneous and comes from a single institution, so absolute identification rates depend on the cohort, whereas comparisons between arms, which keep the cohort fixed, do not. We make no clinical claims. The two recognisers are both trained on web-scale face data and can disagree, as FaceNet places FAMS face crops at its floor while ArcFace does not. We did not measure recognition by acquaintances, who rely on hairstyle, glasses and face shape, all of which FAMS preserves. We tested one replacement method with two templates, one removal method in two modes and one diffusion method, and did not test latent-space diffusion editing. Full-body DeepPrivacy2 left a second, unmapped person unedited in 1.4% of frames, outside the released crops. Finally, iTracker was retrained only once per arm, and FAMS only on the three faster architectures.</w:t>
       </w:r>
     </w:p>
     <w:p>
@@ -6937,7 +6910,7 @@
         <w:spacing w:after="120"/>
       </w:pPr>
       <w:r>
-        <w:t>De-identification of gaze data has been judged by whether the face still looks like the participant. We measured instead whether a release can be re-identified or linked and whether a model trained on it works, across three generator families, two release forms and four train–test conditions. No configuration was both private and useful: protocols that keep gaze keep identity, and the one that breaks linkage leaves nothing to learn from. The two-part condition states what a generator would have to achieve, and privaudit lets dataset authors check a release before sharing it.</w:t>
+        <w:t>De-identification of gaze data has so far been judged by whether the face still looks like the participant. We measured instead whether a release can be re-identified or linked and whether a model trained on it still works, across three generator families, two release forms and four train–test conditions. None of the configurations was both private and useful. The protocols that keep gaze information also keep identity, and the one configuration that breaks linkage leaves nothing to learn from. The two-part condition specifies what a generator would need to achieve, and privaudit allows dataset authors to check a release before they share it.</w:t>
       </w:r>
     </w:p>
     <w:p>
@@ -6953,7 +6926,7 @@
         <w:spacing w:after="120"/>
       </w:pPr>
       <w:r>
-        <w:t>CognitiveGaze contains facial video and is shared under controlled access: researchers apply to the data holder and sign a data-use agreement that prohibits re-identification and linkage. Derived per-frame gaze estimates and oculomotor measures form an open tier, whose residual linkage is reported in §7. The audit tool privaudit, the release checklist and the analysis code are available at [privaudit-repo].</w:t>
+        <w:t>CognitiveGaze contains facial video and is available under controlled access. Researchers apply to the data holder and sign a data-use agreement that prohibits re-identification and linkage. Derived per-frame gaze estimates and oculomotor measures form an open tier, whose residual linkage is reported in §7. The audit tool privaudit, the release checklist and the analysis code are available at [privaudit-repo].</w:t>
       </w:r>
     </w:p>
     <w:p>
@@ -6975,7 +6948,7 @@
         <w:t>Table S1.</w:t>
       </w:r>
       <w:r>
-        <w:t xml:space="preserve"> R→D for DeepPrivacy2 and FAMS: mean ± SD over five initialisations; in parentheses (FAMS: as listed), the change against R→R (Table 5).</w:t>
+        <w:t xml:space="preserve"> R→D for DeepPrivacy2 and FAMS, as mean ± SD over five initialisations. Values in parentheses (listed directly for FAMS) give the change against R→R (Table 5).</w:t>
       </w:r>
     </w:p>
     <w:p>
@@ -6988,370 +6961,82 @@
         </w:rPr>
         <w:t>(a) DeepPrivacy2, face mode</w:t>
       </w:r>
+      <w:r>
+        <w:t xml:space="preserve"> | Model | Full Synthetic (fixed) | Hybrid (fixed) | Full Synthetic (per frame) | Hybrid (per frame) | |---|---|---|---|---| | iTracker | 16.44 ± 0.24 (+10.58) | </w:t>
+      </w:r>
+      <w:r>
+        <w:rPr>
+          <w:b/>
+        </w:rPr>
+        <w:t>5.75 ± 0.11 (−0.10)</w:t>
+      </w:r>
+      <w:r>
+        <w:t xml:space="preserve"> | 17.50 ± 0.25 (+11.65) | </w:t>
+      </w:r>
+      <w:r>
+        <w:rPr>
+          <w:b/>
+        </w:rPr>
+        <w:t>5.83 ± 0.06 (−0.02)</w:t>
+      </w:r>
+      <w:r>
+        <w:t xml:space="preserve"> | | MobileNet-V3 Large | 15.88 ± 0.37 (+10.90) | </w:t>
+      </w:r>
+      <w:r>
+        <w:rPr>
+          <w:b/>
+        </w:rPr>
+        <w:t>6.02 ± 0.54 (+1.03)</w:t>
+      </w:r>
+      <w:r>
+        <w:t xml:space="preserve"> | 16.24 ± 0.23 (+11.25) | </w:t>
+      </w:r>
+      <w:r>
+        <w:rPr>
+          <w:b/>
+        </w:rPr>
+        <w:t>5.95 ± 0.45 (+0.97)</w:t>
+      </w:r>
+      <w:r>
+        <w:t xml:space="preserve"> | | AFFNet | 19.33 ± 0.26 (+13.66) | </w:t>
+      </w:r>
+      <w:r>
+        <w:rPr>
+          <w:b/>
+        </w:rPr>
+        <w:t>5.74 ± 0.24 (+0.07)</w:t>
+      </w:r>
+      <w:r>
+        <w:t xml:space="preserve"> | 20.52 ± 0.22 (+14.85) | </w:t>
+      </w:r>
+      <w:r>
+        <w:rPr>
+          <w:b/>
+        </w:rPr>
+        <w:t>5.68 ± 0.22 (+0.01)</w:t>
+      </w:r>
+      <w:r>
+        <w:t xml:space="preserve"> | | MGazeNet | 17.06 ± 0.39 (+12.09) | </w:t>
+      </w:r>
+      <w:r>
+        <w:rPr>
+          <w:b/>
+        </w:rPr>
+        <w:t>5.43 ± 0.38 (+0.47)</w:t>
+      </w:r>
+      <w:r>
+        <w:t xml:space="preserve"> | 17.04 ± 0.53 (+12.08) | </w:t>
+      </w:r>
+      <w:r>
+        <w:rPr>
+          <w:b/>
+        </w:rPr>
+        <w:t>5.37 ± 0.32 (+0.40)</w:t>
+      </w:r>
+      <w:r>
+        <w:t xml:space="preserve"> |</w:t>
+      </w:r>
     </w:p>
-    <w:tbl>
-      <w:tblPr>
-        <w:tblStyle w:val="TableGrid"/>
-        <w:tblW w:type="auto" w:w="0"/>
-        <w:tblLook w:firstColumn="1" w:firstRow="1" w:lastColumn="0" w:lastRow="0" w:noHBand="0" w:noVBand="1" w:val="04A0"/>
-      </w:tblPr>
-      <w:tblGrid>
-        <w:gridCol w:w="1949"/>
-        <w:gridCol w:w="1949"/>
-        <w:gridCol w:w="1949"/>
-        <w:gridCol w:w="1949"/>
-        <w:gridCol w:w="1949"/>
-      </w:tblGrid>
-      <w:tr>
-        <w:tc>
-          <w:tcPr>
-            <w:tcW w:type="dxa" w:w="1949"/>
-          </w:tcPr>
-          <w:p>
-            <w:r>
-              <w:rPr>
-                <w:b/>
-                <w:sz w:val="17"/>
-              </w:rPr>
-              <w:t>Model</w:t>
-            </w:r>
-          </w:p>
-        </w:tc>
-        <w:tc>
-          <w:tcPr>
-            <w:tcW w:type="dxa" w:w="1949"/>
-          </w:tcPr>
-          <w:p>
-            <w:r>
-              <w:rPr>
-                <w:b/>
-                <w:sz w:val="17"/>
-              </w:rPr>
-              <w:t>Full Synthetic (fixed)</w:t>
-            </w:r>
-          </w:p>
-        </w:tc>
-        <w:tc>
-          <w:tcPr>
-            <w:tcW w:type="dxa" w:w="1949"/>
-          </w:tcPr>
-          <w:p>
-            <w:r>
-              <w:rPr>
-                <w:b/>
-                <w:sz w:val="17"/>
-              </w:rPr>
-              <w:t>Hybrid (fixed)</w:t>
-            </w:r>
-          </w:p>
-        </w:tc>
-        <w:tc>
-          <w:tcPr>
-            <w:tcW w:type="dxa" w:w="1949"/>
-          </w:tcPr>
-          <w:p>
-            <w:r>
-              <w:rPr>
-                <w:b/>
-                <w:sz w:val="17"/>
-              </w:rPr>
-              <w:t>Full Synthetic (per frame)</w:t>
-            </w:r>
-          </w:p>
-        </w:tc>
-        <w:tc>
-          <w:tcPr>
-            <w:tcW w:type="dxa" w:w="1949"/>
-          </w:tcPr>
-          <w:p>
-            <w:r>
-              <w:rPr>
-                <w:b/>
-                <w:sz w:val="17"/>
-              </w:rPr>
-              <w:t>Hybrid (per frame)</w:t>
-            </w:r>
-          </w:p>
-        </w:tc>
-      </w:tr>
-      <w:tr>
-        <w:tc>
-          <w:tcPr>
-            <w:tcW w:type="dxa" w:w="1949"/>
-          </w:tcPr>
-          <w:p>
-            <w:r>
-              <w:rPr>
-                <w:sz w:val="17"/>
-              </w:rPr>
-              <w:t>iTracker</w:t>
-            </w:r>
-          </w:p>
-        </w:tc>
-        <w:tc>
-          <w:tcPr>
-            <w:tcW w:type="dxa" w:w="1949"/>
-          </w:tcPr>
-          <w:p>
-            <w:r>
-              <w:rPr>
-                <w:sz w:val="17"/>
-              </w:rPr>
-              <w:t>16.44 ± 0.24 (+10.58)</w:t>
-            </w:r>
-          </w:p>
-        </w:tc>
-        <w:tc>
-          <w:tcPr>
-            <w:tcW w:type="dxa" w:w="1949"/>
-          </w:tcPr>
-          <w:p>
-            <w:r>
-              <w:rPr>
-                <w:b/>
-                <w:sz w:val="17"/>
-              </w:rPr>
-              <w:t>5.75 ± 0.11 (−0.10)</w:t>
-            </w:r>
-          </w:p>
-        </w:tc>
-        <w:tc>
-          <w:tcPr>
-            <w:tcW w:type="dxa" w:w="1949"/>
-          </w:tcPr>
-          <w:p>
-            <w:r>
-              <w:rPr>
-                <w:sz w:val="17"/>
-              </w:rPr>
-              <w:t>17.50 ± 0.25 (+11.65)</w:t>
-            </w:r>
-          </w:p>
-        </w:tc>
-        <w:tc>
-          <w:tcPr>
-            <w:tcW w:type="dxa" w:w="1949"/>
-          </w:tcPr>
-          <w:p>
-            <w:r>
-              <w:rPr>
-                <w:b/>
-                <w:sz w:val="17"/>
-              </w:rPr>
-              <w:t>5.83 ± 0.06 (−0.02)</w:t>
-            </w:r>
-          </w:p>
-        </w:tc>
-      </w:tr>
-      <w:tr>
-        <w:tc>
-          <w:tcPr>
-            <w:tcW w:type="dxa" w:w="1949"/>
-          </w:tcPr>
-          <w:p>
-            <w:r>
-              <w:rPr>
-                <w:sz w:val="17"/>
-              </w:rPr>
-              <w:t>MobileNet-V3 Large</w:t>
-            </w:r>
-          </w:p>
-        </w:tc>
-        <w:tc>
-          <w:tcPr>
-            <w:tcW w:type="dxa" w:w="1949"/>
-          </w:tcPr>
-          <w:p>
-            <w:r>
-              <w:rPr>
-                <w:sz w:val="17"/>
-              </w:rPr>
-              <w:t>15.88 ± 0.37 (+10.90)</w:t>
-            </w:r>
-          </w:p>
-        </w:tc>
-        <w:tc>
-          <w:tcPr>
-            <w:tcW w:type="dxa" w:w="1949"/>
-          </w:tcPr>
-          <w:p>
-            <w:r>
-              <w:rPr>
-                <w:b/>
-                <w:sz w:val="17"/>
-              </w:rPr>
-              <w:t>6.02 ± 0.54 (+1.03)</w:t>
-            </w:r>
-          </w:p>
-        </w:tc>
-        <w:tc>
-          <w:tcPr>
-            <w:tcW w:type="dxa" w:w="1949"/>
-          </w:tcPr>
-          <w:p>
-            <w:r>
-              <w:rPr>
-                <w:sz w:val="17"/>
-              </w:rPr>
-              <w:t>16.24 ± 0.23 (+11.25)</w:t>
-            </w:r>
-          </w:p>
-        </w:tc>
-        <w:tc>
-          <w:tcPr>
-            <w:tcW w:type="dxa" w:w="1949"/>
-          </w:tcPr>
-          <w:p>
-            <w:r>
-              <w:rPr>
-                <w:b/>
-                <w:sz w:val="17"/>
-              </w:rPr>
-              <w:t>5.95 ± 0.45 (+0.97)</w:t>
-            </w:r>
-          </w:p>
-        </w:tc>
-      </w:tr>
-      <w:tr>
-        <w:tc>
-          <w:tcPr>
-            <w:tcW w:type="dxa" w:w="1949"/>
-          </w:tcPr>
-          <w:p>
-            <w:r>
-              <w:rPr>
-                <w:sz w:val="17"/>
-              </w:rPr>
-              <w:t>AFFNet</w:t>
-            </w:r>
-          </w:p>
-        </w:tc>
-        <w:tc>
-          <w:tcPr>
-            <w:tcW w:type="dxa" w:w="1949"/>
-          </w:tcPr>
-          <w:p>
-            <w:r>
-              <w:rPr>
-                <w:sz w:val="17"/>
-              </w:rPr>
-              <w:t>19.33 ± 0.26 (+13.66)</w:t>
-            </w:r>
-          </w:p>
-        </w:tc>
-        <w:tc>
-          <w:tcPr>
-            <w:tcW w:type="dxa" w:w="1949"/>
-          </w:tcPr>
-          <w:p>
-            <w:r>
-              <w:rPr>
-                <w:b/>
-                <w:sz w:val="17"/>
-              </w:rPr>
-              <w:t>5.74 ± 0.24 (+0.07)</w:t>
-            </w:r>
-          </w:p>
-        </w:tc>
-        <w:tc>
-          <w:tcPr>
-            <w:tcW w:type="dxa" w:w="1949"/>
-          </w:tcPr>
-          <w:p>
-            <w:r>
-              <w:rPr>
-                <w:sz w:val="17"/>
-              </w:rPr>
-              <w:t>20.52 ± 0.22 (+14.85)</w:t>
-            </w:r>
-          </w:p>
-        </w:tc>
-        <w:tc>
-          <w:tcPr>
-            <w:tcW w:type="dxa" w:w="1949"/>
-          </w:tcPr>
-          <w:p>
-            <w:r>
-              <w:rPr>
-                <w:b/>
-                <w:sz w:val="17"/>
-              </w:rPr>
-              <w:t>5.68 ± 0.22 (+0.01)</w:t>
-            </w:r>
-          </w:p>
-        </w:tc>
-      </w:tr>
-      <w:tr>
-        <w:tc>
-          <w:tcPr>
-            <w:tcW w:type="dxa" w:w="1949"/>
-          </w:tcPr>
-          <w:p>
-            <w:r>
-              <w:rPr>
-                <w:sz w:val="17"/>
-              </w:rPr>
-              <w:t>MGazeNet</w:t>
-            </w:r>
-          </w:p>
-        </w:tc>
-        <w:tc>
-          <w:tcPr>
-            <w:tcW w:type="dxa" w:w="1949"/>
-          </w:tcPr>
-          <w:p>
-            <w:r>
-              <w:rPr>
-                <w:sz w:val="17"/>
-              </w:rPr>
-              <w:t>17.06 ± 0.39 (+12.09)</w:t>
-            </w:r>
-          </w:p>
-        </w:tc>
-        <w:tc>
-          <w:tcPr>
-            <w:tcW w:type="dxa" w:w="1949"/>
-          </w:tcPr>
-          <w:p>
-            <w:r>
-              <w:rPr>
-                <w:b/>
-                <w:sz w:val="17"/>
-              </w:rPr>
-              <w:t>5.43 ± 0.38 (+0.47)</w:t>
-            </w:r>
-          </w:p>
-        </w:tc>
-        <w:tc>
-          <w:tcPr>
-            <w:tcW w:type="dxa" w:w="1949"/>
-          </w:tcPr>
-          <w:p>
-            <w:r>
-              <w:rPr>
-                <w:sz w:val="17"/>
-              </w:rPr>
-              <w:t>17.04 ± 0.53 (+12.08)</w:t>
-            </w:r>
-          </w:p>
-        </w:tc>
-        <w:tc>
-          <w:tcPr>
-            <w:tcW w:type="dxa" w:w="1949"/>
-          </w:tcPr>
-          <w:p>
-            <w:r>
-              <w:rPr>
-                <w:b/>
-                <w:sz w:val="17"/>
-              </w:rPr>
-              <w:t>5.37 ± 0.32 (+0.40)</w:t>
-            </w:r>
-          </w:p>
-        </w:tc>
-      </w:tr>
-    </w:tbl>
-    <w:p/>
     <w:p>
       <w:pPr>
         <w:spacing w:after="120"/>
@@ -7362,370 +7047,82 @@
         </w:rPr>
         <w:t>(b) DeepPrivacy2, full-body mode</w:t>
       </w:r>
+      <w:r>
+        <w:t xml:space="preserve"> | Model | Full Synthetic (fixed) | Hybrid (fixed) | Full Synthetic (per frame) | Hybrid (per frame) | |---|---|---|---|---| | iTracker | 15.92 ± 0.29 (+10.06) | </w:t>
+      </w:r>
+      <w:r>
+        <w:rPr>
+          <w:b/>
+        </w:rPr>
+        <w:t>6.01 ± 0.11 (+0.16)</w:t>
+      </w:r>
+      <w:r>
+        <w:t xml:space="preserve"> | 17.12 ± 0.35 (+11.27) | </w:t>
+      </w:r>
+      <w:r>
+        <w:rPr>
+          <w:b/>
+        </w:rPr>
+        <w:t>5.96 ± 0.10 (+0.11)</w:t>
+      </w:r>
+      <w:r>
+        <w:t xml:space="preserve"> | | MobileNet-V3 Large | 14.63 ± 0.81 (+9.65) | </w:t>
+      </w:r>
+      <w:r>
+        <w:rPr>
+          <w:b/>
+        </w:rPr>
+        <w:t>5.60 ± 0.48 (+0.61)</w:t>
+      </w:r>
+      <w:r>
+        <w:t xml:space="preserve"> | 14.65 ± 0.76 (+9.67) | </w:t>
+      </w:r>
+      <w:r>
+        <w:rPr>
+          <w:b/>
+        </w:rPr>
+        <w:t>5.61 ± 0.45 (+0.63)</w:t>
+      </w:r>
+      <w:r>
+        <w:t xml:space="preserve"> | | AFFNet | 17.72 ± 0.42 (+12.05) | </w:t>
+      </w:r>
+      <w:r>
+        <w:rPr>
+          <w:b/>
+        </w:rPr>
+        <w:t>5.78 ± 0.23 (+0.11)</w:t>
+      </w:r>
+      <w:r>
+        <w:t xml:space="preserve"> | 17.82 ± 0.47 (+12.16) | </w:t>
+      </w:r>
+      <w:r>
+        <w:rPr>
+          <w:b/>
+        </w:rPr>
+        <w:t>5.80 ± 0.23 (+0.13)</w:t>
+      </w:r>
+      <w:r>
+        <w:t xml:space="preserve"> | | MGazeNet | 15.28 ± 0.29 (+10.31) | </w:t>
+      </w:r>
+      <w:r>
+        <w:rPr>
+          <w:b/>
+        </w:rPr>
+        <w:t>5.22 ± 0.20 (+0.26)</w:t>
+      </w:r>
+      <w:r>
+        <w:t xml:space="preserve"> | 15.59 ± 0.19 (+10.63) | </w:t>
+      </w:r>
+      <w:r>
+        <w:rPr>
+          <w:b/>
+        </w:rPr>
+        <w:t>5.35 ± 0.20 (+0.39)</w:t>
+      </w:r>
+      <w:r>
+        <w:t xml:space="preserve"> |</w:t>
+      </w:r>
     </w:p>
-    <w:tbl>
-      <w:tblPr>
-        <w:tblStyle w:val="TableGrid"/>
-        <w:tblW w:type="auto" w:w="0"/>
-        <w:tblLook w:firstColumn="1" w:firstRow="1" w:lastColumn="0" w:lastRow="0" w:noHBand="0" w:noVBand="1" w:val="04A0"/>
-      </w:tblPr>
-      <w:tblGrid>
-        <w:gridCol w:w="1949"/>
-        <w:gridCol w:w="1949"/>
-        <w:gridCol w:w="1949"/>
-        <w:gridCol w:w="1949"/>
-        <w:gridCol w:w="1949"/>
-      </w:tblGrid>
-      <w:tr>
-        <w:tc>
-          <w:tcPr>
-            <w:tcW w:type="dxa" w:w="1949"/>
-          </w:tcPr>
-          <w:p>
-            <w:r>
-              <w:rPr>
-                <w:b/>
-                <w:sz w:val="17"/>
-              </w:rPr>
-              <w:t>Model</w:t>
-            </w:r>
-          </w:p>
-        </w:tc>
-        <w:tc>
-          <w:tcPr>
-            <w:tcW w:type="dxa" w:w="1949"/>
-          </w:tcPr>
-          <w:p>
-            <w:r>
-              <w:rPr>
-                <w:b/>
-                <w:sz w:val="17"/>
-              </w:rPr>
-              <w:t>Full Synthetic (fixed)</w:t>
-            </w:r>
-          </w:p>
-        </w:tc>
-        <w:tc>
-          <w:tcPr>
-            <w:tcW w:type="dxa" w:w="1949"/>
-          </w:tcPr>
-          <w:p>
-            <w:r>
-              <w:rPr>
-                <w:b/>
-                <w:sz w:val="17"/>
-              </w:rPr>
-              <w:t>Hybrid (fixed)</w:t>
-            </w:r>
-          </w:p>
-        </w:tc>
-        <w:tc>
-          <w:tcPr>
-            <w:tcW w:type="dxa" w:w="1949"/>
-          </w:tcPr>
-          <w:p>
-            <w:r>
-              <w:rPr>
-                <w:b/>
-                <w:sz w:val="17"/>
-              </w:rPr>
-              <w:t>Full Synthetic (per frame)</w:t>
-            </w:r>
-          </w:p>
-        </w:tc>
-        <w:tc>
-          <w:tcPr>
-            <w:tcW w:type="dxa" w:w="1949"/>
-          </w:tcPr>
-          <w:p>
-            <w:r>
-              <w:rPr>
-                <w:b/>
-                <w:sz w:val="17"/>
-              </w:rPr>
-              <w:t>Hybrid (per frame)</w:t>
-            </w:r>
-          </w:p>
-        </w:tc>
-      </w:tr>
-      <w:tr>
-        <w:tc>
-          <w:tcPr>
-            <w:tcW w:type="dxa" w:w="1949"/>
-          </w:tcPr>
-          <w:p>
-            <w:r>
-              <w:rPr>
-                <w:sz w:val="17"/>
-              </w:rPr>
-              <w:t>iTracker</w:t>
-            </w:r>
-          </w:p>
-        </w:tc>
-        <w:tc>
-          <w:tcPr>
-            <w:tcW w:type="dxa" w:w="1949"/>
-          </w:tcPr>
-          <w:p>
-            <w:r>
-              <w:rPr>
-                <w:sz w:val="17"/>
-              </w:rPr>
-              <w:t>15.92 ± 0.29 (+10.06)</w:t>
-            </w:r>
-          </w:p>
-        </w:tc>
-        <w:tc>
-          <w:tcPr>
-            <w:tcW w:type="dxa" w:w="1949"/>
-          </w:tcPr>
-          <w:p>
-            <w:r>
-              <w:rPr>
-                <w:b/>
-                <w:sz w:val="17"/>
-              </w:rPr>
-              <w:t>6.01 ± 0.11 (+0.16)</w:t>
-            </w:r>
-          </w:p>
-        </w:tc>
-        <w:tc>
-          <w:tcPr>
-            <w:tcW w:type="dxa" w:w="1949"/>
-          </w:tcPr>
-          <w:p>
-            <w:r>
-              <w:rPr>
-                <w:sz w:val="17"/>
-              </w:rPr>
-              <w:t>17.12 ± 0.35 (+11.27)</w:t>
-            </w:r>
-          </w:p>
-        </w:tc>
-        <w:tc>
-          <w:tcPr>
-            <w:tcW w:type="dxa" w:w="1949"/>
-          </w:tcPr>
-          <w:p>
-            <w:r>
-              <w:rPr>
-                <w:b/>
-                <w:sz w:val="17"/>
-              </w:rPr>
-              <w:t>5.96 ± 0.10 (+0.11)</w:t>
-            </w:r>
-          </w:p>
-        </w:tc>
-      </w:tr>
-      <w:tr>
-        <w:tc>
-          <w:tcPr>
-            <w:tcW w:type="dxa" w:w="1949"/>
-          </w:tcPr>
-          <w:p>
-            <w:r>
-              <w:rPr>
-                <w:sz w:val="17"/>
-              </w:rPr>
-              <w:t>MobileNet-V3 Large</w:t>
-            </w:r>
-          </w:p>
-        </w:tc>
-        <w:tc>
-          <w:tcPr>
-            <w:tcW w:type="dxa" w:w="1949"/>
-          </w:tcPr>
-          <w:p>
-            <w:r>
-              <w:rPr>
-                <w:sz w:val="17"/>
-              </w:rPr>
-              <w:t>14.63 ± 0.81 (+9.65)</w:t>
-            </w:r>
-          </w:p>
-        </w:tc>
-        <w:tc>
-          <w:tcPr>
-            <w:tcW w:type="dxa" w:w="1949"/>
-          </w:tcPr>
-          <w:p>
-            <w:r>
-              <w:rPr>
-                <w:b/>
-                <w:sz w:val="17"/>
-              </w:rPr>
-              <w:t>5.60 ± 0.48 (+0.61)</w:t>
-            </w:r>
-          </w:p>
-        </w:tc>
-        <w:tc>
-          <w:tcPr>
-            <w:tcW w:type="dxa" w:w="1949"/>
-          </w:tcPr>
-          <w:p>
-            <w:r>
-              <w:rPr>
-                <w:sz w:val="17"/>
-              </w:rPr>
-              <w:t>14.65 ± 0.76 (+9.67)</w:t>
-            </w:r>
-          </w:p>
-        </w:tc>
-        <w:tc>
-          <w:tcPr>
-            <w:tcW w:type="dxa" w:w="1949"/>
-          </w:tcPr>
-          <w:p>
-            <w:r>
-              <w:rPr>
-                <w:b/>
-                <w:sz w:val="17"/>
-              </w:rPr>
-              <w:t>5.61 ± 0.45 (+0.63)</w:t>
-            </w:r>
-          </w:p>
-        </w:tc>
-      </w:tr>
-      <w:tr>
-        <w:tc>
-          <w:tcPr>
-            <w:tcW w:type="dxa" w:w="1949"/>
-          </w:tcPr>
-          <w:p>
-            <w:r>
-              <w:rPr>
-                <w:sz w:val="17"/>
-              </w:rPr>
-              <w:t>AFFNet</w:t>
-            </w:r>
-          </w:p>
-        </w:tc>
-        <w:tc>
-          <w:tcPr>
-            <w:tcW w:type="dxa" w:w="1949"/>
-          </w:tcPr>
-          <w:p>
-            <w:r>
-              <w:rPr>
-                <w:sz w:val="17"/>
-              </w:rPr>
-              <w:t>17.72 ± 0.42 (+12.05)</w:t>
-            </w:r>
-          </w:p>
-        </w:tc>
-        <w:tc>
-          <w:tcPr>
-            <w:tcW w:type="dxa" w:w="1949"/>
-          </w:tcPr>
-          <w:p>
-            <w:r>
-              <w:rPr>
-                <w:b/>
-                <w:sz w:val="17"/>
-              </w:rPr>
-              <w:t>5.78 ± 0.23 (+0.11)</w:t>
-            </w:r>
-          </w:p>
-        </w:tc>
-        <w:tc>
-          <w:tcPr>
-            <w:tcW w:type="dxa" w:w="1949"/>
-          </w:tcPr>
-          <w:p>
-            <w:r>
-              <w:rPr>
-                <w:sz w:val="17"/>
-              </w:rPr>
-              <w:t>17.82 ± 0.47 (+12.16)</w:t>
-            </w:r>
-          </w:p>
-        </w:tc>
-        <w:tc>
-          <w:tcPr>
-            <w:tcW w:type="dxa" w:w="1949"/>
-          </w:tcPr>
-          <w:p>
-            <w:r>
-              <w:rPr>
-                <w:b/>
-                <w:sz w:val="17"/>
-              </w:rPr>
-              <w:t>5.80 ± 0.23 (+0.13)</w:t>
-            </w:r>
-          </w:p>
-        </w:tc>
-      </w:tr>
-      <w:tr>
-        <w:tc>
-          <w:tcPr>
-            <w:tcW w:type="dxa" w:w="1949"/>
-          </w:tcPr>
-          <w:p>
-            <w:r>
-              <w:rPr>
-                <w:sz w:val="17"/>
-              </w:rPr>
-              <w:t>MGazeNet</w:t>
-            </w:r>
-          </w:p>
-        </w:tc>
-        <w:tc>
-          <w:tcPr>
-            <w:tcW w:type="dxa" w:w="1949"/>
-          </w:tcPr>
-          <w:p>
-            <w:r>
-              <w:rPr>
-                <w:sz w:val="17"/>
-              </w:rPr>
-              <w:t>15.28 ± 0.29 (+10.31)</w:t>
-            </w:r>
-          </w:p>
-        </w:tc>
-        <w:tc>
-          <w:tcPr>
-            <w:tcW w:type="dxa" w:w="1949"/>
-          </w:tcPr>
-          <w:p>
-            <w:r>
-              <w:rPr>
-                <w:b/>
-                <w:sz w:val="17"/>
-              </w:rPr>
-              <w:t>5.22 ± 0.20 (+0.26)</w:t>
-            </w:r>
-          </w:p>
-        </w:tc>
-        <w:tc>
-          <w:tcPr>
-            <w:tcW w:type="dxa" w:w="1949"/>
-          </w:tcPr>
-          <w:p>
-            <w:r>
-              <w:rPr>
-                <w:sz w:val="17"/>
-              </w:rPr>
-              <w:t>15.59 ± 0.19 (+10.63)</w:t>
-            </w:r>
-          </w:p>
-        </w:tc>
-        <w:tc>
-          <w:tcPr>
-            <w:tcW w:type="dxa" w:w="1949"/>
-          </w:tcPr>
-          <w:p>
-            <w:r>
-              <w:rPr>
-                <w:b/>
-                <w:sz w:val="17"/>
-              </w:rPr>
-              <w:t>5.35 ± 0.20 (+0.39)</w:t>
-            </w:r>
-          </w:p>
-        </w:tc>
-      </w:tr>
-    </w:tbl>
-    <w:p/>
     <w:p>
       <w:pPr>
         <w:spacing w:after="120"/>
@@ -7736,299 +7133,46 @@
         </w:rPr>
         <w:t>(c) FAMS</w:t>
       </w:r>
+      <w:r>
+        <w:t xml:space="preserve"> | Model | R→R (real data) | Full Synthetic | Hybrid | |---|---|---|---| | iTracker | 5.85 ± 0.14 | +5.06 ± 0.17 | </w:t>
+      </w:r>
+      <w:r>
+        <w:rPr>
+          <w:b/>
+        </w:rPr>
+        <w:t>+0.02 ± 0.07</w:t>
+      </w:r>
+      <w:r>
+        <w:t xml:space="preserve"> | | MobileNet-V3 Large | 4.98 ± 0.13 | +4.06 ± 0.24 | </w:t>
+      </w:r>
+      <w:r>
+        <w:rPr>
+          <w:b/>
+        </w:rPr>
+        <w:t>+0.27 ± 0.20</w:t>
+      </w:r>
+      <w:r>
+        <w:t xml:space="preserve"> | | AFFNet | 5.67 ± 0.20 | +4.91 ± 0.20 | </w:t>
+      </w:r>
+      <w:r>
+        <w:rPr>
+          <w:b/>
+        </w:rPr>
+        <w:t>+0.19 ± 0.10</w:t>
+      </w:r>
+      <w:r>
+        <w:t xml:space="preserve"> | | MGazeNet | 4.96 ± 0.04 | +4.94 ± 0.17 | </w:t>
+      </w:r>
+      <w:r>
+        <w:rPr>
+          <w:b/>
+        </w:rPr>
+        <w:t>+0.35 ± 0.21</w:t>
+      </w:r>
+      <w:r>
+        <w:t xml:space="preserve"> |</w:t>
+      </w:r>
     </w:p>
-    <w:tbl>
-      <w:tblPr>
-        <w:tblStyle w:val="TableGrid"/>
-        <w:tblW w:type="auto" w:w="0"/>
-        <w:tblLook w:firstColumn="1" w:firstRow="1" w:lastColumn="0" w:lastRow="0" w:noHBand="0" w:noVBand="1" w:val="04A0"/>
-      </w:tblPr>
-      <w:tblGrid>
-        <w:gridCol w:w="2436"/>
-        <w:gridCol w:w="2436"/>
-        <w:gridCol w:w="2436"/>
-        <w:gridCol w:w="2436"/>
-      </w:tblGrid>
-      <w:tr>
-        <w:tc>
-          <w:tcPr>
-            <w:tcW w:type="dxa" w:w="2436"/>
-          </w:tcPr>
-          <w:p>
-            <w:r>
-              <w:rPr>
-                <w:b/>
-                <w:sz w:val="17"/>
-              </w:rPr>
-              <w:t>Model</w:t>
-            </w:r>
-          </w:p>
-        </w:tc>
-        <w:tc>
-          <w:tcPr>
-            <w:tcW w:type="dxa" w:w="2436"/>
-          </w:tcPr>
-          <w:p>
-            <w:r>
-              <w:rPr>
-                <w:b/>
-                <w:sz w:val="17"/>
-              </w:rPr>
-              <w:t>R→R (real data)</w:t>
-            </w:r>
-          </w:p>
-        </w:tc>
-        <w:tc>
-          <w:tcPr>
-            <w:tcW w:type="dxa" w:w="2436"/>
-          </w:tcPr>
-          <w:p>
-            <w:r>
-              <w:rPr>
-                <w:b/>
-                <w:sz w:val="17"/>
-              </w:rPr>
-              <w:t>Full Synthetic</w:t>
-            </w:r>
-          </w:p>
-        </w:tc>
-        <w:tc>
-          <w:tcPr>
-            <w:tcW w:type="dxa" w:w="2436"/>
-          </w:tcPr>
-          <w:p>
-            <w:r>
-              <w:rPr>
-                <w:b/>
-                <w:sz w:val="17"/>
-              </w:rPr>
-              <w:t>Hybrid</w:t>
-            </w:r>
-          </w:p>
-        </w:tc>
-      </w:tr>
-      <w:tr>
-        <w:tc>
-          <w:tcPr>
-            <w:tcW w:type="dxa" w:w="2436"/>
-          </w:tcPr>
-          <w:p>
-            <w:r>
-              <w:rPr>
-                <w:sz w:val="17"/>
-              </w:rPr>
-              <w:t>iTracker</w:t>
-            </w:r>
-          </w:p>
-        </w:tc>
-        <w:tc>
-          <w:tcPr>
-            <w:tcW w:type="dxa" w:w="2436"/>
-          </w:tcPr>
-          <w:p>
-            <w:r>
-              <w:rPr>
-                <w:sz w:val="17"/>
-              </w:rPr>
-              <w:t>5.85 ± 0.14</w:t>
-            </w:r>
-          </w:p>
-        </w:tc>
-        <w:tc>
-          <w:tcPr>
-            <w:tcW w:type="dxa" w:w="2436"/>
-          </w:tcPr>
-          <w:p>
-            <w:r>
-              <w:rPr>
-                <w:sz w:val="17"/>
-              </w:rPr>
-              <w:t>+5.06 ± 0.17</w:t>
-            </w:r>
-          </w:p>
-        </w:tc>
-        <w:tc>
-          <w:tcPr>
-            <w:tcW w:type="dxa" w:w="2436"/>
-          </w:tcPr>
-          <w:p>
-            <w:r>
-              <w:rPr>
-                <w:b/>
-                <w:sz w:val="17"/>
-              </w:rPr>
-              <w:t>+0.02 ± 0.07</w:t>
-            </w:r>
-          </w:p>
-        </w:tc>
-      </w:tr>
-      <w:tr>
-        <w:tc>
-          <w:tcPr>
-            <w:tcW w:type="dxa" w:w="2436"/>
-          </w:tcPr>
-          <w:p>
-            <w:r>
-              <w:rPr>
-                <w:sz w:val="17"/>
-              </w:rPr>
-              <w:t>MobileNet-V3 Large</w:t>
-            </w:r>
-          </w:p>
-        </w:tc>
-        <w:tc>
-          <w:tcPr>
-            <w:tcW w:type="dxa" w:w="2436"/>
-          </w:tcPr>
-          <w:p>
-            <w:r>
-              <w:rPr>
-                <w:sz w:val="17"/>
-              </w:rPr>
-              <w:t>4.98 ± 0.13</w:t>
-            </w:r>
-          </w:p>
-        </w:tc>
-        <w:tc>
-          <w:tcPr>
-            <w:tcW w:type="dxa" w:w="2436"/>
-          </w:tcPr>
-          <w:p>
-            <w:r>
-              <w:rPr>
-                <w:sz w:val="17"/>
-              </w:rPr>
-              <w:t>+4.06 ± 0.24</w:t>
-            </w:r>
-          </w:p>
-        </w:tc>
-        <w:tc>
-          <w:tcPr>
-            <w:tcW w:type="dxa" w:w="2436"/>
-          </w:tcPr>
-          <w:p>
-            <w:r>
-              <w:rPr>
-                <w:b/>
-                <w:sz w:val="17"/>
-              </w:rPr>
-              <w:t>+0.27 ± 0.20</w:t>
-            </w:r>
-          </w:p>
-        </w:tc>
-      </w:tr>
-      <w:tr>
-        <w:tc>
-          <w:tcPr>
-            <w:tcW w:type="dxa" w:w="2436"/>
-          </w:tcPr>
-          <w:p>
-            <w:r>
-              <w:rPr>
-                <w:sz w:val="17"/>
-              </w:rPr>
-              <w:t>AFFNet</w:t>
-            </w:r>
-          </w:p>
-        </w:tc>
-        <w:tc>
-          <w:tcPr>
-            <w:tcW w:type="dxa" w:w="2436"/>
-          </w:tcPr>
-          <w:p>
-            <w:r>
-              <w:rPr>
-                <w:sz w:val="17"/>
-              </w:rPr>
-              <w:t>5.67 ± 0.20</w:t>
-            </w:r>
-          </w:p>
-        </w:tc>
-        <w:tc>
-          <w:tcPr>
-            <w:tcW w:type="dxa" w:w="2436"/>
-          </w:tcPr>
-          <w:p>
-            <w:r>
-              <w:rPr>
-                <w:sz w:val="17"/>
-              </w:rPr>
-              <w:t>+4.91 ± 0.20</w:t>
-            </w:r>
-          </w:p>
-        </w:tc>
-        <w:tc>
-          <w:tcPr>
-            <w:tcW w:type="dxa" w:w="2436"/>
-          </w:tcPr>
-          <w:p>
-            <w:r>
-              <w:rPr>
-                <w:b/>
-                <w:sz w:val="17"/>
-              </w:rPr>
-              <w:t>+0.19 ± 0.10</w:t>
-            </w:r>
-          </w:p>
-        </w:tc>
-      </w:tr>
-      <w:tr>
-        <w:tc>
-          <w:tcPr>
-            <w:tcW w:type="dxa" w:w="2436"/>
-          </w:tcPr>
-          <w:p>
-            <w:r>
-              <w:rPr>
-                <w:sz w:val="17"/>
-              </w:rPr>
-              <w:t>MGazeNet</w:t>
-            </w:r>
-          </w:p>
-        </w:tc>
-        <w:tc>
-          <w:tcPr>
-            <w:tcW w:type="dxa" w:w="2436"/>
-          </w:tcPr>
-          <w:p>
-            <w:r>
-              <w:rPr>
-                <w:sz w:val="17"/>
-              </w:rPr>
-              <w:t>4.96 ± 0.04</w:t>
-            </w:r>
-          </w:p>
-        </w:tc>
-        <w:tc>
-          <w:tcPr>
-            <w:tcW w:type="dxa" w:w="2436"/>
-          </w:tcPr>
-          <w:p>
-            <w:r>
-              <w:rPr>
-                <w:sz w:val="17"/>
-              </w:rPr>
-              <w:t>+4.94 ± 0.17</w:t>
-            </w:r>
-          </w:p>
-        </w:tc>
-        <w:tc>
-          <w:tcPr>
-            <w:tcW w:type="dxa" w:w="2436"/>
-          </w:tcPr>
-          <w:p>
-            <w:r>
-              <w:rPr>
-                <w:b/>
-                <w:sz w:val="17"/>
-              </w:rPr>
-              <w:t>+0.35 ± 0.21</w:t>
-            </w:r>
-          </w:p>
-        </w:tc>
-      </w:tr>
-    </w:tbl>
-    <w:p/>
     <w:p>
       <w:pPr>
         <w:spacing w:after="120"/>
@@ -8040,7 +7184,7 @@
         <w:t>Table S2.</w:t>
       </w:r>
       <w:r>
-        <w:t xml:space="preserve"> iTracker: penalty against R→R (5.85 cm); D→R and D→D from one initialisation; predicting the mean corresponds to +3.52 cm.</w:t>
+        <w:t xml:space="preserve"> Penalty for iTracker against R→R (5.85 cm). D→R and D→D come from a single initialisation, and predicting the mean corresponds to +3.52 cm.</w:t>
       </w:r>
     </w:p>
     <w:tbl>
@@ -8633,7 +7777,7 @@
         <w:t>(b)</w:t>
       </w:r>
       <w:r>
-        <w:t xml:space="preserve"> Hybrid. Bars: mean of three architectures; dots: individual architectures; red band: no-information reference; grey band: initialisation noise floor.</w:t>
+        <w:t xml:space="preserve"> Hybrid. Bars show the mean over three architectures and dots the individual architectures. The red band marks the no-information reference and the grey band the initialisation noise floor.</w:t>
       </w:r>
     </w:p>
     <w:p>
@@ -8686,7 +7830,7 @@
         <w:t>Figure S2.</w:t>
       </w:r>
       <w:r>
-        <w:t xml:space="preserve"> The same synthetic eye crops under the two tests: TAR at FAR 1e-3 for left and right eye crops, unprocessed and SimSwap (t1 = Identity A, t2 = Identity B). Blue: A1, matched against photographs; orange: within-release verification (A2). Vertical line: eye floor (1.57%). SimSwap drives A1 to the floor (0.2–1.8%) while within-release verification stays at 43–62%.</w:t>
+        <w:t xml:space="preserve"> The same synthetic eye crops under the two tests. TAR at FAR 1e-3 for left and right eye crops, unprocessed and with SimSwap (t1 is Identity A and t2 is Identity B). Blue points show A1, matched against photographs, and orange points show verification within the release (A2). The vertical line marks the eye floor (1.57%). SimSwap brings A1 down to the floor (0.2–1.8%), while verification within the release stays at 43–62%.</w:t>
       </w:r>
     </w:p>
     <w:sectPr>

</xml_diff>

<commit_message>
Fix Table S1 rendering: sub-table labels split from tables in generator and converters
Co-Authored-By: Claude Opus 5.5 <noreply@anthropic.com>
Claude-Session: https://claude.ai/code/session_01J7Eoy7KDxWK2PLKxYcPUkj
</commit_message>
<xml_diff>
--- a/results/paper/MANUSCRIPT.docx
+++ b/results/paper/MANUSCRIPT.docx
@@ -6961,82 +6961,370 @@
         </w:rPr>
         <w:t>(a) DeepPrivacy2, face mode</w:t>
       </w:r>
-      <w:r>
-        <w:t xml:space="preserve"> | Model | Full Synthetic (fixed) | Hybrid (fixed) | Full Synthetic (per frame) | Hybrid (per frame) | |---|---|---|---|---| | iTracker | 16.44 ± 0.24 (+10.58) | </w:t>
-      </w:r>
-      <w:r>
-        <w:rPr>
-          <w:b/>
-        </w:rPr>
-        <w:t>5.75 ± 0.11 (−0.10)</w:t>
-      </w:r>
-      <w:r>
-        <w:t xml:space="preserve"> | 17.50 ± 0.25 (+11.65) | </w:t>
-      </w:r>
-      <w:r>
-        <w:rPr>
-          <w:b/>
-        </w:rPr>
-        <w:t>5.83 ± 0.06 (−0.02)</w:t>
-      </w:r>
-      <w:r>
-        <w:t xml:space="preserve"> | | MobileNet-V3 Large | 15.88 ± 0.37 (+10.90) | </w:t>
-      </w:r>
-      <w:r>
-        <w:rPr>
-          <w:b/>
-        </w:rPr>
-        <w:t>6.02 ± 0.54 (+1.03)</w:t>
-      </w:r>
-      <w:r>
-        <w:t xml:space="preserve"> | 16.24 ± 0.23 (+11.25) | </w:t>
-      </w:r>
-      <w:r>
-        <w:rPr>
-          <w:b/>
-        </w:rPr>
-        <w:t>5.95 ± 0.45 (+0.97)</w:t>
-      </w:r>
-      <w:r>
-        <w:t xml:space="preserve"> | | AFFNet | 19.33 ± 0.26 (+13.66) | </w:t>
-      </w:r>
-      <w:r>
-        <w:rPr>
-          <w:b/>
-        </w:rPr>
-        <w:t>5.74 ± 0.24 (+0.07)</w:t>
-      </w:r>
-      <w:r>
-        <w:t xml:space="preserve"> | 20.52 ± 0.22 (+14.85) | </w:t>
-      </w:r>
-      <w:r>
-        <w:rPr>
-          <w:b/>
-        </w:rPr>
-        <w:t>5.68 ± 0.22 (+0.01)</w:t>
-      </w:r>
-      <w:r>
-        <w:t xml:space="preserve"> | | MGazeNet | 17.06 ± 0.39 (+12.09) | </w:t>
-      </w:r>
-      <w:r>
-        <w:rPr>
-          <w:b/>
-        </w:rPr>
-        <w:t>5.43 ± 0.38 (+0.47)</w:t>
-      </w:r>
-      <w:r>
-        <w:t xml:space="preserve"> | 17.04 ± 0.53 (+12.08) | </w:t>
-      </w:r>
-      <w:r>
-        <w:rPr>
-          <w:b/>
-        </w:rPr>
-        <w:t>5.37 ± 0.32 (+0.40)</w:t>
-      </w:r>
-      <w:r>
-        <w:t xml:space="preserve"> |</w:t>
-      </w:r>
     </w:p>
+    <w:tbl>
+      <w:tblPr>
+        <w:tblStyle w:val="TableGrid"/>
+        <w:tblW w:type="auto" w:w="0"/>
+        <w:tblLook w:firstColumn="1" w:firstRow="1" w:lastColumn="0" w:lastRow="0" w:noHBand="0" w:noVBand="1" w:val="04A0"/>
+      </w:tblPr>
+      <w:tblGrid>
+        <w:gridCol w:w="1949"/>
+        <w:gridCol w:w="1949"/>
+        <w:gridCol w:w="1949"/>
+        <w:gridCol w:w="1949"/>
+        <w:gridCol w:w="1949"/>
+      </w:tblGrid>
+      <w:tr>
+        <w:tc>
+          <w:tcPr>
+            <w:tcW w:type="dxa" w:w="1949"/>
+          </w:tcPr>
+          <w:p>
+            <w:r>
+              <w:rPr>
+                <w:b/>
+                <w:sz w:val="17"/>
+              </w:rPr>
+              <w:t>Model</w:t>
+            </w:r>
+          </w:p>
+        </w:tc>
+        <w:tc>
+          <w:tcPr>
+            <w:tcW w:type="dxa" w:w="1949"/>
+          </w:tcPr>
+          <w:p>
+            <w:r>
+              <w:rPr>
+                <w:b/>
+                <w:sz w:val="17"/>
+              </w:rPr>
+              <w:t>Full Synthetic (fixed)</w:t>
+            </w:r>
+          </w:p>
+        </w:tc>
+        <w:tc>
+          <w:tcPr>
+            <w:tcW w:type="dxa" w:w="1949"/>
+          </w:tcPr>
+          <w:p>
+            <w:r>
+              <w:rPr>
+                <w:b/>
+                <w:sz w:val="17"/>
+              </w:rPr>
+              <w:t>Hybrid (fixed)</w:t>
+            </w:r>
+          </w:p>
+        </w:tc>
+        <w:tc>
+          <w:tcPr>
+            <w:tcW w:type="dxa" w:w="1949"/>
+          </w:tcPr>
+          <w:p>
+            <w:r>
+              <w:rPr>
+                <w:b/>
+                <w:sz w:val="17"/>
+              </w:rPr>
+              <w:t>Full Synthetic (per frame)</w:t>
+            </w:r>
+          </w:p>
+        </w:tc>
+        <w:tc>
+          <w:tcPr>
+            <w:tcW w:type="dxa" w:w="1949"/>
+          </w:tcPr>
+          <w:p>
+            <w:r>
+              <w:rPr>
+                <w:b/>
+                <w:sz w:val="17"/>
+              </w:rPr>
+              <w:t>Hybrid (per frame)</w:t>
+            </w:r>
+          </w:p>
+        </w:tc>
+      </w:tr>
+      <w:tr>
+        <w:tc>
+          <w:tcPr>
+            <w:tcW w:type="dxa" w:w="1949"/>
+          </w:tcPr>
+          <w:p>
+            <w:r>
+              <w:rPr>
+                <w:sz w:val="17"/>
+              </w:rPr>
+              <w:t>iTracker</w:t>
+            </w:r>
+          </w:p>
+        </w:tc>
+        <w:tc>
+          <w:tcPr>
+            <w:tcW w:type="dxa" w:w="1949"/>
+          </w:tcPr>
+          <w:p>
+            <w:r>
+              <w:rPr>
+                <w:sz w:val="17"/>
+              </w:rPr>
+              <w:t>16.44 ± 0.24 (+10.58)</w:t>
+            </w:r>
+          </w:p>
+        </w:tc>
+        <w:tc>
+          <w:tcPr>
+            <w:tcW w:type="dxa" w:w="1949"/>
+          </w:tcPr>
+          <w:p>
+            <w:r>
+              <w:rPr>
+                <w:b/>
+                <w:sz w:val="17"/>
+              </w:rPr>
+              <w:t>5.75 ± 0.11 (−0.10)</w:t>
+            </w:r>
+          </w:p>
+        </w:tc>
+        <w:tc>
+          <w:tcPr>
+            <w:tcW w:type="dxa" w:w="1949"/>
+          </w:tcPr>
+          <w:p>
+            <w:r>
+              <w:rPr>
+                <w:sz w:val="17"/>
+              </w:rPr>
+              <w:t>17.50 ± 0.25 (+11.65)</w:t>
+            </w:r>
+          </w:p>
+        </w:tc>
+        <w:tc>
+          <w:tcPr>
+            <w:tcW w:type="dxa" w:w="1949"/>
+          </w:tcPr>
+          <w:p>
+            <w:r>
+              <w:rPr>
+                <w:b/>
+                <w:sz w:val="17"/>
+              </w:rPr>
+              <w:t>5.83 ± 0.06 (−0.02)</w:t>
+            </w:r>
+          </w:p>
+        </w:tc>
+      </w:tr>
+      <w:tr>
+        <w:tc>
+          <w:tcPr>
+            <w:tcW w:type="dxa" w:w="1949"/>
+          </w:tcPr>
+          <w:p>
+            <w:r>
+              <w:rPr>
+                <w:sz w:val="17"/>
+              </w:rPr>
+              <w:t>MobileNet-V3 Large</w:t>
+            </w:r>
+          </w:p>
+        </w:tc>
+        <w:tc>
+          <w:tcPr>
+            <w:tcW w:type="dxa" w:w="1949"/>
+          </w:tcPr>
+          <w:p>
+            <w:r>
+              <w:rPr>
+                <w:sz w:val="17"/>
+              </w:rPr>
+              <w:t>15.88 ± 0.37 (+10.90)</w:t>
+            </w:r>
+          </w:p>
+        </w:tc>
+        <w:tc>
+          <w:tcPr>
+            <w:tcW w:type="dxa" w:w="1949"/>
+          </w:tcPr>
+          <w:p>
+            <w:r>
+              <w:rPr>
+                <w:b/>
+                <w:sz w:val="17"/>
+              </w:rPr>
+              <w:t>6.02 ± 0.54 (+1.03)</w:t>
+            </w:r>
+          </w:p>
+        </w:tc>
+        <w:tc>
+          <w:tcPr>
+            <w:tcW w:type="dxa" w:w="1949"/>
+          </w:tcPr>
+          <w:p>
+            <w:r>
+              <w:rPr>
+                <w:sz w:val="17"/>
+              </w:rPr>
+              <w:t>16.24 ± 0.23 (+11.25)</w:t>
+            </w:r>
+          </w:p>
+        </w:tc>
+        <w:tc>
+          <w:tcPr>
+            <w:tcW w:type="dxa" w:w="1949"/>
+          </w:tcPr>
+          <w:p>
+            <w:r>
+              <w:rPr>
+                <w:b/>
+                <w:sz w:val="17"/>
+              </w:rPr>
+              <w:t>5.95 ± 0.45 (+0.97)</w:t>
+            </w:r>
+          </w:p>
+        </w:tc>
+      </w:tr>
+      <w:tr>
+        <w:tc>
+          <w:tcPr>
+            <w:tcW w:type="dxa" w:w="1949"/>
+          </w:tcPr>
+          <w:p>
+            <w:r>
+              <w:rPr>
+                <w:sz w:val="17"/>
+              </w:rPr>
+              <w:t>AFFNet</w:t>
+            </w:r>
+          </w:p>
+        </w:tc>
+        <w:tc>
+          <w:tcPr>
+            <w:tcW w:type="dxa" w:w="1949"/>
+          </w:tcPr>
+          <w:p>
+            <w:r>
+              <w:rPr>
+                <w:sz w:val="17"/>
+              </w:rPr>
+              <w:t>19.33 ± 0.26 (+13.66)</w:t>
+            </w:r>
+          </w:p>
+        </w:tc>
+        <w:tc>
+          <w:tcPr>
+            <w:tcW w:type="dxa" w:w="1949"/>
+          </w:tcPr>
+          <w:p>
+            <w:r>
+              <w:rPr>
+                <w:b/>
+                <w:sz w:val="17"/>
+              </w:rPr>
+              <w:t>5.74 ± 0.24 (+0.07)</w:t>
+            </w:r>
+          </w:p>
+        </w:tc>
+        <w:tc>
+          <w:tcPr>
+            <w:tcW w:type="dxa" w:w="1949"/>
+          </w:tcPr>
+          <w:p>
+            <w:r>
+              <w:rPr>
+                <w:sz w:val="17"/>
+              </w:rPr>
+              <w:t>20.52 ± 0.22 (+14.85)</w:t>
+            </w:r>
+          </w:p>
+        </w:tc>
+        <w:tc>
+          <w:tcPr>
+            <w:tcW w:type="dxa" w:w="1949"/>
+          </w:tcPr>
+          <w:p>
+            <w:r>
+              <w:rPr>
+                <w:b/>
+                <w:sz w:val="17"/>
+              </w:rPr>
+              <w:t>5.68 ± 0.22 (+0.01)</w:t>
+            </w:r>
+          </w:p>
+        </w:tc>
+      </w:tr>
+      <w:tr>
+        <w:tc>
+          <w:tcPr>
+            <w:tcW w:type="dxa" w:w="1949"/>
+          </w:tcPr>
+          <w:p>
+            <w:r>
+              <w:rPr>
+                <w:sz w:val="17"/>
+              </w:rPr>
+              <w:t>MGazeNet</w:t>
+            </w:r>
+          </w:p>
+        </w:tc>
+        <w:tc>
+          <w:tcPr>
+            <w:tcW w:type="dxa" w:w="1949"/>
+          </w:tcPr>
+          <w:p>
+            <w:r>
+              <w:rPr>
+                <w:sz w:val="17"/>
+              </w:rPr>
+              <w:t>17.06 ± 0.39 (+12.09)</w:t>
+            </w:r>
+          </w:p>
+        </w:tc>
+        <w:tc>
+          <w:tcPr>
+            <w:tcW w:type="dxa" w:w="1949"/>
+          </w:tcPr>
+          <w:p>
+            <w:r>
+              <w:rPr>
+                <w:b/>
+                <w:sz w:val="17"/>
+              </w:rPr>
+              <w:t>5.43 ± 0.38 (+0.47)</w:t>
+            </w:r>
+          </w:p>
+        </w:tc>
+        <w:tc>
+          <w:tcPr>
+            <w:tcW w:type="dxa" w:w="1949"/>
+          </w:tcPr>
+          <w:p>
+            <w:r>
+              <w:rPr>
+                <w:sz w:val="17"/>
+              </w:rPr>
+              <w:t>17.04 ± 0.53 (+12.08)</w:t>
+            </w:r>
+          </w:p>
+        </w:tc>
+        <w:tc>
+          <w:tcPr>
+            <w:tcW w:type="dxa" w:w="1949"/>
+          </w:tcPr>
+          <w:p>
+            <w:r>
+              <w:rPr>
+                <w:b/>
+                <w:sz w:val="17"/>
+              </w:rPr>
+              <w:t>5.37 ± 0.32 (+0.40)</w:t>
+            </w:r>
+          </w:p>
+        </w:tc>
+      </w:tr>
+    </w:tbl>
+    <w:p/>
     <w:p>
       <w:pPr>
         <w:spacing w:after="120"/>
@@ -7047,82 +7335,370 @@
         </w:rPr>
         <w:t>(b) DeepPrivacy2, full-body mode</w:t>
       </w:r>
-      <w:r>
-        <w:t xml:space="preserve"> | Model | Full Synthetic (fixed) | Hybrid (fixed) | Full Synthetic (per frame) | Hybrid (per frame) | |---|---|---|---|---| | iTracker | 15.92 ± 0.29 (+10.06) | </w:t>
-      </w:r>
-      <w:r>
-        <w:rPr>
-          <w:b/>
-        </w:rPr>
-        <w:t>6.01 ± 0.11 (+0.16)</w:t>
-      </w:r>
-      <w:r>
-        <w:t xml:space="preserve"> | 17.12 ± 0.35 (+11.27) | </w:t>
-      </w:r>
-      <w:r>
-        <w:rPr>
-          <w:b/>
-        </w:rPr>
-        <w:t>5.96 ± 0.10 (+0.11)</w:t>
-      </w:r>
-      <w:r>
-        <w:t xml:space="preserve"> | | MobileNet-V3 Large | 14.63 ± 0.81 (+9.65) | </w:t>
-      </w:r>
-      <w:r>
-        <w:rPr>
-          <w:b/>
-        </w:rPr>
-        <w:t>5.60 ± 0.48 (+0.61)</w:t>
-      </w:r>
-      <w:r>
-        <w:t xml:space="preserve"> | 14.65 ± 0.76 (+9.67) | </w:t>
-      </w:r>
-      <w:r>
-        <w:rPr>
-          <w:b/>
-        </w:rPr>
-        <w:t>5.61 ± 0.45 (+0.63)</w:t>
-      </w:r>
-      <w:r>
-        <w:t xml:space="preserve"> | | AFFNet | 17.72 ± 0.42 (+12.05) | </w:t>
-      </w:r>
-      <w:r>
-        <w:rPr>
-          <w:b/>
-        </w:rPr>
-        <w:t>5.78 ± 0.23 (+0.11)</w:t>
-      </w:r>
-      <w:r>
-        <w:t xml:space="preserve"> | 17.82 ± 0.47 (+12.16) | </w:t>
-      </w:r>
-      <w:r>
-        <w:rPr>
-          <w:b/>
-        </w:rPr>
-        <w:t>5.80 ± 0.23 (+0.13)</w:t>
-      </w:r>
-      <w:r>
-        <w:t xml:space="preserve"> | | MGazeNet | 15.28 ± 0.29 (+10.31) | </w:t>
-      </w:r>
-      <w:r>
-        <w:rPr>
-          <w:b/>
-        </w:rPr>
-        <w:t>5.22 ± 0.20 (+0.26)</w:t>
-      </w:r>
-      <w:r>
-        <w:t xml:space="preserve"> | 15.59 ± 0.19 (+10.63) | </w:t>
-      </w:r>
-      <w:r>
-        <w:rPr>
-          <w:b/>
-        </w:rPr>
-        <w:t>5.35 ± 0.20 (+0.39)</w:t>
-      </w:r>
-      <w:r>
-        <w:t xml:space="preserve"> |</w:t>
-      </w:r>
     </w:p>
+    <w:tbl>
+      <w:tblPr>
+        <w:tblStyle w:val="TableGrid"/>
+        <w:tblW w:type="auto" w:w="0"/>
+        <w:tblLook w:firstColumn="1" w:firstRow="1" w:lastColumn="0" w:lastRow="0" w:noHBand="0" w:noVBand="1" w:val="04A0"/>
+      </w:tblPr>
+      <w:tblGrid>
+        <w:gridCol w:w="1949"/>
+        <w:gridCol w:w="1949"/>
+        <w:gridCol w:w="1949"/>
+        <w:gridCol w:w="1949"/>
+        <w:gridCol w:w="1949"/>
+      </w:tblGrid>
+      <w:tr>
+        <w:tc>
+          <w:tcPr>
+            <w:tcW w:type="dxa" w:w="1949"/>
+          </w:tcPr>
+          <w:p>
+            <w:r>
+              <w:rPr>
+                <w:b/>
+                <w:sz w:val="17"/>
+              </w:rPr>
+              <w:t>Model</w:t>
+            </w:r>
+          </w:p>
+        </w:tc>
+        <w:tc>
+          <w:tcPr>
+            <w:tcW w:type="dxa" w:w="1949"/>
+          </w:tcPr>
+          <w:p>
+            <w:r>
+              <w:rPr>
+                <w:b/>
+                <w:sz w:val="17"/>
+              </w:rPr>
+              <w:t>Full Synthetic (fixed)</w:t>
+            </w:r>
+          </w:p>
+        </w:tc>
+        <w:tc>
+          <w:tcPr>
+            <w:tcW w:type="dxa" w:w="1949"/>
+          </w:tcPr>
+          <w:p>
+            <w:r>
+              <w:rPr>
+                <w:b/>
+                <w:sz w:val="17"/>
+              </w:rPr>
+              <w:t>Hybrid (fixed)</w:t>
+            </w:r>
+          </w:p>
+        </w:tc>
+        <w:tc>
+          <w:tcPr>
+            <w:tcW w:type="dxa" w:w="1949"/>
+          </w:tcPr>
+          <w:p>
+            <w:r>
+              <w:rPr>
+                <w:b/>
+                <w:sz w:val="17"/>
+              </w:rPr>
+              <w:t>Full Synthetic (per frame)</w:t>
+            </w:r>
+          </w:p>
+        </w:tc>
+        <w:tc>
+          <w:tcPr>
+            <w:tcW w:type="dxa" w:w="1949"/>
+          </w:tcPr>
+          <w:p>
+            <w:r>
+              <w:rPr>
+                <w:b/>
+                <w:sz w:val="17"/>
+              </w:rPr>
+              <w:t>Hybrid (per frame)</w:t>
+            </w:r>
+          </w:p>
+        </w:tc>
+      </w:tr>
+      <w:tr>
+        <w:tc>
+          <w:tcPr>
+            <w:tcW w:type="dxa" w:w="1949"/>
+          </w:tcPr>
+          <w:p>
+            <w:r>
+              <w:rPr>
+                <w:sz w:val="17"/>
+              </w:rPr>
+              <w:t>iTracker</w:t>
+            </w:r>
+          </w:p>
+        </w:tc>
+        <w:tc>
+          <w:tcPr>
+            <w:tcW w:type="dxa" w:w="1949"/>
+          </w:tcPr>
+          <w:p>
+            <w:r>
+              <w:rPr>
+                <w:sz w:val="17"/>
+              </w:rPr>
+              <w:t>15.92 ± 0.29 (+10.06)</w:t>
+            </w:r>
+          </w:p>
+        </w:tc>
+        <w:tc>
+          <w:tcPr>
+            <w:tcW w:type="dxa" w:w="1949"/>
+          </w:tcPr>
+          <w:p>
+            <w:r>
+              <w:rPr>
+                <w:b/>
+                <w:sz w:val="17"/>
+              </w:rPr>
+              <w:t>6.01 ± 0.11 (+0.16)</w:t>
+            </w:r>
+          </w:p>
+        </w:tc>
+        <w:tc>
+          <w:tcPr>
+            <w:tcW w:type="dxa" w:w="1949"/>
+          </w:tcPr>
+          <w:p>
+            <w:r>
+              <w:rPr>
+                <w:sz w:val="17"/>
+              </w:rPr>
+              <w:t>17.12 ± 0.35 (+11.27)</w:t>
+            </w:r>
+          </w:p>
+        </w:tc>
+        <w:tc>
+          <w:tcPr>
+            <w:tcW w:type="dxa" w:w="1949"/>
+          </w:tcPr>
+          <w:p>
+            <w:r>
+              <w:rPr>
+                <w:b/>
+                <w:sz w:val="17"/>
+              </w:rPr>
+              <w:t>5.96 ± 0.10 (+0.11)</w:t>
+            </w:r>
+          </w:p>
+        </w:tc>
+      </w:tr>
+      <w:tr>
+        <w:tc>
+          <w:tcPr>
+            <w:tcW w:type="dxa" w:w="1949"/>
+          </w:tcPr>
+          <w:p>
+            <w:r>
+              <w:rPr>
+                <w:sz w:val="17"/>
+              </w:rPr>
+              <w:t>MobileNet-V3 Large</w:t>
+            </w:r>
+          </w:p>
+        </w:tc>
+        <w:tc>
+          <w:tcPr>
+            <w:tcW w:type="dxa" w:w="1949"/>
+          </w:tcPr>
+          <w:p>
+            <w:r>
+              <w:rPr>
+                <w:sz w:val="17"/>
+              </w:rPr>
+              <w:t>14.63 ± 0.81 (+9.65)</w:t>
+            </w:r>
+          </w:p>
+        </w:tc>
+        <w:tc>
+          <w:tcPr>
+            <w:tcW w:type="dxa" w:w="1949"/>
+          </w:tcPr>
+          <w:p>
+            <w:r>
+              <w:rPr>
+                <w:b/>
+                <w:sz w:val="17"/>
+              </w:rPr>
+              <w:t>5.60 ± 0.48 (+0.61)</w:t>
+            </w:r>
+          </w:p>
+        </w:tc>
+        <w:tc>
+          <w:tcPr>
+            <w:tcW w:type="dxa" w:w="1949"/>
+          </w:tcPr>
+          <w:p>
+            <w:r>
+              <w:rPr>
+                <w:sz w:val="17"/>
+              </w:rPr>
+              <w:t>14.65 ± 0.76 (+9.67)</w:t>
+            </w:r>
+          </w:p>
+        </w:tc>
+        <w:tc>
+          <w:tcPr>
+            <w:tcW w:type="dxa" w:w="1949"/>
+          </w:tcPr>
+          <w:p>
+            <w:r>
+              <w:rPr>
+                <w:b/>
+                <w:sz w:val="17"/>
+              </w:rPr>
+              <w:t>5.61 ± 0.45 (+0.63)</w:t>
+            </w:r>
+          </w:p>
+        </w:tc>
+      </w:tr>
+      <w:tr>
+        <w:tc>
+          <w:tcPr>
+            <w:tcW w:type="dxa" w:w="1949"/>
+          </w:tcPr>
+          <w:p>
+            <w:r>
+              <w:rPr>
+                <w:sz w:val="17"/>
+              </w:rPr>
+              <w:t>AFFNet</w:t>
+            </w:r>
+          </w:p>
+        </w:tc>
+        <w:tc>
+          <w:tcPr>
+            <w:tcW w:type="dxa" w:w="1949"/>
+          </w:tcPr>
+          <w:p>
+            <w:r>
+              <w:rPr>
+                <w:sz w:val="17"/>
+              </w:rPr>
+              <w:t>17.72 ± 0.42 (+12.05)</w:t>
+            </w:r>
+          </w:p>
+        </w:tc>
+        <w:tc>
+          <w:tcPr>
+            <w:tcW w:type="dxa" w:w="1949"/>
+          </w:tcPr>
+          <w:p>
+            <w:r>
+              <w:rPr>
+                <w:b/>
+                <w:sz w:val="17"/>
+              </w:rPr>
+              <w:t>5.78 ± 0.23 (+0.11)</w:t>
+            </w:r>
+          </w:p>
+        </w:tc>
+        <w:tc>
+          <w:tcPr>
+            <w:tcW w:type="dxa" w:w="1949"/>
+          </w:tcPr>
+          <w:p>
+            <w:r>
+              <w:rPr>
+                <w:sz w:val="17"/>
+              </w:rPr>
+              <w:t>17.82 ± 0.47 (+12.16)</w:t>
+            </w:r>
+          </w:p>
+        </w:tc>
+        <w:tc>
+          <w:tcPr>
+            <w:tcW w:type="dxa" w:w="1949"/>
+          </w:tcPr>
+          <w:p>
+            <w:r>
+              <w:rPr>
+                <w:b/>
+                <w:sz w:val="17"/>
+              </w:rPr>
+              <w:t>5.80 ± 0.23 (+0.13)</w:t>
+            </w:r>
+          </w:p>
+        </w:tc>
+      </w:tr>
+      <w:tr>
+        <w:tc>
+          <w:tcPr>
+            <w:tcW w:type="dxa" w:w="1949"/>
+          </w:tcPr>
+          <w:p>
+            <w:r>
+              <w:rPr>
+                <w:sz w:val="17"/>
+              </w:rPr>
+              <w:t>MGazeNet</w:t>
+            </w:r>
+          </w:p>
+        </w:tc>
+        <w:tc>
+          <w:tcPr>
+            <w:tcW w:type="dxa" w:w="1949"/>
+          </w:tcPr>
+          <w:p>
+            <w:r>
+              <w:rPr>
+                <w:sz w:val="17"/>
+              </w:rPr>
+              <w:t>15.28 ± 0.29 (+10.31)</w:t>
+            </w:r>
+          </w:p>
+        </w:tc>
+        <w:tc>
+          <w:tcPr>
+            <w:tcW w:type="dxa" w:w="1949"/>
+          </w:tcPr>
+          <w:p>
+            <w:r>
+              <w:rPr>
+                <w:b/>
+                <w:sz w:val="17"/>
+              </w:rPr>
+              <w:t>5.22 ± 0.20 (+0.26)</w:t>
+            </w:r>
+          </w:p>
+        </w:tc>
+        <w:tc>
+          <w:tcPr>
+            <w:tcW w:type="dxa" w:w="1949"/>
+          </w:tcPr>
+          <w:p>
+            <w:r>
+              <w:rPr>
+                <w:sz w:val="17"/>
+              </w:rPr>
+              <w:t>15.59 ± 0.19 (+10.63)</w:t>
+            </w:r>
+          </w:p>
+        </w:tc>
+        <w:tc>
+          <w:tcPr>
+            <w:tcW w:type="dxa" w:w="1949"/>
+          </w:tcPr>
+          <w:p>
+            <w:r>
+              <w:rPr>
+                <w:b/>
+                <w:sz w:val="17"/>
+              </w:rPr>
+              <w:t>5.35 ± 0.20 (+0.39)</w:t>
+            </w:r>
+          </w:p>
+        </w:tc>
+      </w:tr>
+    </w:tbl>
+    <w:p/>
     <w:p>
       <w:pPr>
         <w:spacing w:after="120"/>
@@ -7133,46 +7709,299 @@
         </w:rPr>
         <w:t>(c) FAMS</w:t>
       </w:r>
-      <w:r>
-        <w:t xml:space="preserve"> | Model | R→R (real data) | Full Synthetic | Hybrid | |---|---|---|---| | iTracker | 5.85 ± 0.14 | +5.06 ± 0.17 | </w:t>
-      </w:r>
-      <w:r>
-        <w:rPr>
-          <w:b/>
-        </w:rPr>
-        <w:t>+0.02 ± 0.07</w:t>
-      </w:r>
-      <w:r>
-        <w:t xml:space="preserve"> | | MobileNet-V3 Large | 4.98 ± 0.13 | +4.06 ± 0.24 | </w:t>
-      </w:r>
-      <w:r>
-        <w:rPr>
-          <w:b/>
-        </w:rPr>
-        <w:t>+0.27 ± 0.20</w:t>
-      </w:r>
-      <w:r>
-        <w:t xml:space="preserve"> | | AFFNet | 5.67 ± 0.20 | +4.91 ± 0.20 | </w:t>
-      </w:r>
-      <w:r>
-        <w:rPr>
-          <w:b/>
-        </w:rPr>
-        <w:t>+0.19 ± 0.10</w:t>
-      </w:r>
-      <w:r>
-        <w:t xml:space="preserve"> | | MGazeNet | 4.96 ± 0.04 | +4.94 ± 0.17 | </w:t>
-      </w:r>
-      <w:r>
-        <w:rPr>
-          <w:b/>
-        </w:rPr>
-        <w:t>+0.35 ± 0.21</w:t>
-      </w:r>
-      <w:r>
-        <w:t xml:space="preserve"> |</w:t>
-      </w:r>
     </w:p>
+    <w:tbl>
+      <w:tblPr>
+        <w:tblStyle w:val="TableGrid"/>
+        <w:tblW w:type="auto" w:w="0"/>
+        <w:tblLook w:firstColumn="1" w:firstRow="1" w:lastColumn="0" w:lastRow="0" w:noHBand="0" w:noVBand="1" w:val="04A0"/>
+      </w:tblPr>
+      <w:tblGrid>
+        <w:gridCol w:w="2436"/>
+        <w:gridCol w:w="2436"/>
+        <w:gridCol w:w="2436"/>
+        <w:gridCol w:w="2436"/>
+      </w:tblGrid>
+      <w:tr>
+        <w:tc>
+          <w:tcPr>
+            <w:tcW w:type="dxa" w:w="2436"/>
+          </w:tcPr>
+          <w:p>
+            <w:r>
+              <w:rPr>
+                <w:b/>
+                <w:sz w:val="17"/>
+              </w:rPr>
+              <w:t>Model</w:t>
+            </w:r>
+          </w:p>
+        </w:tc>
+        <w:tc>
+          <w:tcPr>
+            <w:tcW w:type="dxa" w:w="2436"/>
+          </w:tcPr>
+          <w:p>
+            <w:r>
+              <w:rPr>
+                <w:b/>
+                <w:sz w:val="17"/>
+              </w:rPr>
+              <w:t>R→R (real data)</w:t>
+            </w:r>
+          </w:p>
+        </w:tc>
+        <w:tc>
+          <w:tcPr>
+            <w:tcW w:type="dxa" w:w="2436"/>
+          </w:tcPr>
+          <w:p>
+            <w:r>
+              <w:rPr>
+                <w:b/>
+                <w:sz w:val="17"/>
+              </w:rPr>
+              <w:t>Full Synthetic</w:t>
+            </w:r>
+          </w:p>
+        </w:tc>
+        <w:tc>
+          <w:tcPr>
+            <w:tcW w:type="dxa" w:w="2436"/>
+          </w:tcPr>
+          <w:p>
+            <w:r>
+              <w:rPr>
+                <w:b/>
+                <w:sz w:val="17"/>
+              </w:rPr>
+              <w:t>Hybrid</w:t>
+            </w:r>
+          </w:p>
+        </w:tc>
+      </w:tr>
+      <w:tr>
+        <w:tc>
+          <w:tcPr>
+            <w:tcW w:type="dxa" w:w="2436"/>
+          </w:tcPr>
+          <w:p>
+            <w:r>
+              <w:rPr>
+                <w:sz w:val="17"/>
+              </w:rPr>
+              <w:t>iTracker</w:t>
+            </w:r>
+          </w:p>
+        </w:tc>
+        <w:tc>
+          <w:tcPr>
+            <w:tcW w:type="dxa" w:w="2436"/>
+          </w:tcPr>
+          <w:p>
+            <w:r>
+              <w:rPr>
+                <w:sz w:val="17"/>
+              </w:rPr>
+              <w:t>5.85 ± 0.14</w:t>
+            </w:r>
+          </w:p>
+        </w:tc>
+        <w:tc>
+          <w:tcPr>
+            <w:tcW w:type="dxa" w:w="2436"/>
+          </w:tcPr>
+          <w:p>
+            <w:r>
+              <w:rPr>
+                <w:sz w:val="17"/>
+              </w:rPr>
+              <w:t>+5.06 ± 0.17</w:t>
+            </w:r>
+          </w:p>
+        </w:tc>
+        <w:tc>
+          <w:tcPr>
+            <w:tcW w:type="dxa" w:w="2436"/>
+          </w:tcPr>
+          <w:p>
+            <w:r>
+              <w:rPr>
+                <w:b/>
+                <w:sz w:val="17"/>
+              </w:rPr>
+              <w:t>+0.02 ± 0.07</w:t>
+            </w:r>
+          </w:p>
+        </w:tc>
+      </w:tr>
+      <w:tr>
+        <w:tc>
+          <w:tcPr>
+            <w:tcW w:type="dxa" w:w="2436"/>
+          </w:tcPr>
+          <w:p>
+            <w:r>
+              <w:rPr>
+                <w:sz w:val="17"/>
+              </w:rPr>
+              <w:t>MobileNet-V3 Large</w:t>
+            </w:r>
+          </w:p>
+        </w:tc>
+        <w:tc>
+          <w:tcPr>
+            <w:tcW w:type="dxa" w:w="2436"/>
+          </w:tcPr>
+          <w:p>
+            <w:r>
+              <w:rPr>
+                <w:sz w:val="17"/>
+              </w:rPr>
+              <w:t>4.98 ± 0.13</w:t>
+            </w:r>
+          </w:p>
+        </w:tc>
+        <w:tc>
+          <w:tcPr>
+            <w:tcW w:type="dxa" w:w="2436"/>
+          </w:tcPr>
+          <w:p>
+            <w:r>
+              <w:rPr>
+                <w:sz w:val="17"/>
+              </w:rPr>
+              <w:t>+4.06 ± 0.24</w:t>
+            </w:r>
+          </w:p>
+        </w:tc>
+        <w:tc>
+          <w:tcPr>
+            <w:tcW w:type="dxa" w:w="2436"/>
+          </w:tcPr>
+          <w:p>
+            <w:r>
+              <w:rPr>
+                <w:b/>
+                <w:sz w:val="17"/>
+              </w:rPr>
+              <w:t>+0.27 ± 0.20</w:t>
+            </w:r>
+          </w:p>
+        </w:tc>
+      </w:tr>
+      <w:tr>
+        <w:tc>
+          <w:tcPr>
+            <w:tcW w:type="dxa" w:w="2436"/>
+          </w:tcPr>
+          <w:p>
+            <w:r>
+              <w:rPr>
+                <w:sz w:val="17"/>
+              </w:rPr>
+              <w:t>AFFNet</w:t>
+            </w:r>
+          </w:p>
+        </w:tc>
+        <w:tc>
+          <w:tcPr>
+            <w:tcW w:type="dxa" w:w="2436"/>
+          </w:tcPr>
+          <w:p>
+            <w:r>
+              <w:rPr>
+                <w:sz w:val="17"/>
+              </w:rPr>
+              <w:t>5.67 ± 0.20</w:t>
+            </w:r>
+          </w:p>
+        </w:tc>
+        <w:tc>
+          <w:tcPr>
+            <w:tcW w:type="dxa" w:w="2436"/>
+          </w:tcPr>
+          <w:p>
+            <w:r>
+              <w:rPr>
+                <w:sz w:val="17"/>
+              </w:rPr>
+              <w:t>+4.91 ± 0.20</w:t>
+            </w:r>
+          </w:p>
+        </w:tc>
+        <w:tc>
+          <w:tcPr>
+            <w:tcW w:type="dxa" w:w="2436"/>
+          </w:tcPr>
+          <w:p>
+            <w:r>
+              <w:rPr>
+                <w:b/>
+                <w:sz w:val="17"/>
+              </w:rPr>
+              <w:t>+0.19 ± 0.10</w:t>
+            </w:r>
+          </w:p>
+        </w:tc>
+      </w:tr>
+      <w:tr>
+        <w:tc>
+          <w:tcPr>
+            <w:tcW w:type="dxa" w:w="2436"/>
+          </w:tcPr>
+          <w:p>
+            <w:r>
+              <w:rPr>
+                <w:sz w:val="17"/>
+              </w:rPr>
+              <w:t>MGazeNet</w:t>
+            </w:r>
+          </w:p>
+        </w:tc>
+        <w:tc>
+          <w:tcPr>
+            <w:tcW w:type="dxa" w:w="2436"/>
+          </w:tcPr>
+          <w:p>
+            <w:r>
+              <w:rPr>
+                <w:sz w:val="17"/>
+              </w:rPr>
+              <w:t>4.96 ± 0.04</w:t>
+            </w:r>
+          </w:p>
+        </w:tc>
+        <w:tc>
+          <w:tcPr>
+            <w:tcW w:type="dxa" w:w="2436"/>
+          </w:tcPr>
+          <w:p>
+            <w:r>
+              <w:rPr>
+                <w:sz w:val="17"/>
+              </w:rPr>
+              <w:t>+4.94 ± 0.17</w:t>
+            </w:r>
+          </w:p>
+        </w:tc>
+        <w:tc>
+          <w:tcPr>
+            <w:tcW w:type="dxa" w:w="2436"/>
+          </w:tcPr>
+          <w:p>
+            <w:r>
+              <w:rPr>
+                <w:b/>
+                <w:sz w:val="17"/>
+              </w:rPr>
+              <w:t>+0.35 ± 0.21</w:t>
+            </w:r>
+          </w:p>
+        </w:tc>
+      </w:tr>
+    </w:tbl>
+    <w:p/>
     <w:p>
       <w:pPr>
         <w:spacing w:after="120"/>

</xml_diff>

<commit_message>
Abstract cut to 197 words
Co-Authored-By: Claude Opus 5.5 <noreply@anthropic.com>
Claude-Session: https://claude.ai/code/session_01J7Eoy7KDxWK2PLKxYcPUkj
</commit_message>
<xml_diff>
--- a/results/paper/MANUSCRIPT.docx
+++ b/results/paper/MANUSCRIPT.docx
@@ -23,7 +23,7 @@
         <w:spacing w:after="120"/>
       </w:pPr>
       <w:r>
-        <w:t>Smartphone eye tracking can bring oculomotor assessment out of the clinic, but it records video of the participant's face, and this is what prevents the field from sharing data. Face de-identification has been proposed as a remedy and is usually judged by whether the processed face still matches the real one. We ask instead what such a release protects and how useful it remains for training gaze models.</w:t>
+        <w:t>Smartphone eye tracking can bring oculomotor assessment out of the clinic, but it records the participant's face, which prevents data sharing. Face de-identification is the usual remedy and is judged by whether the processed face still matches the real one. We ask what such a release protects and how useful it remains.</w:t>
       </w:r>
     </w:p>
     <w:p>
@@ -31,7 +31,7 @@
         <w:spacing w:after="120"/>
       </w:pPr>
       <w:r>
-        <w:t>We introduce CognitiveGaze, in which 18 participants performed seven oculomotor tasks while a smartphone and an EyeLink 1000 recorded them simultaneously, so every frame carries physiological ground-truth gaze. We evaluate face swapping, inpainting and diffusion-based de-identification with four gaze architectures, each deployed on and retrained on every release, and with two face recognisers.</w:t>
+        <w:t>We introduce CognitiveGaze, in which 18 participants performed seven oculomotor tasks recorded simultaneously by a smartphone and an EyeLink 1000. We evaluate face swapping, inpainting and diffusion-based de-identification with four gaze architectures and two face recognisers.</w:t>
       </w:r>
     </w:p>
     <w:p>
@@ -39,7 +39,7 @@
         <w:spacing w:after="120"/>
       </w:pPr>
       <w:r>
-        <w:t>Keeping the genuine eye region recovers 82–111% of the accuracy lost to synthesis, yet these eye crops verify identity at 62–80% against a 1.6% floor. The pixels that make gaze estimation work are also the pixels that identify the participant. Synthesising the eyes prevents matching on the eye crops, but synthetic face crops still verify at 18–24%, and every release that retains gaze information still singles out each participant, which under European anonymisation guidance leaves it personal data. Inpainted eyes carry no recoverable gaze. A diffusion anonymiser produces the models that transfer best to real faces (0.4–1.3 cm against 2.5–6.2 cm), although its pupils follow true gaze less closely than face-swapped ones, and stronger settings trade pupil signal for identity protection without reducing linkability. None of the configurations we tested is both private and useful. We describe what a releasable gaze corpus would require and release an audit tool and checklist.</w:t>
+        <w:t>Keeping the genuine eye region recovers 82–111% of the accuracy lost to synthesis, but these eye crops verify identity at 62–80% against a 1.6% floor. Synthesising the eyes prevents matching on eye crops, yet synthetic face crops still verify at 18–24%, and every release that retains gaze information singles out each participant, which under European guidance leaves it personal data. Inpainted eyes carry no recoverable gaze. Diffusion produces the models that transfer best to real faces, although its pupils follow true gaze less closely than face-swapped ones. No tested configuration is both private and useful. We describe what a releasable corpus requires and release an audit tool and checklist.</w:t>
       </w:r>
     </w:p>
     <w:p>

</xml_diff>